<commit_message>
improved web preview and generator for water iso
</commit_message>
<xml_diff>
--- a/backend/assets/templates/waterIso10500Template.docx
+++ b/backend/assets/templates/waterIso10500Template.docx
@@ -1,6 +1,6 @@
 
 <file path=word/document.xml><?xml version="1.0" encoding="utf-8"?>
-<w:document xmlns:ve="http://schemas.openxmlformats.org/markup-compatibility/2006" xmlns:o="urn:schemas-microsoft-com:office:office" xmlns:r="http://schemas.openxmlformats.org/officeDocument/2006/relationships" xmlns:m="http://schemas.openxmlformats.org/officeDocument/2006/math" xmlns:v="urn:schemas-microsoft-com:vml" xmlns:wp="http://schemas.openxmlformats.org/drawingml/2006/wordprocessingDrawing" xmlns:w10="urn:schemas-microsoft-com:office:word" xmlns:w="http://schemas.openxmlformats.org/wordprocessingml/2006/main" xmlns:wne="http://schemas.microsoft.com/office/word/2006/wordml">
+<w:document xmlns:ns1="http://schemas.openxmlformats.org/officeDocument/2006/relationships" xmlns:w="http://schemas.openxmlformats.org/wordprocessingml/2006/main">
   <w:body>
     <w:tbl>
       <w:tblPr>
@@ -29,214 +29,71 @@
             <w:hideMark/>
           </w:tcPr>
           <w:p>
-            <w:pPr>
-              <w:tabs>
-                <w:tab w:val="left" w:pos="673"/>
-              </w:tabs>
-              <w:ind w:right="-108"/>
-              <w:rPr>
-                <w:rFonts w:ascii="Times New Roman" w:hAnsi="Times New Roman" w:cs="Times New Roman"/>
-                <w:sz w:val="20"/>
-                <w:szCs w:val="20"/>
-              </w:rPr>
-            </w:pPr>
-            <w:r>
-              <w:rPr>
-                <w:rFonts w:ascii="Times New Roman" w:hAnsi="Times New Roman" w:cs="Times New Roman"/>
+            <w:r>
+              <w:rPr>
                 <w:b/>
-                <w:sz w:val="20"/>
-                <w:szCs w:val="20"/>
+                <w:rFonts w:ascii="Times New Roman" w:hAnsi="Times New Roman"/>
+                <w:sz w:val="20"/>
               </w:rPr>
               <w:t xml:space="preserve">Customer Name :  </w:t>
             </w:r>
             <w:r>
               <w:rPr>
-                <w:rFonts w:ascii="Times New Roman" w:hAnsi="Times New Roman" w:cs="Times New Roman"/>
-                <w:color w:val="000000"/>
-                <w:sz w:val="20"/>
-                <w:szCs w:val="20"/>
-                <w:shd w:val="clear" w:color="auto" w:fill="FFFFFF"/>
-              </w:rPr>
-              <w:t xml:space="preserve">D’ Jain Food Products </w:t>
-            </w:r>
-            <w:r>
-              <w:rPr>
-                <w:rFonts w:ascii="Times New Roman" w:hAnsi="Times New Roman" w:cs="Times New Roman"/>
-                <w:color w:val="000000"/>
-                <w:sz w:val="20"/>
-                <w:szCs w:val="20"/>
-                <w:shd w:val="clear" w:color="auto" w:fill="FFFFFF"/>
-              </w:rPr>
-              <w:t xml:space="preserve"> </w:t>
-            </w:r>
-          </w:p>
-          <w:p>
-            <w:pPr>
-              <w:tabs>
-                <w:tab w:val="left" w:pos="673"/>
-                <w:tab w:val="left" w:pos="1620"/>
-                <w:tab w:val="left" w:pos="1905"/>
-              </w:tabs>
-              <w:ind w:right="-108"/>
-              <w:rPr>
-                <w:rFonts w:ascii="Times New Roman" w:hAnsi="Times New Roman" w:cs="Times New Roman"/>
-                <w:sz w:val="20"/>
-                <w:szCs w:val="20"/>
-              </w:rPr>
-            </w:pPr>
-            <w:r>
-              <w:rPr>
-                <w:rFonts w:ascii="Times New Roman" w:hAnsi="Times New Roman" w:cs="Times New Roman"/>
+                <w:rFonts w:ascii="Times New Roman" w:hAnsi="Times New Roman"/>
+                <w:sz w:val="20"/>
+              </w:rPr>
+              <w:t xml:space="preserve">{{CUSTOMER_NAME}}</w:t>
+            </w:r>
+          </w:p>
+          <w:p>
+            <w:r>
+              <w:rPr>
                 <w:b/>
-                <w:sz w:val="20"/>
-                <w:szCs w:val="20"/>
-              </w:rPr>
-              <w:t>Address</w:t>
-            </w:r>
-            <w:r>
-              <w:rPr>
-                <w:rFonts w:ascii="Times New Roman" w:hAnsi="Times New Roman" w:cs="Times New Roman"/>
-                <w:sz w:val="20"/>
-                <w:szCs w:val="20"/>
-              </w:rPr>
-              <w:t xml:space="preserve"> :                </w:t>
-            </w:r>
-            <w:r>
-              <w:rPr>
-                <w:rFonts w:ascii="Times New Roman" w:hAnsi="Times New Roman" w:cs="Times New Roman"/>
-                <w:sz w:val="20"/>
-                <w:szCs w:val="20"/>
-              </w:rPr>
-              <w:t>36/2 I</w:t>
-            </w:r>
-            <w:r>
-              <w:rPr>
-                <w:rFonts w:ascii="Times New Roman" w:hAnsi="Times New Roman" w:cs="Times New Roman"/>
-                <w:sz w:val="20"/>
-                <w:szCs w:val="20"/>
-              </w:rPr>
-              <w:t>ndore bhopal highway near jio petrol pump Sonkatch dist. Dewas (MP)</w:t>
-            </w:r>
-            <w:r>
-              <w:rPr>
-                <w:rFonts w:ascii="Times New Roman" w:hAnsi="Times New Roman" w:cs="Times New Roman"/>
-                <w:sz w:val="20"/>
-                <w:szCs w:val="20"/>
-              </w:rPr>
-              <w:t xml:space="preserve"> </w:t>
-            </w:r>
-            <w:r>
-              <w:rPr>
-                <w:rFonts w:ascii="Times New Roman" w:hAnsi="Times New Roman" w:cs="Times New Roman"/>
-                <w:sz w:val="20"/>
-                <w:szCs w:val="20"/>
-              </w:rPr>
-              <w:t>455118</w:t>
-            </w:r>
-          </w:p>
-          <w:p>
-            <w:pPr>
-              <w:tabs>
-                <w:tab w:val="left" w:pos="673"/>
-                <w:tab w:val="left" w:pos="1620"/>
-                <w:tab w:val="left" w:pos="1905"/>
-              </w:tabs>
-              <w:ind w:right="-108"/>
-              <w:rPr>
-                <w:rFonts w:ascii="Times New Roman" w:hAnsi="Times New Roman" w:cs="Times New Roman"/>
-                <w:sz w:val="20"/>
-                <w:szCs w:val="20"/>
-              </w:rPr>
-            </w:pPr>
-            <w:r>
-              <w:rPr>
-                <w:rFonts w:ascii="Times New Roman" w:hAnsi="Times New Roman" w:cs="Times New Roman"/>
+                <w:rFonts w:ascii="Times New Roman" w:hAnsi="Times New Roman"/>
+                <w:sz w:val="20"/>
+              </w:rPr>
+              <w:t xml:space="preserve">Address :                </w:t>
+            </w:r>
+            <w:r>
+              <w:rPr>
+                <w:rFonts w:ascii="Times New Roman" w:hAnsi="Times New Roman"/>
+                <w:sz w:val="20"/>
+              </w:rPr>
+              <w:t xml:space="preserve">{{CUSTOMER_ADDRESS}}</w:t>
+            </w:r>
+          </w:p>
+          <w:p>
+            <w:r>
+              <w:rPr>
                 <w:b/>
-                <w:bCs/>
-                <w:sz w:val="20"/>
-                <w:szCs w:val="20"/>
-              </w:rPr>
-              <w:t>Contact Person:</w:t>
-            </w:r>
-            <w:r>
-              <w:rPr>
-                <w:rFonts w:ascii="Times New Roman" w:hAnsi="Times New Roman" w:cs="Times New Roman"/>
+                <w:rFonts w:ascii="Times New Roman" w:hAnsi="Times New Roman"/>
+                <w:sz w:val="20"/>
+              </w:rPr>
+              <w:t xml:space="preserve">Contact Person:	</w:t>
+            </w:r>
+            <w:r>
+              <w:rPr>
+                <w:rFonts w:ascii="Times New Roman" w:hAnsi="Times New Roman"/>
+                <w:sz w:val="20"/>
+              </w:rPr>
+              <w:t xml:space="preserve">{{CONTACT_PERSON}}</w:t>
+            </w:r>
+          </w:p>
+          <w:p>
+            <w:r>
+              <w:rPr>
                 <w:b/>
-                <w:bCs/>
-                <w:sz w:val="20"/>
-                <w:szCs w:val="20"/>
-              </w:rPr>
-              <w:tab/>
-            </w:r>
-            <w:r>
-              <w:rPr>
-                <w:rFonts w:ascii="Times New Roman" w:hAnsi="Times New Roman" w:cs="Times New Roman"/>
-                <w:sz w:val="20"/>
-                <w:szCs w:val="20"/>
-              </w:rPr>
-              <w:t xml:space="preserve">Mr. </w:t>
-            </w:r>
-            <w:r>
-              <w:rPr>
-                <w:rFonts w:ascii="Times New Roman" w:hAnsi="Times New Roman" w:cs="Times New Roman"/>
-                <w:sz w:val="20"/>
-                <w:szCs w:val="20"/>
-              </w:rPr>
-              <w:t>Mihir Karnawat</w:t>
-            </w:r>
-            <w:r>
-              <w:rPr>
-                <w:rFonts w:ascii="Times New Roman" w:hAnsi="Times New Roman" w:cs="Times New Roman"/>
-                <w:sz w:val="20"/>
-                <w:szCs w:val="20"/>
-              </w:rPr>
-              <w:t xml:space="preserve"> , 7247480551</w:t>
-            </w:r>
-          </w:p>
-          <w:p>
-            <w:pPr>
-              <w:tabs>
-                <w:tab w:val="left" w:pos="673"/>
-                <w:tab w:val="left" w:pos="1620"/>
-                <w:tab w:val="left" w:pos="1905"/>
-              </w:tabs>
-              <w:ind w:right="-108"/>
-              <w:rPr>
-                <w:rFonts w:ascii="Times New Roman" w:hAnsi="Times New Roman" w:cs="Times New Roman"/>
-                <w:b/>
-                <w:sz w:val="20"/>
-                <w:szCs w:val="20"/>
-              </w:rPr>
-            </w:pPr>
-            <w:r>
-              <w:rPr>
-                <w:rFonts w:ascii="Times New Roman" w:hAnsi="Times New Roman" w:cs="Times New Roman"/>
-                <w:b/>
-                <w:bCs/>
-                <w:sz w:val="20"/>
-                <w:szCs w:val="20"/>
-              </w:rPr>
-              <w:t>Email  :</w:t>
-            </w:r>
-            <w:r>
-              <w:rPr>
-                <w:rFonts w:ascii="Times New Roman" w:hAnsi="Times New Roman" w:cs="Times New Roman"/>
-                <w:b/>
-                <w:bCs/>
-                <w:color w:val="000000" w:themeColor="text1"/>
-                <w:sz w:val="20"/>
-                <w:szCs w:val="20"/>
-              </w:rPr>
-              <w:t xml:space="preserve">                   </w:t>
-            </w:r>
-            <w:r>
-              <w:rPr>
-                <w:rFonts w:ascii="Times New Roman" w:hAnsi="Times New Roman" w:cs="Times New Roman"/>
-                <w:color w:val="000000" w:themeColor="text1"/>
-                <w:sz w:val="20"/>
-                <w:szCs w:val="20"/>
-              </w:rPr>
-              <w:t>djainfoodproducts@gmail.com</w:t>
+                <w:rFonts w:ascii="Times New Roman" w:hAnsi="Times New Roman"/>
+                <w:sz w:val="20"/>
+              </w:rPr>
+              <w:t xml:space="preserve">Email  :                   </w:t>
+            </w:r>
+            <w:r>
+              <w:rPr>
+                <w:rFonts w:ascii="Times New Roman" w:hAnsi="Times New Roman"/>
+                <w:sz w:val="20"/>
+              </w:rPr>
+              <w:t xml:space="preserve">{{CUSTOMER_EMAIL}}</w:t>
             </w:r>
           </w:p>
         </w:tc>
@@ -306,20 +163,12 @@
             <w:hideMark/>
           </w:tcPr>
           <w:p>
-            <w:pPr>
-              <w:rPr>
-                <w:rFonts w:ascii="Times New Roman" w:hAnsi="Times New Roman" w:cs="Times New Roman"/>
-                <w:sz w:val="20"/>
-                <w:szCs w:val="20"/>
-              </w:rPr>
-            </w:pPr>
-            <w:r>
-              <w:rPr>
-                <w:rFonts w:ascii="Times New Roman" w:hAnsi="Times New Roman" w:cs="Times New Roman"/>
-                <w:sz w:val="20"/>
-                <w:szCs w:val="20"/>
-              </w:rPr>
-              <w:t xml:space="preserve">Drinking Water  </w:t>
+            <w:r>
+              <w:rPr>
+                <w:rFonts w:ascii="Times New Roman" w:hAnsi="Times New Roman"/>
+                <w:sz w:val="20"/>
+              </w:rPr>
+              <w:t xml:space="preserve">{{SAMPLE_NAME}}</w:t>
             </w:r>
           </w:p>
         </w:tc>
@@ -368,24 +217,12 @@
             <w:hideMark/>
           </w:tcPr>
           <w:p>
-            <w:pPr>
-              <w:tabs>
-                <w:tab w:val="left" w:pos="673"/>
-              </w:tabs>
-              <w:ind w:right="-108"/>
-              <w:rPr>
-                <w:rFonts w:ascii="Times New Roman" w:hAnsi="Times New Roman" w:cs="Times New Roman"/>
-                <w:sz w:val="20"/>
-                <w:szCs w:val="20"/>
-              </w:rPr>
-            </w:pPr>
-            <w:r>
-              <w:rPr>
-                <w:rFonts w:ascii="Times New Roman" w:hAnsi="Times New Roman" w:cs="Times New Roman"/>
-                <w:sz w:val="20"/>
-                <w:szCs w:val="20"/>
-              </w:rPr>
-              <w:t>642</w:t>
+            <w:r>
+              <w:rPr>
+                <w:rFonts w:ascii="Times New Roman" w:hAnsi="Times New Roman"/>
+                <w:sz w:val="20"/>
+              </w:rPr>
+              <w:t xml:space="preserve">{{REGISTRATION_NO}}</w:t>
             </w:r>
           </w:p>
         </w:tc>
@@ -436,25 +273,12 @@
             <w:hideMark/>
           </w:tcPr>
           <w:p>
-            <w:pPr>
-              <w:tabs>
-                <w:tab w:val="left" w:pos="673"/>
-              </w:tabs>
-              <w:ind w:right="-108"/>
-              <w:rPr>
-                <w:rFonts w:ascii="Times New Roman" w:hAnsi="Times New Roman" w:cs="Times New Roman"/>
-                <w:sz w:val="20"/>
-                <w:szCs w:val="20"/>
-              </w:rPr>
-            </w:pPr>
-            <w:r>
-              <w:rPr>
-                <w:rFonts w:ascii="Times New Roman" w:hAnsi="Times New Roman" w:cs="Times New Roman"/>
-                <w:bCs/>
-                <w:sz w:val="20"/>
-                <w:szCs w:val="20"/>
-              </w:rPr>
-              <w:t>Drinking water</w:t>
+            <w:r>
+              <w:rPr>
+                <w:rFonts w:ascii="Times New Roman" w:hAnsi="Times New Roman"/>
+                <w:sz w:val="20"/>
+              </w:rPr>
+              <w:t xml:space="preserve">{{PRODUCT_CATEGORY}}</w:t>
             </w:r>
           </w:p>
         </w:tc>
@@ -503,44 +327,12 @@
             <w:hideMark/>
           </w:tcPr>
           <w:p>
-            <w:pPr>
-              <w:tabs>
-                <w:tab w:val="left" w:pos="673"/>
-              </w:tabs>
-              <w:ind w:right="-108"/>
-              <w:rPr>
-                <w:rFonts w:ascii="Times New Roman" w:hAnsi="Times New Roman" w:cs="Times New Roman"/>
-                <w:bCs/>
-                <w:sz w:val="20"/>
-                <w:szCs w:val="20"/>
-              </w:rPr>
-            </w:pPr>
-            <w:r>
-              <w:rPr>
-                <w:rFonts w:ascii="Times New Roman" w:hAnsi="Times New Roman" w:cs="Times New Roman"/>
-                <w:bCs/>
-                <w:sz w:val="20"/>
-                <w:szCs w:val="20"/>
-              </w:rPr>
-              <w:t>26</w:t>
-            </w:r>
-            <w:r>
-              <w:rPr>
-                <w:rFonts w:ascii="Times New Roman" w:hAnsi="Times New Roman" w:cs="Times New Roman"/>
-                <w:bCs/>
-                <w:sz w:val="20"/>
-                <w:szCs w:val="20"/>
-              </w:rPr>
-              <w:t>/08</w:t>
-            </w:r>
-            <w:r>
-              <w:rPr>
-                <w:rFonts w:ascii="Times New Roman" w:hAnsi="Times New Roman" w:cs="Times New Roman"/>
-                <w:bCs/>
-                <w:sz w:val="20"/>
-                <w:szCs w:val="20"/>
-              </w:rPr>
-              <w:t>/2026</w:t>
+            <w:r>
+              <w:rPr>
+                <w:rFonts w:ascii="Times New Roman" w:hAnsi="Times New Roman"/>
+                <w:sz w:val="20"/>
+              </w:rPr>
+              <w:t xml:space="preserve">{{ISSUE_DATE}}</w:t>
             </w:r>
           </w:p>
         </w:tc>
@@ -591,24 +383,12 @@
             <w:hideMark/>
           </w:tcPr>
           <w:p>
-            <w:pPr>
-              <w:tabs>
-                <w:tab w:val="left" w:pos="673"/>
-              </w:tabs>
-              <w:ind w:right="-108"/>
-              <w:rPr>
-                <w:rFonts w:ascii="Times New Roman" w:hAnsi="Times New Roman" w:cs="Times New Roman"/>
-                <w:sz w:val="20"/>
-                <w:szCs w:val="20"/>
-              </w:rPr>
-            </w:pPr>
-            <w:r>
-              <w:rPr>
-                <w:rFonts w:ascii="Times New Roman" w:hAnsi="Times New Roman" w:cs="Times New Roman"/>
-                <w:sz w:val="20"/>
-                <w:szCs w:val="20"/>
-              </w:rPr>
-              <w:t>01x 5 Litre + 1x10 Litre</w:t>
+            <w:r>
+              <w:rPr>
+                <w:rFonts w:ascii="Times New Roman" w:hAnsi="Times New Roman"/>
+                <w:sz w:val="20"/>
+              </w:rPr>
+              <w:t xml:space="preserve">{{SAMPLE_QUANTITY}}</w:t>
             </w:r>
           </w:p>
         </w:tc>
@@ -657,32 +437,12 @@
             <w:hideMark/>
           </w:tcPr>
           <w:p>
-            <w:pPr>
-              <w:tabs>
-                <w:tab w:val="left" w:pos="673"/>
-              </w:tabs>
-              <w:ind w:right="-108"/>
-              <w:rPr>
-                <w:rFonts w:ascii="Times New Roman" w:hAnsi="Times New Roman" w:cs="Times New Roman"/>
-                <w:sz w:val="20"/>
-                <w:szCs w:val="20"/>
-              </w:rPr>
-            </w:pPr>
-            <w:r>
-              <w:rPr>
-                <w:rFonts w:ascii="Times New Roman" w:hAnsi="Times New Roman" w:cs="Times New Roman"/>
-                <w:sz w:val="20"/>
-                <w:szCs w:val="20"/>
-              </w:rPr>
-              <w:t>21/08</w:t>
-            </w:r>
-            <w:r>
-              <w:rPr>
-                <w:rFonts w:ascii="Times New Roman" w:hAnsi="Times New Roman" w:cs="Times New Roman"/>
-                <w:sz w:val="20"/>
-                <w:szCs w:val="20"/>
-              </w:rPr>
-              <w:t>/2026</w:t>
+            <w:r>
+              <w:rPr>
+                <w:rFonts w:ascii="Times New Roman" w:hAnsi="Times New Roman"/>
+                <w:sz w:val="20"/>
+              </w:rPr>
+              <w:t xml:space="preserve">{{RECEIPT_DATE}}</w:t>
             </w:r>
           </w:p>
         </w:tc>
@@ -733,32 +493,12 @@
             <w:hideMark/>
           </w:tcPr>
           <w:p>
-            <w:pPr>
-              <w:tabs>
-                <w:tab w:val="left" w:pos="673"/>
-              </w:tabs>
-              <w:ind w:right="-108"/>
-              <w:rPr>
-                <w:rFonts w:ascii="Times New Roman" w:hAnsi="Times New Roman" w:cs="Times New Roman"/>
-                <w:sz w:val="20"/>
-                <w:szCs w:val="20"/>
-              </w:rPr>
-            </w:pPr>
-            <w:r>
-              <w:rPr>
-                <w:rFonts w:ascii="Times New Roman" w:hAnsi="Times New Roman" w:cs="Times New Roman"/>
-                <w:sz w:val="20"/>
-                <w:szCs w:val="20"/>
-              </w:rPr>
-              <w:t xml:space="preserve">Packed in </w:t>
-            </w:r>
-            <w:r>
-              <w:rPr>
-                <w:rFonts w:ascii="Times New Roman" w:hAnsi="Times New Roman" w:cs="Times New Roman"/>
-                <w:sz w:val="20"/>
-                <w:szCs w:val="20"/>
-              </w:rPr>
-              <w:t>green colour jar.</w:t>
+            <w:r>
+              <w:rPr>
+                <w:rFonts w:ascii="Times New Roman" w:hAnsi="Times New Roman"/>
+                <w:sz w:val="20"/>
+              </w:rPr>
+              <w:t xml:space="preserve">{{PACKING_DETAILS}}</w:t>
             </w:r>
           </w:p>
         </w:tc>
@@ -807,48 +547,12 @@
             <w:hideMark/>
           </w:tcPr>
           <w:p>
-            <w:pPr>
-              <w:tabs>
-                <w:tab w:val="left" w:pos="673"/>
-              </w:tabs>
-              <w:ind w:right="-108"/>
-              <w:rPr>
-                <w:rFonts w:ascii="Times New Roman" w:hAnsi="Times New Roman" w:cs="Times New Roman"/>
-                <w:sz w:val="20"/>
-                <w:szCs w:val="20"/>
-              </w:rPr>
-            </w:pPr>
-            <w:r>
-              <w:rPr>
-                <w:rFonts w:ascii="Times New Roman" w:hAnsi="Times New Roman" w:cs="Times New Roman"/>
-                <w:sz w:val="20"/>
-                <w:szCs w:val="20"/>
-              </w:rPr>
-              <w:t xml:space="preserve">21/08/2026 to </w:t>
-            </w:r>
-            <w:r>
-              <w:rPr>
-                <w:rFonts w:ascii="Times New Roman" w:hAnsi="Times New Roman" w:cs="Times New Roman"/>
-                <w:sz w:val="20"/>
-                <w:szCs w:val="20"/>
-              </w:rPr>
-              <w:t>25</w:t>
-            </w:r>
-            <w:r>
-              <w:rPr>
-                <w:rFonts w:ascii="Times New Roman" w:hAnsi="Times New Roman" w:cs="Times New Roman"/>
-                <w:sz w:val="20"/>
-                <w:szCs w:val="20"/>
-              </w:rPr>
-              <w:t>/08</w:t>
-            </w:r>
-            <w:r>
-              <w:rPr>
-                <w:rFonts w:ascii="Times New Roman" w:hAnsi="Times New Roman" w:cs="Times New Roman"/>
-                <w:sz w:val="20"/>
-                <w:szCs w:val="20"/>
-              </w:rPr>
-              <w:t>/2026</w:t>
+            <w:r>
+              <w:rPr>
+                <w:rFonts w:ascii="Times New Roman" w:hAnsi="Times New Roman"/>
+                <w:sz w:val="20"/>
+              </w:rPr>
+              <w:t xml:space="preserve">{{TESTING_PERIOD}}</w:t>
             </w:r>
           </w:p>
         </w:tc>
@@ -902,24 +606,12 @@
             <w:hideMark/>
           </w:tcPr>
           <w:p>
-            <w:pPr>
-              <w:tabs>
-                <w:tab w:val="left" w:pos="673"/>
-              </w:tabs>
-              <w:ind w:right="-108"/>
-              <w:rPr>
-                <w:rFonts w:ascii="Times New Roman" w:hAnsi="Times New Roman" w:cs="Times New Roman"/>
-                <w:sz w:val="20"/>
-                <w:szCs w:val="20"/>
-              </w:rPr>
-            </w:pPr>
-            <w:r>
-              <w:rPr>
-                <w:rFonts w:ascii="Times New Roman" w:hAnsi="Times New Roman" w:cs="Times New Roman"/>
-                <w:sz w:val="20"/>
-                <w:szCs w:val="20"/>
-              </w:rPr>
-              <w:t>NA</w:t>
+            <w:r>
+              <w:rPr>
+                <w:rFonts w:ascii="Times New Roman" w:hAnsi="Times New Roman"/>
+                <w:sz w:val="20"/>
+              </w:rPr>
+              <w:t xml:space="preserve">{{MARKING_SEAL}}</w:t>
             </w:r>
           </w:p>
         </w:tc>
@@ -968,24 +660,12 @@
             <w:hideMark/>
           </w:tcPr>
           <w:p>
-            <w:pPr>
-              <w:tabs>
-                <w:tab w:val="left" w:pos="673"/>
-              </w:tabs>
-              <w:ind w:right="-108"/>
-              <w:rPr>
-                <w:rFonts w:ascii="Times New Roman" w:hAnsi="Times New Roman" w:cs="Times New Roman"/>
-                <w:sz w:val="20"/>
-                <w:szCs w:val="20"/>
-              </w:rPr>
-            </w:pPr>
-            <w:r>
-              <w:rPr>
-                <w:rFonts w:ascii="Times New Roman" w:hAnsi="Times New Roman" w:cs="Times New Roman"/>
-                <w:sz w:val="20"/>
-                <w:szCs w:val="20"/>
-              </w:rPr>
-              <w:t>IS 10500:2012</w:t>
+            <w:r>
+              <w:rPr>
+                <w:rFonts w:ascii="Times New Roman" w:hAnsi="Times New Roman"/>
+                <w:sz w:val="20"/>
+              </w:rPr>
+              <w:t xml:space="preserve">{{STANDARD_SPECIFICATION}}</w:t>
             </w:r>
           </w:p>
         </w:tc>
@@ -1043,24 +723,12 @@
             <w:hideMark/>
           </w:tcPr>
           <w:p>
-            <w:pPr>
-              <w:tabs>
-                <w:tab w:val="left" w:pos="673"/>
-              </w:tabs>
-              <w:ind w:right="-108"/>
-              <w:rPr>
-                <w:rFonts w:ascii="Times New Roman" w:hAnsi="Times New Roman" w:cs="Times New Roman"/>
-                <w:sz w:val="20"/>
-                <w:szCs w:val="20"/>
-              </w:rPr>
-            </w:pPr>
-            <w:r>
-              <w:rPr>
-                <w:rFonts w:ascii="Times New Roman" w:hAnsi="Times New Roman" w:cs="Times New Roman"/>
-                <w:sz w:val="20"/>
-                <w:szCs w:val="20"/>
-              </w:rPr>
-              <w:t>Sample provided by the customer</w:t>
+            <w:r>
+              <w:rPr>
+                <w:rFonts w:ascii="Times New Roman" w:hAnsi="Times New Roman"/>
+                <w:sz w:val="20"/>
+              </w:rPr>
+              <w:t xml:space="preserve">{{SAMPLING_DETAILS}}</w:t>
             </w:r>
           </w:p>
         </w:tc>
@@ -1109,24 +777,12 @@
             <w:hideMark/>
           </w:tcPr>
           <w:p>
-            <w:pPr>
-              <w:tabs>
-                <w:tab w:val="left" w:pos="673"/>
-              </w:tabs>
-              <w:ind w:right="-108"/>
-              <w:rPr>
-                <w:rFonts w:ascii="Times New Roman" w:hAnsi="Times New Roman" w:cs="Times New Roman"/>
-                <w:sz w:val="20"/>
-                <w:szCs w:val="20"/>
-              </w:rPr>
-            </w:pPr>
-            <w:r>
-              <w:rPr>
-                <w:rFonts w:ascii="Times New Roman" w:hAnsi="Times New Roman" w:cs="Times New Roman"/>
-                <w:sz w:val="20"/>
-                <w:szCs w:val="20"/>
-              </w:rPr>
-              <w:t>Satisfactory</w:t>
+            <w:r>
+              <w:rPr>
+                <w:rFonts w:ascii="Times New Roman" w:hAnsi="Times New Roman"/>
+                <w:sz w:val="20"/>
+              </w:rPr>
+              <w:t xml:space="preserve">{{SAMPLE_CONDITION}}</w:t>
             </w:r>
           </w:p>
         </w:tc>
@@ -1178,40 +834,13 @@
             <w:hideMark/>
           </w:tcPr>
           <w:p>
-            <w:pPr>
-              <w:ind w:right="-312"/>
-              <w:rPr>
-                <w:rFonts w:ascii="Times New Roman" w:hAnsi="Times New Roman" w:cs="Times New Roman"/>
-                <w:sz w:val="20"/>
-                <w:szCs w:val="20"/>
-              </w:rPr>
-            </w:pPr>
-            <w:r>
-              <w:rPr>
-                <w:rFonts w:ascii="Times New Roman" w:hAnsi="Times New Roman" w:cs="Times New Roman"/>
-                <w:sz w:val="20"/>
-                <w:szCs w:val="20"/>
-              </w:rPr>
-              <w:t xml:space="preserve">Clear colourless liquid without any sediment and suspended particles Packed in </w:t>
-            </w:r>
-            <w:r>
-              <w:rPr>
-                <w:rFonts w:ascii="Times New Roman" w:hAnsi="Times New Roman" w:cs="Times New Roman"/>
-                <w:sz w:val="20"/>
-                <w:szCs w:val="20"/>
-              </w:rPr>
-              <w:t xml:space="preserve">green colour transparent jar, with green cap. </w:t>
-            </w:r>
-          </w:p>
-          <w:p>
-            <w:pPr>
-              <w:ind w:right="-312"/>
-              <w:rPr>
-                <w:rFonts w:ascii="Times New Roman" w:hAnsi="Times New Roman" w:cs="Times New Roman"/>
-                <w:sz w:val="20"/>
-                <w:szCs w:val="20"/>
-              </w:rPr>
-            </w:pPr>
+            <w:r>
+              <w:rPr>
+                <w:rFonts w:ascii="Times New Roman" w:hAnsi="Times New Roman"/>
+                <w:sz w:val="20"/>
+              </w:rPr>
+              <w:t xml:space="preserve">{{SAMPLE_DESCRIPTION}}</w:t>
+            </w:r>
           </w:p>
         </w:tc>
       </w:tr>
@@ -3252,6 +2881,7 @@
                 <w:sz w:val="20"/>
                 <w:szCs w:val="20"/>
               </w:rPr>
+              <w:pageBreakBefore/>
             </w:pPr>
           </w:p>
         </w:tc>
@@ -4089,20 +3719,12 @@
             <w:vAlign w:val="center"/>
           </w:tcPr>
           <w:p>
-            <w:pPr>
-              <w:rPr>
-                <w:rFonts w:ascii="Times New Roman" w:hAnsi="Times New Roman" w:cs="Times New Roman"/>
-                <w:sz w:val="20"/>
-                <w:szCs w:val="20"/>
-              </w:rPr>
-            </w:pPr>
-            <w:r>
-              <w:rPr>
-                <w:rFonts w:ascii="Times New Roman" w:hAnsi="Times New Roman" w:cs="Times New Roman"/>
-                <w:sz w:val="20"/>
-                <w:szCs w:val="20"/>
-              </w:rPr>
-              <w:t xml:space="preserve">Drinking Water  </w:t>
+            <w:r>
+              <w:rPr>
+                <w:rFonts w:ascii="Times New Roman" w:hAnsi="Times New Roman"/>
+                <w:sz w:val="20"/>
+              </w:rPr>
+              <w:t xml:space="preserve">{{SAMPLE_NAME}}</w:t>
             </w:r>
           </w:p>
         </w:tc>
@@ -4137,24 +3759,12 @@
             <w:vAlign w:val="center"/>
           </w:tcPr>
           <w:p>
-            <w:pPr>
-              <w:tabs>
-                <w:tab w:val="left" w:pos="673"/>
-              </w:tabs>
-              <w:ind w:right="-108"/>
-              <w:rPr>
-                <w:rFonts w:ascii="Times New Roman" w:hAnsi="Times New Roman" w:cs="Times New Roman"/>
-                <w:sz w:val="20"/>
-                <w:szCs w:val="20"/>
-              </w:rPr>
-            </w:pPr>
-            <w:r>
-              <w:rPr>
-                <w:rFonts w:ascii="Times New Roman" w:hAnsi="Times New Roman" w:cs="Times New Roman"/>
-                <w:sz w:val="20"/>
-                <w:szCs w:val="20"/>
-              </w:rPr>
-              <w:t>642</w:t>
+            <w:r>
+              <w:rPr>
+                <w:rFonts w:ascii="Times New Roman" w:hAnsi="Times New Roman"/>
+                <w:sz w:val="20"/>
+              </w:rPr>
+              <w:t xml:space="preserve">{{REGISTRATION_NO}}</w:t>
             </w:r>
           </w:p>
         </w:tc>
@@ -4194,25 +3804,12 @@
             <w:vAlign w:val="center"/>
           </w:tcPr>
           <w:p>
-            <w:pPr>
-              <w:tabs>
-                <w:tab w:val="left" w:pos="673"/>
-              </w:tabs>
-              <w:ind w:right="-108"/>
-              <w:rPr>
-                <w:rFonts w:ascii="Times New Roman" w:hAnsi="Times New Roman" w:cs="Times New Roman"/>
-                <w:sz w:val="20"/>
-                <w:szCs w:val="20"/>
-              </w:rPr>
-            </w:pPr>
-            <w:r>
-              <w:rPr>
-                <w:rFonts w:ascii="Times New Roman" w:hAnsi="Times New Roman" w:cs="Times New Roman"/>
-                <w:bCs/>
-                <w:sz w:val="20"/>
-                <w:szCs w:val="20"/>
-              </w:rPr>
-              <w:t>Drinking water</w:t>
+            <w:r>
+              <w:rPr>
+                <w:rFonts w:ascii="Times New Roman" w:hAnsi="Times New Roman"/>
+                <w:sz w:val="20"/>
+              </w:rPr>
+              <w:t xml:space="preserve">{{PRODUCT_CATEGORY}}</w:t>
             </w:r>
           </w:p>
         </w:tc>
@@ -4247,35 +3844,12 @@
             <w:vAlign w:val="center"/>
           </w:tcPr>
           <w:p>
-            <w:pPr>
-              <w:tabs>
-                <w:tab w:val="left" w:pos="673"/>
-              </w:tabs>
-              <w:ind w:right="-108"/>
-              <w:rPr>
-                <w:rFonts w:ascii="Times New Roman" w:hAnsi="Times New Roman" w:cs="Times New Roman"/>
-                <w:bCs/>
-                <w:sz w:val="20"/>
-                <w:szCs w:val="20"/>
-              </w:rPr>
-            </w:pPr>
-            <w:r>
-              <w:rPr>
-                <w:rFonts w:ascii="Times New Roman" w:hAnsi="Times New Roman" w:cs="Times New Roman"/>
-                <w:bCs/>
-                <w:sz w:val="20"/>
-                <w:szCs w:val="20"/>
-              </w:rPr>
-              <w:t>26/08</w:t>
-            </w:r>
-            <w:r>
-              <w:rPr>
-                <w:rFonts w:ascii="Times New Roman" w:hAnsi="Times New Roman" w:cs="Times New Roman"/>
-                <w:bCs/>
-                <w:sz w:val="20"/>
-                <w:szCs w:val="20"/>
-              </w:rPr>
-              <w:t>/2026</w:t>
+            <w:r>
+              <w:rPr>
+                <w:rFonts w:ascii="Times New Roman" w:hAnsi="Times New Roman"/>
+                <w:sz w:val="20"/>
+              </w:rPr>
+              <w:t xml:space="preserve">{{ISSUE_DATE}}</w:t>
             </w:r>
           </w:p>
         </w:tc>
@@ -7577,6 +7151,7 @@
                 <w:sz w:val="20"/>
                 <w:szCs w:val="20"/>
               </w:rPr>
+              <w:pageBreakBefore/>
             </w:pPr>
             <w:r>
               <w:rPr>
@@ -7614,20 +7189,12 @@
             <w:vAlign w:val="center"/>
           </w:tcPr>
           <w:p>
-            <w:pPr>
-              <w:rPr>
-                <w:rFonts w:ascii="Times New Roman" w:hAnsi="Times New Roman" w:cs="Times New Roman"/>
-                <w:sz w:val="20"/>
-                <w:szCs w:val="20"/>
-              </w:rPr>
-            </w:pPr>
-            <w:r>
-              <w:rPr>
-                <w:rFonts w:ascii="Times New Roman" w:hAnsi="Times New Roman" w:cs="Times New Roman"/>
-                <w:sz w:val="20"/>
-                <w:szCs w:val="20"/>
-              </w:rPr>
-              <w:t xml:space="preserve">Drinking Water  </w:t>
+            <w:r>
+              <w:rPr>
+                <w:rFonts w:ascii="Times New Roman" w:hAnsi="Times New Roman"/>
+                <w:sz w:val="20"/>
+              </w:rPr>
+              <w:t xml:space="preserve">{{SAMPLE_NAME}}</w:t>
             </w:r>
           </w:p>
         </w:tc>
@@ -7662,24 +7229,12 @@
             <w:vAlign w:val="center"/>
           </w:tcPr>
           <w:p>
-            <w:pPr>
-              <w:tabs>
-                <w:tab w:val="left" w:pos="673"/>
-              </w:tabs>
-              <w:ind w:right="-108"/>
-              <w:rPr>
-                <w:rFonts w:ascii="Times New Roman" w:hAnsi="Times New Roman" w:cs="Times New Roman"/>
-                <w:sz w:val="20"/>
-                <w:szCs w:val="20"/>
-              </w:rPr>
-            </w:pPr>
-            <w:r>
-              <w:rPr>
-                <w:rFonts w:ascii="Times New Roman" w:hAnsi="Times New Roman" w:cs="Times New Roman"/>
-                <w:sz w:val="20"/>
-                <w:szCs w:val="20"/>
-              </w:rPr>
-              <w:t>642</w:t>
+            <w:r>
+              <w:rPr>
+                <w:rFonts w:ascii="Times New Roman" w:hAnsi="Times New Roman"/>
+                <w:sz w:val="20"/>
+              </w:rPr>
+              <w:t xml:space="preserve">{{REGISTRATION_NO}}</w:t>
             </w:r>
           </w:p>
         </w:tc>
@@ -7719,25 +7274,12 @@
             <w:vAlign w:val="center"/>
           </w:tcPr>
           <w:p>
-            <w:pPr>
-              <w:tabs>
-                <w:tab w:val="left" w:pos="673"/>
-              </w:tabs>
-              <w:ind w:right="-108"/>
-              <w:rPr>
-                <w:rFonts w:ascii="Times New Roman" w:hAnsi="Times New Roman" w:cs="Times New Roman"/>
-                <w:sz w:val="20"/>
-                <w:szCs w:val="20"/>
-              </w:rPr>
-            </w:pPr>
-            <w:r>
-              <w:rPr>
-                <w:rFonts w:ascii="Times New Roman" w:hAnsi="Times New Roman" w:cs="Times New Roman"/>
-                <w:bCs/>
-                <w:sz w:val="20"/>
-                <w:szCs w:val="20"/>
-              </w:rPr>
-              <w:t>Drinking water</w:t>
+            <w:r>
+              <w:rPr>
+                <w:rFonts w:ascii="Times New Roman" w:hAnsi="Times New Roman"/>
+                <w:sz w:val="20"/>
+              </w:rPr>
+              <w:t xml:space="preserve">{{PRODUCT_CATEGORY}}</w:t>
             </w:r>
           </w:p>
         </w:tc>
@@ -7772,44 +7314,12 @@
             <w:vAlign w:val="center"/>
           </w:tcPr>
           <w:p>
-            <w:pPr>
-              <w:tabs>
-                <w:tab w:val="left" w:pos="673"/>
-              </w:tabs>
-              <w:ind w:right="-108"/>
-              <w:rPr>
-                <w:rFonts w:ascii="Times New Roman" w:hAnsi="Times New Roman" w:cs="Times New Roman"/>
-                <w:bCs/>
-                <w:sz w:val="20"/>
-                <w:szCs w:val="20"/>
-              </w:rPr>
-            </w:pPr>
-            <w:r>
-              <w:rPr>
-                <w:rFonts w:ascii="Times New Roman" w:hAnsi="Times New Roman" w:cs="Times New Roman"/>
-                <w:bCs/>
-                <w:sz w:val="20"/>
-                <w:szCs w:val="20"/>
-              </w:rPr>
-              <w:t>26</w:t>
-            </w:r>
-            <w:r>
-              <w:rPr>
-                <w:rFonts w:ascii="Times New Roman" w:hAnsi="Times New Roman" w:cs="Times New Roman"/>
-                <w:bCs/>
-                <w:sz w:val="20"/>
-                <w:szCs w:val="20"/>
-              </w:rPr>
-              <w:t>/08</w:t>
-            </w:r>
-            <w:r>
-              <w:rPr>
-                <w:rFonts w:ascii="Times New Roman" w:hAnsi="Times New Roman" w:cs="Times New Roman"/>
-                <w:bCs/>
-                <w:sz w:val="20"/>
-                <w:szCs w:val="20"/>
-              </w:rPr>
-              <w:t>/2026</w:t>
+            <w:r>
+              <w:rPr>
+                <w:rFonts w:ascii="Times New Roman" w:hAnsi="Times New Roman"/>
+                <w:sz w:val="20"/>
+              </w:rPr>
+              <w:t xml:space="preserve">{{ISSUE_DATE}}</w:t>
             </w:r>
           </w:p>
         </w:tc>
@@ -10997,20 +10507,12 @@
             <w:vAlign w:val="center"/>
           </w:tcPr>
           <w:p>
-            <w:pPr>
-              <w:rPr>
-                <w:rFonts w:ascii="Times New Roman" w:hAnsi="Times New Roman" w:cs="Times New Roman"/>
-                <w:sz w:val="20"/>
-                <w:szCs w:val="20"/>
-              </w:rPr>
-            </w:pPr>
-            <w:r>
-              <w:rPr>
-                <w:rFonts w:ascii="Times New Roman" w:hAnsi="Times New Roman" w:cs="Times New Roman"/>
-                <w:sz w:val="20"/>
-                <w:szCs w:val="20"/>
-              </w:rPr>
-              <w:t xml:space="preserve">Drinking Water  </w:t>
+            <w:r>
+              <w:rPr>
+                <w:rFonts w:ascii="Times New Roman" w:hAnsi="Times New Roman"/>
+                <w:sz w:val="20"/>
+              </w:rPr>
+              <w:t xml:space="preserve">{{SAMPLE_NAME}}</w:t>
             </w:r>
           </w:p>
         </w:tc>
@@ -11047,24 +10549,12 @@
             <w:vAlign w:val="center"/>
           </w:tcPr>
           <w:p>
-            <w:pPr>
-              <w:tabs>
-                <w:tab w:val="left" w:pos="673"/>
-              </w:tabs>
-              <w:ind w:right="-108"/>
-              <w:rPr>
-                <w:rFonts w:ascii="Times New Roman" w:hAnsi="Times New Roman" w:cs="Times New Roman"/>
-                <w:sz w:val="20"/>
-                <w:szCs w:val="20"/>
-              </w:rPr>
-            </w:pPr>
-            <w:r>
-              <w:rPr>
-                <w:rFonts w:ascii="Times New Roman" w:hAnsi="Times New Roman" w:cs="Times New Roman"/>
-                <w:sz w:val="20"/>
-                <w:szCs w:val="20"/>
-              </w:rPr>
-              <w:t>642</w:t>
+            <w:r>
+              <w:rPr>
+                <w:rFonts w:ascii="Times New Roman" w:hAnsi="Times New Roman"/>
+                <w:sz w:val="20"/>
+              </w:rPr>
+              <w:t xml:space="preserve">{{REGISTRATION_NO}}</w:t>
             </w:r>
           </w:p>
         </w:tc>
@@ -11106,25 +10596,12 @@
             <w:vAlign w:val="center"/>
           </w:tcPr>
           <w:p>
-            <w:pPr>
-              <w:tabs>
-                <w:tab w:val="left" w:pos="673"/>
-              </w:tabs>
-              <w:ind w:right="-108"/>
-              <w:rPr>
-                <w:rFonts w:ascii="Times New Roman" w:hAnsi="Times New Roman" w:cs="Times New Roman"/>
-                <w:sz w:val="20"/>
-                <w:szCs w:val="20"/>
-              </w:rPr>
-            </w:pPr>
-            <w:r>
-              <w:rPr>
-                <w:rFonts w:ascii="Times New Roman" w:hAnsi="Times New Roman" w:cs="Times New Roman"/>
-                <w:bCs/>
-                <w:sz w:val="20"/>
-                <w:szCs w:val="20"/>
-              </w:rPr>
-              <w:t>Drinking water</w:t>
+            <w:r>
+              <w:rPr>
+                <w:rFonts w:ascii="Times New Roman" w:hAnsi="Times New Roman"/>
+                <w:sz w:val="20"/>
+              </w:rPr>
+              <w:t xml:space="preserve">{{PRODUCT_CATEGORY}}</w:t>
             </w:r>
           </w:p>
         </w:tc>
@@ -11161,35 +10638,12 @@
             <w:vAlign w:val="center"/>
           </w:tcPr>
           <w:p>
-            <w:pPr>
-              <w:tabs>
-                <w:tab w:val="left" w:pos="673"/>
-              </w:tabs>
-              <w:ind w:right="-108"/>
-              <w:rPr>
-                <w:rFonts w:ascii="Times New Roman" w:hAnsi="Times New Roman" w:cs="Times New Roman"/>
-                <w:bCs/>
-                <w:sz w:val="20"/>
-                <w:szCs w:val="20"/>
-              </w:rPr>
-            </w:pPr>
-            <w:r>
-              <w:rPr>
-                <w:rFonts w:ascii="Times New Roman" w:hAnsi="Times New Roman" w:cs="Times New Roman"/>
-                <w:bCs/>
-                <w:sz w:val="20"/>
-                <w:szCs w:val="20"/>
-              </w:rPr>
-              <w:t>26/08</w:t>
-            </w:r>
-            <w:r>
-              <w:rPr>
-                <w:rFonts w:ascii="Times New Roman" w:hAnsi="Times New Roman" w:cs="Times New Roman"/>
-                <w:bCs/>
-                <w:sz w:val="20"/>
-                <w:szCs w:val="20"/>
-              </w:rPr>
-              <w:t>/2026</w:t>
+            <w:r>
+              <w:rPr>
+                <w:rFonts w:ascii="Times New Roman" w:hAnsi="Times New Roman"/>
+                <w:sz w:val="20"/>
+              </w:rPr>
+              <w:t xml:space="preserve">{{ISSUE_DATE}}</w:t>
             </w:r>
           </w:p>
         </w:tc>
@@ -11232,6 +10686,7 @@
                 <w:sz w:val="20"/>
                 <w:szCs w:val="20"/>
               </w:rPr>
+              <w:pageBreakBefore/>
             </w:pPr>
             <w:r>
               <w:rPr>
@@ -14501,6 +13956,7 @@
                 <w:sz w:val="20"/>
                 <w:szCs w:val="20"/>
               </w:rPr>
+              <w:pageBreakBefore/>
             </w:pPr>
             <w:r>
               <w:rPr>
@@ -14538,20 +13994,12 @@
             <w:vAlign w:val="center"/>
           </w:tcPr>
           <w:p>
-            <w:pPr>
-              <w:rPr>
-                <w:rFonts w:ascii="Times New Roman" w:hAnsi="Times New Roman" w:cs="Times New Roman"/>
-                <w:sz w:val="20"/>
-                <w:szCs w:val="20"/>
-              </w:rPr>
-            </w:pPr>
-            <w:r>
-              <w:rPr>
-                <w:rFonts w:ascii="Times New Roman" w:hAnsi="Times New Roman" w:cs="Times New Roman"/>
-                <w:sz w:val="20"/>
-                <w:szCs w:val="20"/>
-              </w:rPr>
-              <w:t xml:space="preserve">Drinking Water  </w:t>
+            <w:r>
+              <w:rPr>
+                <w:rFonts w:ascii="Times New Roman" w:hAnsi="Times New Roman"/>
+                <w:sz w:val="20"/>
+              </w:rPr>
+              <w:t xml:space="preserve">{{SAMPLE_NAME}}</w:t>
             </w:r>
           </w:p>
         </w:tc>
@@ -14586,24 +14034,12 @@
             <w:vAlign w:val="center"/>
           </w:tcPr>
           <w:p>
-            <w:pPr>
-              <w:tabs>
-                <w:tab w:val="left" w:pos="673"/>
-              </w:tabs>
-              <w:ind w:right="-108"/>
-              <w:rPr>
-                <w:rFonts w:ascii="Times New Roman" w:hAnsi="Times New Roman" w:cs="Times New Roman"/>
-                <w:sz w:val="20"/>
-                <w:szCs w:val="20"/>
-              </w:rPr>
-            </w:pPr>
-            <w:r>
-              <w:rPr>
-                <w:rFonts w:ascii="Times New Roman" w:hAnsi="Times New Roman" w:cs="Times New Roman"/>
-                <w:sz w:val="20"/>
-                <w:szCs w:val="20"/>
-              </w:rPr>
-              <w:t>642</w:t>
+            <w:r>
+              <w:rPr>
+                <w:rFonts w:ascii="Times New Roman" w:hAnsi="Times New Roman"/>
+                <w:sz w:val="20"/>
+              </w:rPr>
+              <w:t xml:space="preserve">{{REGISTRATION_NO}}</w:t>
             </w:r>
           </w:p>
         </w:tc>
@@ -14643,25 +14079,12 @@
             <w:vAlign w:val="center"/>
           </w:tcPr>
           <w:p>
-            <w:pPr>
-              <w:tabs>
-                <w:tab w:val="left" w:pos="673"/>
-              </w:tabs>
-              <w:ind w:right="-108"/>
-              <w:rPr>
-                <w:rFonts w:ascii="Times New Roman" w:hAnsi="Times New Roman" w:cs="Times New Roman"/>
-                <w:sz w:val="20"/>
-                <w:szCs w:val="20"/>
-              </w:rPr>
-            </w:pPr>
-            <w:r>
-              <w:rPr>
-                <w:rFonts w:ascii="Times New Roman" w:hAnsi="Times New Roman" w:cs="Times New Roman"/>
-                <w:bCs/>
-                <w:sz w:val="20"/>
-                <w:szCs w:val="20"/>
-              </w:rPr>
-              <w:t>Drinking water</w:t>
+            <w:r>
+              <w:rPr>
+                <w:rFonts w:ascii="Times New Roman" w:hAnsi="Times New Roman"/>
+                <w:sz w:val="20"/>
+              </w:rPr>
+              <w:t xml:space="preserve">{{PRODUCT_CATEGORY}}</w:t>
             </w:r>
           </w:p>
         </w:tc>
@@ -14696,35 +14119,12 @@
             <w:vAlign w:val="center"/>
           </w:tcPr>
           <w:p>
-            <w:pPr>
-              <w:tabs>
-                <w:tab w:val="left" w:pos="673"/>
-              </w:tabs>
-              <w:ind w:right="-108"/>
-              <w:rPr>
-                <w:rFonts w:ascii="Times New Roman" w:hAnsi="Times New Roman" w:cs="Times New Roman"/>
-                <w:bCs/>
-                <w:sz w:val="20"/>
-                <w:szCs w:val="20"/>
-              </w:rPr>
-            </w:pPr>
-            <w:r>
-              <w:rPr>
-                <w:rFonts w:ascii="Times New Roman" w:hAnsi="Times New Roman" w:cs="Times New Roman"/>
-                <w:bCs/>
-                <w:sz w:val="20"/>
-                <w:szCs w:val="20"/>
-              </w:rPr>
-              <w:t>26/08</w:t>
-            </w:r>
-            <w:r>
-              <w:rPr>
-                <w:rFonts w:ascii="Times New Roman" w:hAnsi="Times New Roman" w:cs="Times New Roman"/>
-                <w:bCs/>
-                <w:sz w:val="20"/>
-                <w:szCs w:val="20"/>
-              </w:rPr>
-              <w:t>/2026</w:t>
+            <w:r>
+              <w:rPr>
+                <w:rFonts w:ascii="Times New Roman" w:hAnsi="Times New Roman"/>
+                <w:sz w:val="20"/>
+              </w:rPr>
+              <w:t xml:space="preserve">{{ISSUE_DATE}}</w:t>
             </w:r>
           </w:p>
         </w:tc>
@@ -18232,20 +17632,12 @@
             <w:vAlign w:val="center"/>
           </w:tcPr>
           <w:p>
-            <w:pPr>
-              <w:rPr>
-                <w:rFonts w:ascii="Times New Roman" w:hAnsi="Times New Roman" w:cs="Times New Roman"/>
-                <w:sz w:val="20"/>
-                <w:szCs w:val="20"/>
-              </w:rPr>
-            </w:pPr>
-            <w:r>
-              <w:rPr>
-                <w:rFonts w:ascii="Times New Roman" w:hAnsi="Times New Roman" w:cs="Times New Roman"/>
-                <w:sz w:val="20"/>
-                <w:szCs w:val="20"/>
-              </w:rPr>
-              <w:t xml:space="preserve">Drinking Water  </w:t>
+            <w:r>
+              <w:rPr>
+                <w:rFonts w:ascii="Times New Roman" w:hAnsi="Times New Roman"/>
+                <w:sz w:val="20"/>
+              </w:rPr>
+              <w:t xml:space="preserve">{{SAMPLE_NAME}}</w:t>
             </w:r>
           </w:p>
         </w:tc>
@@ -18281,24 +17673,12 @@
             <w:vAlign w:val="center"/>
           </w:tcPr>
           <w:p>
-            <w:pPr>
-              <w:tabs>
-                <w:tab w:val="left" w:pos="673"/>
-              </w:tabs>
-              <w:ind w:right="-108"/>
-              <w:rPr>
-                <w:rFonts w:ascii="Times New Roman" w:hAnsi="Times New Roman" w:cs="Times New Roman"/>
-                <w:sz w:val="20"/>
-                <w:szCs w:val="20"/>
-              </w:rPr>
-            </w:pPr>
-            <w:r>
-              <w:rPr>
-                <w:rFonts w:ascii="Times New Roman" w:hAnsi="Times New Roman" w:cs="Times New Roman"/>
-                <w:sz w:val="20"/>
-                <w:szCs w:val="20"/>
-              </w:rPr>
-              <w:t>642</w:t>
+            <w:r>
+              <w:rPr>
+                <w:rFonts w:ascii="Times New Roman" w:hAnsi="Times New Roman"/>
+                <w:sz w:val="20"/>
+              </w:rPr>
+              <w:t xml:space="preserve">{{REGISTRATION_NO}}</w:t>
             </w:r>
           </w:p>
         </w:tc>
@@ -18340,25 +17720,12 @@
             <w:vAlign w:val="center"/>
           </w:tcPr>
           <w:p>
-            <w:pPr>
-              <w:tabs>
-                <w:tab w:val="left" w:pos="673"/>
-              </w:tabs>
-              <w:ind w:right="-108"/>
-              <w:rPr>
-                <w:rFonts w:ascii="Times New Roman" w:hAnsi="Times New Roman" w:cs="Times New Roman"/>
-                <w:sz w:val="20"/>
-                <w:szCs w:val="20"/>
-              </w:rPr>
-            </w:pPr>
-            <w:r>
-              <w:rPr>
-                <w:rFonts w:ascii="Times New Roman" w:hAnsi="Times New Roman" w:cs="Times New Roman"/>
-                <w:bCs/>
-                <w:sz w:val="20"/>
-                <w:szCs w:val="20"/>
-              </w:rPr>
-              <w:t>Drinking water</w:t>
+            <w:r>
+              <w:rPr>
+                <w:rFonts w:ascii="Times New Roman" w:hAnsi="Times New Roman"/>
+                <w:sz w:val="20"/>
+              </w:rPr>
+              <w:t xml:space="preserve">{{PRODUCT_CATEGORY}}</w:t>
             </w:r>
           </w:p>
         </w:tc>
@@ -18394,35 +17761,12 @@
             <w:vAlign w:val="center"/>
           </w:tcPr>
           <w:p>
-            <w:pPr>
-              <w:tabs>
-                <w:tab w:val="left" w:pos="673"/>
-              </w:tabs>
-              <w:ind w:right="-108"/>
-              <w:rPr>
-                <w:rFonts w:ascii="Times New Roman" w:hAnsi="Times New Roman" w:cs="Times New Roman"/>
-                <w:bCs/>
-                <w:sz w:val="20"/>
-                <w:szCs w:val="20"/>
-              </w:rPr>
-            </w:pPr>
-            <w:r>
-              <w:rPr>
-                <w:rFonts w:ascii="Times New Roman" w:hAnsi="Times New Roman" w:cs="Times New Roman"/>
-                <w:bCs/>
-                <w:sz w:val="20"/>
-                <w:szCs w:val="20"/>
-              </w:rPr>
-              <w:t>26/08</w:t>
-            </w:r>
-            <w:r>
-              <w:rPr>
-                <w:rFonts w:ascii="Times New Roman" w:hAnsi="Times New Roman" w:cs="Times New Roman"/>
-                <w:bCs/>
-                <w:sz w:val="20"/>
-                <w:szCs w:val="20"/>
-              </w:rPr>
-              <w:t>/2026</w:t>
+            <w:r>
+              <w:rPr>
+                <w:rFonts w:ascii="Times New Roman" w:hAnsi="Times New Roman"/>
+                <w:sz w:val="20"/>
+              </w:rPr>
+              <w:t xml:space="preserve">{{ISSUE_DATE}}</w:t>
             </w:r>
           </w:p>
         </w:tc>
@@ -18471,6 +17815,7 @@
                 <w:sz w:val="20"/>
                 <w:szCs w:val="20"/>
               </w:rPr>
+              <w:pageBreakBefore/>
             </w:pPr>
             <w:r>
               <w:rPr>
@@ -21464,7 +20809,7 @@
       </w:tr>
       <w:tr>
         <w:trPr>
-          <w:trHeight w:val="561"/>
+          <w:trHeight w:val="440"/>
         </w:trPr>
         <w:tc>
           <w:tcPr>
@@ -21519,20 +20864,12 @@
             <w:vAlign w:val="center"/>
           </w:tcPr>
           <w:p>
-            <w:pPr>
-              <w:rPr>
-                <w:rFonts w:ascii="Times New Roman" w:hAnsi="Times New Roman" w:cs="Times New Roman"/>
-                <w:sz w:val="20"/>
-                <w:szCs w:val="20"/>
-              </w:rPr>
-            </w:pPr>
-            <w:r>
-              <w:rPr>
-                <w:rFonts w:ascii="Times New Roman" w:hAnsi="Times New Roman" w:cs="Times New Roman"/>
-                <w:sz w:val="20"/>
-                <w:szCs w:val="20"/>
-              </w:rPr>
-              <w:t xml:space="preserve">Drinking Water  </w:t>
+            <w:r>
+              <w:rPr>
+                <w:rFonts w:ascii="Times New Roman" w:hAnsi="Times New Roman"/>
+                <w:sz w:val="20"/>
+              </w:rPr>
+              <w:t xml:space="preserve">{{SAMPLE_NAME}}</w:t>
             </w:r>
           </w:p>
         </w:tc>
@@ -21568,31 +20905,19 @@
             <w:vAlign w:val="center"/>
           </w:tcPr>
           <w:p>
-            <w:pPr>
-              <w:tabs>
-                <w:tab w:val="left" w:pos="673"/>
-              </w:tabs>
-              <w:ind w:right="-108"/>
-              <w:rPr>
-                <w:rFonts w:ascii="Times New Roman" w:hAnsi="Times New Roman" w:cs="Times New Roman"/>
-                <w:sz w:val="20"/>
-                <w:szCs w:val="20"/>
-              </w:rPr>
-            </w:pPr>
-            <w:r>
-              <w:rPr>
-                <w:rFonts w:ascii="Times New Roman" w:hAnsi="Times New Roman" w:cs="Times New Roman"/>
-                <w:sz w:val="20"/>
-                <w:szCs w:val="20"/>
-              </w:rPr>
-              <w:t>642</w:t>
+            <w:r>
+              <w:rPr>
+                <w:rFonts w:ascii="Times New Roman" w:hAnsi="Times New Roman"/>
+                <w:sz w:val="20"/>
+              </w:rPr>
+              <w:t xml:space="preserve">{{REGISTRATION_NO}}</w:t>
             </w:r>
           </w:p>
         </w:tc>
       </w:tr>
       <w:tr>
         <w:trPr>
-          <w:trHeight w:val="561"/>
+          <w:trHeight w:val="440"/>
         </w:trPr>
         <w:tc>
           <w:tcPr>
@@ -21627,25 +20952,12 @@
             <w:vAlign w:val="center"/>
           </w:tcPr>
           <w:p>
-            <w:pPr>
-              <w:tabs>
-                <w:tab w:val="left" w:pos="673"/>
-              </w:tabs>
-              <w:ind w:right="-108"/>
-              <w:rPr>
-                <w:rFonts w:ascii="Times New Roman" w:hAnsi="Times New Roman" w:cs="Times New Roman"/>
-                <w:sz w:val="20"/>
-                <w:szCs w:val="20"/>
-              </w:rPr>
-            </w:pPr>
-            <w:r>
-              <w:rPr>
-                <w:rFonts w:ascii="Times New Roman" w:hAnsi="Times New Roman" w:cs="Times New Roman"/>
-                <w:bCs/>
-                <w:sz w:val="20"/>
-                <w:szCs w:val="20"/>
-              </w:rPr>
-              <w:t>Drinking water</w:t>
+            <w:r>
+              <w:rPr>
+                <w:rFonts w:ascii="Times New Roman" w:hAnsi="Times New Roman"/>
+                <w:sz w:val="20"/>
+              </w:rPr>
+              <w:t xml:space="preserve">{{PRODUCT_CATEGORY}}</w:t>
             </w:r>
           </w:p>
         </w:tc>
@@ -21681,35 +20993,12 @@
             <w:vAlign w:val="center"/>
           </w:tcPr>
           <w:p>
-            <w:pPr>
-              <w:tabs>
-                <w:tab w:val="left" w:pos="673"/>
-              </w:tabs>
-              <w:ind w:right="-108"/>
-              <w:rPr>
-                <w:rFonts w:ascii="Times New Roman" w:hAnsi="Times New Roman" w:cs="Times New Roman"/>
-                <w:bCs/>
-                <w:sz w:val="20"/>
-                <w:szCs w:val="20"/>
-              </w:rPr>
-            </w:pPr>
-            <w:r>
-              <w:rPr>
-                <w:rFonts w:ascii="Times New Roman" w:hAnsi="Times New Roman" w:cs="Times New Roman"/>
-                <w:bCs/>
-                <w:sz w:val="20"/>
-                <w:szCs w:val="20"/>
-              </w:rPr>
-              <w:t>26/08</w:t>
-            </w:r>
-            <w:r>
-              <w:rPr>
-                <w:rFonts w:ascii="Times New Roman" w:hAnsi="Times New Roman" w:cs="Times New Roman"/>
-                <w:bCs/>
-                <w:sz w:val="20"/>
-                <w:szCs w:val="20"/>
-              </w:rPr>
-              <w:t>/2026</w:t>
+            <w:r>
+              <w:rPr>
+                <w:rFonts w:ascii="Times New Roman" w:hAnsi="Times New Roman"/>
+                <w:sz w:val="20"/>
+              </w:rPr>
+              <w:t xml:space="preserve">{{ISSUE_DATE}}</w:t>
             </w:r>
           </w:p>
         </w:tc>
@@ -22341,7 +21630,7 @@
     </w:tbl>
     <w:p>
       <w:pPr>
-        <w:spacing w:after="0" w:line="240" w:lineRule="auto"/>
+        <w:spacing w:before="100" w:after="20" w:line="240" w:lineRule="auto"/>
         <w:ind w:left="-142"/>
         <w:jc w:val="both"/>
         <w:rPr>
@@ -22358,7 +21647,7 @@
           <w:sz w:val="20"/>
           <w:szCs w:val="20"/>
         </w:rPr>
-        <w:t>Remark :</w:t>
+        <w:t>Remark :$5</w:t>
       </w:r>
       <w:r>
         <w:rPr>
@@ -22371,7 +21660,7 @@
     </w:p>
     <w:p>
       <w:pPr>
-        <w:spacing w:line="240" w:lineRule="auto"/>
+        <w:spacing w:before="0" w:after="60" w:line="240" w:lineRule="auto"/>
         <w:ind w:left="-142"/>
         <w:jc w:val="both"/>
         <w:rPr>
@@ -22386,12 +21675,12 @@
           <w:sz w:val="20"/>
           <w:szCs w:val="20"/>
         </w:rPr>
-        <w:t>‘acceptable’  render the water not suitable, but still may be tolerated in the absence of an alternative source but up to the limits           indicated under ‘permissible limit in the absence of alternate source’ in col 7, above which the source will have rejected.</w:t>
+        <w:t>‘acceptable’$5  render the water not suitable, but still may be tolerated in the absence of an alternative source but up to the limits           indicated under ‘permissible limit in the absence of alternate source’ in col 7, above which the source will have rejected.</w:t>
       </w:r>
     </w:p>
     <w:p>
       <w:pPr>
-        <w:spacing w:after="0" w:line="240" w:lineRule="auto"/>
+        <w:spacing w:before="40" w:after="0" w:line="240" w:lineRule="auto"/>
         <w:ind w:left="-567"/>
         <w:jc w:val="both"/>
         <w:rPr>
@@ -22416,7 +21705,7 @@
           <w:sz w:val="20"/>
           <w:szCs w:val="20"/>
         </w:rPr>
-        <w:t>NOTE:</w:t>
+        <w:t>NOTE:$5</w:t>
       </w:r>
       <w:r>
         <w:rPr>
@@ -22437,7 +21726,7 @@
     </w:p>
     <w:p>
       <w:pPr>
-        <w:spacing w:after="0" w:line="240" w:lineRule="auto"/>
+        <w:spacing w:before="0" w:after="0" w:line="240" w:lineRule="auto"/>
         <w:jc w:val="both"/>
         <w:rPr>
           <w:rFonts w:ascii="Times New Roman" w:hAnsi="Times New Roman" w:cs="Times New Roman"/>
@@ -22472,7 +21761,7 @@
     </w:p>
     <w:p>
       <w:pPr>
-        <w:spacing w:after="0" w:line="240" w:lineRule="auto"/>
+        <w:spacing w:before="0" w:after="60" w:line="240" w:lineRule="auto"/>
         <w:jc w:val="both"/>
         <w:rPr>
           <w:rFonts w:ascii="Times New Roman" w:hAnsi="Times New Roman" w:cs="Times New Roman"/>
@@ -22499,7 +21788,7 @@
     </w:p>
     <w:p>
       <w:pPr>
-        <w:spacing w:after="0" w:line="240" w:lineRule="auto"/>
+        <w:spacing w:before="60" w:after="120" w:line="240" w:lineRule="auto"/>
         <w:jc w:val="both"/>
         <w:rPr>
           <w:rFonts w:ascii="Times New Roman" w:hAnsi="Times New Roman" w:cs="Times New Roman"/>
@@ -22525,298 +21814,14 @@
         <w:t>UOM: Unit of Measurement; BLQ-Below limit of Quantification, LOQ:-Limit of Quantification DOE: Date of Expiry; DOM: Date of Manufacturing; NA: Not Applicable.NMT: Not More Than , NLT: Not Less Than</w:t>
       </w:r>
     </w:p>
-    <w:p>
-      <w:pPr>
-        <w:spacing w:after="0" w:line="240" w:lineRule="auto"/>
-        <w:jc w:val="both"/>
-        <w:rPr>
-          <w:rFonts w:ascii="Times New Roman" w:hAnsi="Times New Roman" w:cs="Times New Roman"/>
-          <w:sz w:val="20"/>
-          <w:szCs w:val="20"/>
-        </w:rPr>
-      </w:pPr>
-    </w:p>
-    <w:p>
-      <w:pPr>
-        <w:spacing w:after="0" w:line="240" w:lineRule="auto"/>
-        <w:jc w:val="both"/>
-        <w:rPr>
-          <w:rFonts w:ascii="Times New Roman" w:hAnsi="Times New Roman" w:cs="Times New Roman"/>
-          <w:sz w:val="20"/>
-          <w:szCs w:val="20"/>
-        </w:rPr>
-      </w:pPr>
-    </w:p>
-    <w:p>
-      <w:pPr>
-        <w:spacing w:after="0" w:line="240" w:lineRule="auto"/>
-        <w:jc w:val="both"/>
-        <w:rPr>
-          <w:rFonts w:ascii="Times New Roman" w:hAnsi="Times New Roman" w:cs="Times New Roman"/>
-          <w:sz w:val="20"/>
-          <w:szCs w:val="20"/>
-        </w:rPr>
-      </w:pPr>
-    </w:p>
-    <w:p>
-      <w:pPr>
-        <w:spacing w:after="0" w:line="240" w:lineRule="auto"/>
-        <w:jc w:val="both"/>
-        <w:rPr>
-          <w:rFonts w:ascii="Times New Roman" w:hAnsi="Times New Roman" w:cs="Times New Roman"/>
-          <w:sz w:val="20"/>
-          <w:szCs w:val="20"/>
-        </w:rPr>
-      </w:pPr>
-    </w:p>
-    <w:p>
-      <w:pPr>
-        <w:spacing w:after="0" w:line="240" w:lineRule="auto"/>
-        <w:jc w:val="both"/>
-        <w:rPr>
-          <w:rFonts w:ascii="Times New Roman" w:hAnsi="Times New Roman" w:cs="Times New Roman"/>
-          <w:sz w:val="20"/>
-          <w:szCs w:val="20"/>
-        </w:rPr>
-      </w:pPr>
-    </w:p>
-    <w:p>
-      <w:pPr>
-        <w:spacing w:after="0" w:line="240" w:lineRule="auto"/>
-        <w:jc w:val="both"/>
-        <w:rPr>
-          <w:rFonts w:ascii="Times New Roman" w:hAnsi="Times New Roman" w:cs="Times New Roman"/>
-          <w:sz w:val="20"/>
-          <w:szCs w:val="20"/>
-        </w:rPr>
-      </w:pPr>
-    </w:p>
-    <w:p>
-      <w:pPr>
-        <w:spacing w:after="0" w:line="240" w:lineRule="auto"/>
-        <w:jc w:val="both"/>
-        <w:rPr>
-          <w:rFonts w:ascii="Times New Roman" w:hAnsi="Times New Roman" w:cs="Times New Roman"/>
-          <w:sz w:val="20"/>
-          <w:szCs w:val="20"/>
-        </w:rPr>
-      </w:pPr>
-    </w:p>
-    <w:p>
-      <w:pPr>
-        <w:spacing w:after="0" w:line="240" w:lineRule="auto"/>
-        <w:jc w:val="both"/>
-        <w:rPr>
-          <w:rFonts w:ascii="Times New Roman" w:hAnsi="Times New Roman" w:cs="Times New Roman"/>
-          <w:sz w:val="20"/>
-          <w:szCs w:val="20"/>
-        </w:rPr>
-      </w:pPr>
-    </w:p>
-    <w:p>
-      <w:pPr>
-        <w:spacing w:after="0" w:line="240" w:lineRule="auto"/>
-        <w:rPr>
-          <w:rFonts w:ascii="Times New Roman" w:hAnsi="Times New Roman" w:cs="Times New Roman"/>
-          <w:sz w:val="20"/>
-          <w:szCs w:val="20"/>
-        </w:rPr>
-      </w:pPr>
-    </w:p>
-    <w:p>
-      <w:pPr>
-        <w:spacing w:after="0" w:line="240" w:lineRule="auto"/>
-        <w:ind w:left="720"/>
-        <w:rPr>
-          <w:rFonts w:ascii="Times New Roman" w:hAnsi="Times New Roman" w:cs="Times New Roman"/>
-          <w:sz w:val="20"/>
-          <w:szCs w:val="20"/>
-        </w:rPr>
-      </w:pPr>
-      <w:r>
-        <w:rPr>
-          <w:rFonts w:ascii="Times New Roman" w:hAnsi="Times New Roman" w:cs="Times New Roman"/>
-          <w:b/>
-          <w:bCs/>
-          <w:sz w:val="20"/>
-          <w:szCs w:val="20"/>
-        </w:rPr>
-        <w:t xml:space="preserve">Reviewed By                </w:t>
-      </w:r>
-      <w:r>
-        <w:rPr>
-          <w:rFonts w:ascii="Times New Roman" w:hAnsi="Times New Roman" w:cs="Times New Roman"/>
-          <w:b/>
-          <w:bCs/>
-          <w:sz w:val="20"/>
-          <w:szCs w:val="20"/>
-        </w:rPr>
-        <w:t xml:space="preserve">                            </w:t>
-      </w:r>
-      <w:r>
-        <w:rPr>
-          <w:rFonts w:ascii="Times New Roman" w:hAnsi="Times New Roman" w:cs="Times New Roman"/>
-          <w:b/>
-          <w:bCs/>
-          <w:sz w:val="20"/>
-          <w:szCs w:val="20"/>
-        </w:rPr>
-        <w:t xml:space="preserve"> Authorized Signato</w:t>
-      </w:r>
-      <w:r>
-        <w:rPr>
-          <w:rFonts w:ascii="Times New Roman" w:hAnsi="Times New Roman" w:cs="Times New Roman"/>
-          <w:b/>
-          <w:bCs/>
-          <w:sz w:val="20"/>
-          <w:szCs w:val="20"/>
-        </w:rPr>
-        <w:t xml:space="preserve">ry                            </w:t>
-      </w:r>
-      <w:r>
-        <w:rPr>
-          <w:rFonts w:ascii="Times New Roman" w:hAnsi="Times New Roman" w:cs="Times New Roman"/>
-          <w:b/>
-          <w:bCs/>
-          <w:sz w:val="20"/>
-          <w:szCs w:val="20"/>
-        </w:rPr>
-        <w:t>Authorized Signatory</w:t>
-      </w:r>
-      <w:r>
-        <w:rPr>
-          <w:rFonts w:ascii="Times New Roman" w:hAnsi="Times New Roman" w:cs="Times New Roman"/>
-          <w:sz w:val="20"/>
-          <w:szCs w:val="20"/>
-        </w:rPr>
-        <w:t xml:space="preserve">                                                                                                                                                                                                                                                         Ms. Diksha Dwivedi                                      Ms. Monika Pali        </w:t>
-      </w:r>
-      <w:r>
-        <w:rPr>
-          <w:rFonts w:ascii="Times New Roman" w:hAnsi="Times New Roman" w:cs="Times New Roman"/>
-          <w:sz w:val="20"/>
-          <w:szCs w:val="20"/>
-        </w:rPr>
-        <w:t xml:space="preserve">                             Ms</w:t>
-      </w:r>
-      <w:r>
-        <w:rPr>
-          <w:rFonts w:ascii="Times New Roman" w:hAnsi="Times New Roman" w:cs="Times New Roman"/>
-          <w:sz w:val="20"/>
-          <w:szCs w:val="20"/>
-        </w:rPr>
-        <w:t>. Jyoti pathak</w:t>
-      </w:r>
-    </w:p>
-    <w:p>
-      <w:pPr>
-        <w:spacing w:after="0" w:line="240" w:lineRule="auto"/>
-        <w:ind w:left="720"/>
-        <w:rPr>
-          <w:rFonts w:ascii="Times New Roman" w:hAnsi="Times New Roman" w:cs="Times New Roman"/>
-          <w:sz w:val="20"/>
-          <w:szCs w:val="20"/>
-        </w:rPr>
-      </w:pPr>
-      <w:r>
-        <w:rPr>
-          <w:rFonts w:ascii="Times New Roman" w:hAnsi="Times New Roman" w:cs="Times New Roman"/>
-          <w:sz w:val="20"/>
-          <w:szCs w:val="20"/>
-        </w:rPr>
-        <w:t xml:space="preserve">    </w:t>
-      </w:r>
-      <w:r>
-        <w:rPr>
-          <w:rFonts w:ascii="Times New Roman" w:hAnsi="Times New Roman" w:cs="Times New Roman"/>
-          <w:sz w:val="20"/>
-          <w:szCs w:val="20"/>
-        </w:rPr>
-        <w:t xml:space="preserve">Analyst                         </w:t>
-      </w:r>
-      <w:r>
-        <w:rPr>
-          <w:rFonts w:ascii="Times New Roman" w:hAnsi="Times New Roman" w:cs="Times New Roman"/>
-          <w:sz w:val="20"/>
-          <w:szCs w:val="20"/>
-        </w:rPr>
-        <w:t xml:space="preserve">                          </w:t>
-      </w:r>
-      <w:r>
-        <w:rPr>
-          <w:rFonts w:ascii="Times New Roman" w:hAnsi="Times New Roman" w:cs="Times New Roman"/>
-          <w:sz w:val="20"/>
-          <w:szCs w:val="20"/>
-        </w:rPr>
-        <w:t>Technical Manage</w:t>
-      </w:r>
-      <w:r>
-        <w:rPr>
-          <w:rFonts w:ascii="Times New Roman" w:hAnsi="Times New Roman" w:cs="Times New Roman"/>
-          <w:sz w:val="20"/>
-          <w:szCs w:val="20"/>
-        </w:rPr>
-        <w:t xml:space="preserve">r                          </w:t>
-      </w:r>
-      <w:r>
-        <w:rPr>
-          <w:rFonts w:ascii="Times New Roman" w:hAnsi="Times New Roman" w:cs="Times New Roman"/>
-          <w:sz w:val="20"/>
-          <w:szCs w:val="20"/>
-        </w:rPr>
-        <w:t xml:space="preserve"> Department Head Microbiology</w:t>
-      </w:r>
-    </w:p>
-    <w:p>
-      <w:pPr>
-        <w:spacing w:after="0" w:line="240" w:lineRule="auto"/>
-        <w:rPr>
-          <w:rFonts w:ascii="Times New Roman" w:hAnsi="Times New Roman" w:cs="Times New Roman"/>
-          <w:b/>
-          <w:sz w:val="20"/>
-          <w:szCs w:val="20"/>
-        </w:rPr>
-      </w:pPr>
-    </w:p>
+    {{SIGNATURES_TABLE}}
     <w:p>
       <w:pPr>
         <w:pStyle w:val="ListParagraph"/>
         <w:tabs>
           <w:tab w:val="left" w:pos="8820"/>
         </w:tabs>
-        <w:spacing w:after="0" w:line="240" w:lineRule="auto"/>
-        <w:ind w:left="4068"/>
-        <w:rPr>
-          <w:rFonts w:ascii="Times New Roman" w:hAnsi="Times New Roman" w:cs="Times New Roman"/>
-          <w:b/>
-          <w:sz w:val="20"/>
-          <w:szCs w:val="20"/>
-        </w:rPr>
-      </w:pPr>
-    </w:p>
-    <w:p>
-      <w:pPr>
-        <w:pStyle w:val="ListParagraph"/>
-        <w:tabs>
-          <w:tab w:val="left" w:pos="8820"/>
-        </w:tabs>
-        <w:spacing w:after="0" w:line="240" w:lineRule="auto"/>
-        <w:ind w:left="4068"/>
-        <w:rPr>
-          <w:rFonts w:ascii="Times New Roman" w:hAnsi="Times New Roman" w:cs="Times New Roman"/>
-          <w:b/>
-          <w:sz w:val="20"/>
-          <w:szCs w:val="20"/>
-        </w:rPr>
-      </w:pPr>
-    </w:p>
-    <w:p>
-      <w:pPr>
-        <w:pStyle w:val="ListParagraph"/>
-        <w:tabs>
-          <w:tab w:val="left" w:pos="8820"/>
-        </w:tabs>
-        <w:spacing w:after="0" w:line="240" w:lineRule="auto"/>
+        <w:spacing w:before="120" w:after="0" w:line="240" w:lineRule="auto"/>
         <w:ind w:left="4068"/>
         <w:rPr>
           <w:rFonts w:ascii="Times New Roman" w:hAnsi="Times New Roman" w:cs="Times New Roman"/>
@@ -22835,21 +21840,9 @@
         <w:t xml:space="preserve">  *End of report*</w:t>
       </w:r>
     </w:p>
-    <w:p>
-      <w:pPr>
-        <w:spacing w:after="0" w:line="240" w:lineRule="auto"/>
-        <w:jc w:val="both"/>
-        <w:rPr>
-          <w:rFonts w:ascii="Times New Roman" w:hAnsi="Times New Roman" w:cs="Times New Roman"/>
-          <w:b/>
-          <w:sz w:val="20"/>
-          <w:szCs w:val="20"/>
-        </w:rPr>
-      </w:pPr>
-    </w:p>
     <w:sectPr>
-      <w:headerReference w:type="default" r:id="rId8"/>
-      <w:footerReference w:type="default" r:id="rId9"/>
+      <w:headerReference w:type="default" ns1:id="rId8"/>
+      <w:footerReference w:type="default" ns1:id="rId9"/>
       <w:pgSz w:w="12240" w:h="15840"/>
       <w:pgMar w:top="284" w:right="1134" w:bottom="284" w:left="1134" w:header="283" w:footer="0" w:gutter="0"/>
       <w:pgNumType w:chapStyle="1"/>
@@ -23049,7 +22042,7 @@
 </file>
 
 <file path=word/header1.xml><?xml version="1.0" encoding="utf-8"?>
-<w:hdr xmlns:ve="http://schemas.openxmlformats.org/markup-compatibility/2006" xmlns:o="urn:schemas-microsoft-com:office:office" xmlns:r="http://schemas.openxmlformats.org/officeDocument/2006/relationships" xmlns:m="http://schemas.openxmlformats.org/officeDocument/2006/math" xmlns:v="urn:schemas-microsoft-com:vml" xmlns:wp="http://schemas.openxmlformats.org/drawingml/2006/wordprocessingDrawing" xmlns:w10="urn:schemas-microsoft-com:office:word" xmlns:w="http://schemas.openxmlformats.org/wordprocessingml/2006/main" xmlns:wne="http://schemas.microsoft.com/office/word/2006/wordml">
+<w:hdr xmlns:ns1="http://schemas.openxmlformats.org/drawingml/2006/wordprocessingDrawing" xmlns:ns2="http://schemas.openxmlformats.org/drawingml/2006/main" xmlns:ns3="http://schemas.openxmlformats.org/drawingml/2006/picture" xmlns:ns4="http://schemas.openxmlformats.org/officeDocument/2006/relationships" xmlns:w="http://schemas.openxmlformats.org/wordprocessingml/2006/main">
   <w:p>
     <w:pPr>
       <w:spacing w:after="0" w:line="240" w:lineRule="auto"/>
@@ -23156,49 +22149,49 @@
               <w:lang w:bidi="hi-IN"/>
             </w:rPr>
             <w:drawing>
-              <wp:inline distT="0" distB="0" distL="0" distR="0">
-                <wp:extent cx="1394113" cy="819397"/>
-                <wp:effectExtent l="19050" t="0" r="0" b="0"/>
-                <wp:docPr id="6" name="Picture 1" descr="C:\Users\aiper\Desktop\logo food lab.jpg"/>
-                <wp:cNvGraphicFramePr>
-                  <a:graphicFrameLocks xmlns:a="http://schemas.openxmlformats.org/drawingml/2006/main" noChangeAspect="1"/>
-                </wp:cNvGraphicFramePr>
-                <a:graphic xmlns:a="http://schemas.openxmlformats.org/drawingml/2006/main">
-                  <a:graphicData uri="http://schemas.openxmlformats.org/drawingml/2006/picture">
-                    <pic:pic xmlns:pic="http://schemas.openxmlformats.org/drawingml/2006/picture">
-                      <pic:nvPicPr>
-                        <pic:cNvPr id="0" name="Picture 1" descr="C:\Users\aiper\Desktop\logo food lab.jpg"/>
-                        <pic:cNvPicPr>
-                          <a:picLocks noChangeAspect="1" noChangeArrowheads="1"/>
-                        </pic:cNvPicPr>
-                      </pic:nvPicPr>
-                      <pic:blipFill>
-                        <a:blip r:embed="rId1"/>
-                        <a:srcRect/>
-                        <a:stretch>
-                          <a:fillRect/>
-                        </a:stretch>
-                      </pic:blipFill>
-                      <pic:spPr bwMode="auto">
-                        <a:xfrm>
-                          <a:off x="0" y="0"/>
-                          <a:ext cx="1394115" cy="819398"/>
-                        </a:xfrm>
-                        <a:prstGeom prst="rect">
-                          <a:avLst/>
-                        </a:prstGeom>
-                        <a:noFill/>
-                        <a:ln w="9525">
-                          <a:noFill/>
-                          <a:miter lim="800000"/>
-                          <a:headEnd/>
-                          <a:tailEnd/>
-                        </a:ln>
-                      </pic:spPr>
-                    </pic:pic>
-                  </a:graphicData>
-                </a:graphic>
-              </wp:inline>
+              <ns1:inline distT="0" distB="0" distL="0" distR="0">
+                <ns1:extent cx="1394113" cy="819397"/>
+                <ns1:effectExtent l="19050" t="0" r="0" b="0"/>
+                <ns1:docPr id="6" name="Picture 1" descr="C:\Users\aiper\Desktop\logo food lab.jpg"/>
+                <ns1:cNvGraphicFramePr>
+                  <ns2:graphicFrameLocks noChangeAspect="1"/>
+                </ns1:cNvGraphicFramePr>
+                <ns2:graphic>
+                  <ns2:graphicData uri="http://schemas.openxmlformats.org/drawingml/2006/picture">
+                    <ns3:pic>
+                      <ns3:nvPicPr>
+                        <ns3:cNvPr id="0" name="Picture 1" descr="C:\Users\aiper\Desktop\logo food lab.jpg"/>
+                        <ns3:cNvPicPr>
+                          <ns2:picLocks noChangeAspect="1" noChangeArrowheads="1"/>
+                        </ns3:cNvPicPr>
+                      </ns3:nvPicPr>
+                      <ns3:blipFill>
+                        <ns2:blip ns4:embed="rId1"/>
+                        <ns2:srcRect/>
+                        <ns2:stretch>
+                          <ns2:fillRect/>
+                        </ns2:stretch>
+                      </ns3:blipFill>
+                      <ns3:spPr bwMode="auto">
+                        <ns2:xfrm>
+                          <ns2:off x="0" y="0"/>
+                          <ns2:ext cx="1394115" cy="819398"/>
+                        </ns2:xfrm>
+                        <ns2:prstGeom prst="rect">
+                          <ns2:avLst/>
+                        </ns2:prstGeom>
+                        <ns2:noFill/>
+                        <ns2:ln w="9525">
+                          <ns2:noFill/>
+                          <ns2:miter lim="800000"/>
+                          <ns2:headEnd/>
+                          <ns2:tailEnd/>
+                        </ns2:ln>
+                      </ns3:spPr>
+                    </ns3:pic>
+                  </ns2:graphicData>
+                </ns2:graphic>
+              </ns1:inline>
             </w:drawing>
           </w:r>
         </w:p>
@@ -23362,7 +22355,7 @@
             </w:rPr>
             <w:t>Email ID:</w:t>
           </w:r>
-          <w:hyperlink r:id="rId2" w:history="1">
+          <w:hyperlink ns4:id="rId2" w:history="1">
             <w:r>
               <w:rPr>
                 <w:rStyle w:val="Hyperlink"/>
@@ -23399,7 +22392,7 @@
             </w:rPr>
             <w:t xml:space="preserve">Website: </w:t>
           </w:r>
-          <w:hyperlink r:id="rId3" w:history="1">
+          <w:hyperlink ns4:id="rId3" w:history="1">
             <w:r>
               <w:rPr>
                 <w:rStyle w:val="Hyperlink"/>
@@ -23430,49 +22423,49 @@
               <w:lang w:bidi="hi-IN"/>
             </w:rPr>
             <w:drawing>
-              <wp:inline distT="0" distB="0" distL="0" distR="0">
-                <wp:extent cx="781050" cy="962025"/>
-                <wp:effectExtent l="19050" t="0" r="0" b="0"/>
-                <wp:docPr id="7" name="Picture 1" descr="C:\Users\admin\Pictures\Screenshots\Screenshot 2026-01-15 151735.png"/>
-                <wp:cNvGraphicFramePr>
-                  <a:graphicFrameLocks xmlns:a="http://schemas.openxmlformats.org/drawingml/2006/main" noChangeAspect="1"/>
-                </wp:cNvGraphicFramePr>
-                <a:graphic xmlns:a="http://schemas.openxmlformats.org/drawingml/2006/main">
-                  <a:graphicData uri="http://schemas.openxmlformats.org/drawingml/2006/picture">
-                    <pic:pic xmlns:pic="http://schemas.openxmlformats.org/drawingml/2006/picture">
-                      <pic:nvPicPr>
-                        <pic:cNvPr id="0" name="Picture 1" descr="C:\Users\admin\Pictures\Screenshots\Screenshot 2026-01-15 151735.png"/>
-                        <pic:cNvPicPr>
-                          <a:picLocks noChangeAspect="1" noChangeArrowheads="1"/>
-                        </pic:cNvPicPr>
-                      </pic:nvPicPr>
-                      <pic:blipFill>
-                        <a:blip r:embed="rId4"/>
-                        <a:srcRect/>
-                        <a:stretch>
-                          <a:fillRect/>
-                        </a:stretch>
-                      </pic:blipFill>
-                      <pic:spPr bwMode="auto">
-                        <a:xfrm>
-                          <a:off x="0" y="0"/>
-                          <a:ext cx="785637" cy="967675"/>
-                        </a:xfrm>
-                        <a:prstGeom prst="rect">
-                          <a:avLst/>
-                        </a:prstGeom>
-                        <a:noFill/>
-                        <a:ln w="9525">
-                          <a:noFill/>
-                          <a:miter lim="800000"/>
-                          <a:headEnd/>
-                          <a:tailEnd/>
-                        </a:ln>
-                      </pic:spPr>
-                    </pic:pic>
-                  </a:graphicData>
-                </a:graphic>
-              </wp:inline>
+              <ns1:inline distT="0" distB="0" distL="0" distR="0">
+                <ns1:extent cx="781050" cy="962025"/>
+                <ns1:effectExtent l="19050" t="0" r="0" b="0"/>
+                <ns1:docPr id="7" name="Picture 1" descr="C:\Users\admin\Pictures\Screenshots\Screenshot 2026-01-15 151735.png"/>
+                <ns1:cNvGraphicFramePr>
+                  <ns2:graphicFrameLocks noChangeAspect="1"/>
+                </ns1:cNvGraphicFramePr>
+                <ns2:graphic>
+                  <ns2:graphicData uri="http://schemas.openxmlformats.org/drawingml/2006/picture">
+                    <ns3:pic>
+                      <ns3:nvPicPr>
+                        <ns3:cNvPr id="0" name="Picture 1" descr="C:\Users\admin\Pictures\Screenshots\Screenshot 2026-01-15 151735.png"/>
+                        <ns3:cNvPicPr>
+                          <ns2:picLocks noChangeAspect="1" noChangeArrowheads="1"/>
+                        </ns3:cNvPicPr>
+                      </ns3:nvPicPr>
+                      <ns3:blipFill>
+                        <ns2:blip ns4:embed="rId4"/>
+                        <ns2:srcRect/>
+                        <ns2:stretch>
+                          <ns2:fillRect/>
+                        </ns2:stretch>
+                      </ns3:blipFill>
+                      <ns3:spPr bwMode="auto">
+                        <ns2:xfrm>
+                          <ns2:off x="0" y="0"/>
+                          <ns2:ext cx="785637" cy="967675"/>
+                        </ns2:xfrm>
+                        <ns2:prstGeom prst="rect">
+                          <ns2:avLst/>
+                        </ns2:prstGeom>
+                        <ns2:noFill/>
+                        <ns2:ln w="9525">
+                          <ns2:noFill/>
+                          <ns2:miter lim="800000"/>
+                          <ns2:headEnd/>
+                          <ns2:tailEnd/>
+                        </ns2:ln>
+                      </ns3:spPr>
+                    </ns3:pic>
+                  </ns2:graphicData>
+                </ns2:graphic>
+              </ns1:inline>
             </w:drawing>
           </w:r>
           <w:r>
@@ -23484,49 +22477,49 @@
               <w:lang w:bidi="hi-IN"/>
             </w:rPr>
             <w:drawing>
-              <wp:inline distT="0" distB="0" distL="0" distR="0">
-                <wp:extent cx="781050" cy="923925"/>
-                <wp:effectExtent l="19050" t="0" r="0" b="0"/>
-                <wp:docPr id="8" name="Picture 1" descr="C:\Users\admin\Desktop\Micro Dep\FTL Seal\QR Code NABL Scope New.png"/>
-                <wp:cNvGraphicFramePr>
-                  <a:graphicFrameLocks xmlns:a="http://schemas.openxmlformats.org/drawingml/2006/main" noChangeAspect="1"/>
-                </wp:cNvGraphicFramePr>
-                <a:graphic xmlns:a="http://schemas.openxmlformats.org/drawingml/2006/main">
-                  <a:graphicData uri="http://schemas.openxmlformats.org/drawingml/2006/picture">
-                    <pic:pic xmlns:pic="http://schemas.openxmlformats.org/drawingml/2006/picture">
-                      <pic:nvPicPr>
-                        <pic:cNvPr id="0" name="Picture 1" descr="C:\Users\admin\Desktop\Micro Dep\FTL Seal\QR Code NABL Scope New.png"/>
-                        <pic:cNvPicPr>
-                          <a:picLocks noChangeAspect="1" noChangeArrowheads="1"/>
-                        </pic:cNvPicPr>
-                      </pic:nvPicPr>
-                      <pic:blipFill>
-                        <a:blip r:embed="rId5"/>
-                        <a:srcRect/>
-                        <a:stretch>
-                          <a:fillRect/>
-                        </a:stretch>
-                      </pic:blipFill>
-                      <pic:spPr bwMode="auto">
-                        <a:xfrm>
-                          <a:off x="0" y="0"/>
-                          <a:ext cx="780077" cy="922774"/>
-                        </a:xfrm>
-                        <a:prstGeom prst="rect">
-                          <a:avLst/>
-                        </a:prstGeom>
-                        <a:noFill/>
-                        <a:ln w="9525">
-                          <a:noFill/>
-                          <a:miter lim="800000"/>
-                          <a:headEnd/>
-                          <a:tailEnd/>
-                        </a:ln>
-                      </pic:spPr>
-                    </pic:pic>
-                  </a:graphicData>
-                </a:graphic>
-              </wp:inline>
+              <ns1:inline distT="0" distB="0" distL="0" distR="0">
+                <ns1:extent cx="781050" cy="923925"/>
+                <ns1:effectExtent l="19050" t="0" r="0" b="0"/>
+                <ns1:docPr id="8" name="Picture 1" descr="C:\Users\admin\Desktop\Micro Dep\FTL Seal\QR Code NABL Scope New.png"/>
+                <ns1:cNvGraphicFramePr>
+                  <ns2:graphicFrameLocks noChangeAspect="1"/>
+                </ns1:cNvGraphicFramePr>
+                <ns2:graphic>
+                  <ns2:graphicData uri="http://schemas.openxmlformats.org/drawingml/2006/picture">
+                    <ns3:pic>
+                      <ns3:nvPicPr>
+                        <ns3:cNvPr id="0" name="Picture 1" descr="C:\Users\admin\Desktop\Micro Dep\FTL Seal\QR Code NABL Scope New.png"/>
+                        <ns3:cNvPicPr>
+                          <ns2:picLocks noChangeAspect="1" noChangeArrowheads="1"/>
+                        </ns3:cNvPicPr>
+                      </ns3:nvPicPr>
+                      <ns3:blipFill>
+                        <ns2:blip ns4:embed="rId5"/>
+                        <ns2:srcRect/>
+                        <ns2:stretch>
+                          <ns2:fillRect/>
+                        </ns2:stretch>
+                      </ns3:blipFill>
+                      <ns3:spPr bwMode="auto">
+                        <ns2:xfrm>
+                          <ns2:off x="0" y="0"/>
+                          <ns2:ext cx="780077" cy="922774"/>
+                        </ns2:xfrm>
+                        <ns2:prstGeom prst="rect">
+                          <ns2:avLst/>
+                        </ns2:prstGeom>
+                        <ns2:noFill/>
+                        <ns2:ln w="9525">
+                          <ns2:noFill/>
+                          <ns2:miter lim="800000"/>
+                          <ns2:headEnd/>
+                          <ns2:tailEnd/>
+                        </ns2:ln>
+                      </ns3:spPr>
+                    </ns3:pic>
+                  </ns2:graphicData>
+                </ns2:graphic>
+              </ns1:inline>
             </w:drawing>
           </w:r>
         </w:p>
@@ -23579,46 +22572,7 @@
       </w:rPr>
     </w:pPr>
     <w:r>
-      <w:rPr>
-        <w:rFonts w:ascii="Times New Roman" w:hAnsi="Times New Roman" w:cs="Times New Roman"/>
-        <w:sz w:val="20"/>
-        <w:szCs w:val="20"/>
-      </w:rPr>
-      <w:t>FTL/AIPER/26</w:t>
-    </w:r>
-    <w:r>
-      <w:rPr>
-        <w:rFonts w:ascii="Times New Roman" w:hAnsi="Times New Roman" w:cs="Times New Roman"/>
-        <w:sz w:val="20"/>
-        <w:szCs w:val="20"/>
-      </w:rPr>
-      <w:t>/</w:t>
-    </w:r>
-    <w:r>
-      <w:rPr>
-        <w:rFonts w:ascii="Times New Roman" w:hAnsi="Times New Roman" w:cs="Times New Roman"/>
-        <w:sz w:val="20"/>
-        <w:szCs w:val="20"/>
-      </w:rPr>
-      <w:t xml:space="preserve">1741                                                                                                        </w:t>
-    </w:r>
-    <w:r>
-      <w:rPr>
-        <w:rFonts w:ascii="Times New Roman" w:hAnsi="Times New Roman" w:cs="Times New Roman"/>
-        <w:b/>
-        <w:sz w:val="20"/>
-        <w:szCs w:val="20"/>
-      </w:rPr>
-      <w:t xml:space="preserve">ULR No. </w:t>
-    </w:r>
-    <w:r>
-      <w:rPr>
-        <w:rFonts w:ascii="Times New Roman" w:hAnsi="Times New Roman" w:cs="Times New Roman"/>
-        <w:b/>
-        <w:sz w:val="20"/>
-        <w:lang w:val="en-IN"/>
-      </w:rPr>
-      <w:t>TC-124342600000242</w:t>
+      <w:t xml:space="preserve">{{HEADER_REPORT_LINE}}</w:t>
     </w:r>
   </w:p>
   <w:p>

</xml_diff>

<commit_message>
water iso & general report previewing and generation complete, pending verification
</commit_message>
<xml_diff>
--- a/backend/assets/templates/waterIso10500Template.docx
+++ b/backend/assets/templates/waterIso10500Template.docx
@@ -22574,19 +22574,6 @@
     <w:r>
       <w:t xml:space="preserve">{{HEADER_REPORT_LINE}}</w:t>
     </w:r>
-  </w:p>
-  <w:p>
-    <w:pPr>
-      <w:spacing w:after="0" w:line="240" w:lineRule="auto"/>
-      <w:ind w:right="-312"/>
-      <w:jc w:val="center"/>
-      <w:rPr>
-        <w:rFonts w:ascii="Times New Roman" w:hAnsi="Times New Roman" w:cs="Times New Roman"/>
-        <w:b/>
-        <w:sz w:val="10"/>
-        <w:szCs w:val="10"/>
-      </w:rPr>
-    </w:pPr>
   </w:p>
 </w:hdr>
 </file>

</xml_diff>

<commit_message>
water iso preview fixed, report generation needs fixes
</commit_message>
<xml_diff>
--- a/backend/assets/templates/waterIso10500Template.docx
+++ b/backend/assets/templates/waterIso10500Template.docx
@@ -5,20 +5,20 @@
     <w:tbl>
       <w:tblPr>
         <w:tblStyle w:val="TableGrid"/>
-        <w:tblW w:w="10774" w:type="dxa"/>
-        <w:tblInd w:w="-318" w:type="dxa"/>
+        <w:tblW w:w="11057" w:type="dxa"/>
+        <w:tblInd w:w="-459" w:type="dxa"/>
         <w:tblLook w:val="04A0"/>
       </w:tblPr>
       <w:tblGrid>
-        <w:gridCol w:w="2836"/>
-        <w:gridCol w:w="2977"/>
-        <w:gridCol w:w="2551"/>
-        <w:gridCol w:w="2410"/>
+        <w:gridCol w:w="2911"/>
+        <w:gridCol w:w="3055"/>
+        <w:gridCol w:w="2618"/>
+        <w:gridCol w:w="2473"/>
       </w:tblGrid>
       <w:tr>
         <w:tc>
           <w:tcPr>
-            <w:tcW w:w="10774" w:type="dxa"/>
+            <w:tcW w:w="11057" w:type="dxa"/>
             <w:gridSpan w:val="4"/>
             <w:tcBorders>
               <w:top w:val="single" w:sz="4" w:space="0" w:color="auto"/>
@@ -101,7 +101,7 @@
       <w:tr>
         <w:tc>
           <w:tcPr>
-            <w:tcW w:w="2836" w:type="dxa"/>
+            <w:tcW w:w="2911" w:type="dxa"/>
             <w:tcBorders>
               <w:top w:val="single" w:sz="4" w:space="0" w:color="auto"/>
               <w:left w:val="single" w:sz="4" w:space="0" w:color="auto"/>
@@ -152,7 +152,7 @@
         </w:tc>
         <w:tc>
           <w:tcPr>
-            <w:tcW w:w="2977" w:type="dxa"/>
+            <w:tcW w:w="3055" w:type="dxa"/>
             <w:tcBorders>
               <w:top w:val="single" w:sz="4" w:space="0" w:color="auto"/>
               <w:left w:val="single" w:sz="4" w:space="0" w:color="auto"/>
@@ -174,7 +174,7 @@
         </w:tc>
         <w:tc>
           <w:tcPr>
-            <w:tcW w:w="2551" w:type="dxa"/>
+            <w:tcW w:w="2618" w:type="dxa"/>
             <w:tcBorders>
               <w:top w:val="single" w:sz="4" w:space="0" w:color="auto"/>
               <w:left w:val="single" w:sz="4" w:space="0" w:color="auto"/>
@@ -206,7 +206,7 @@
         </w:tc>
         <w:tc>
           <w:tcPr>
-            <w:tcW w:w="2410" w:type="dxa"/>
+            <w:tcW w:w="2473" w:type="dxa"/>
             <w:tcBorders>
               <w:top w:val="single" w:sz="4" w:space="0" w:color="auto"/>
               <w:left w:val="single" w:sz="4" w:space="0" w:color="auto"/>
@@ -230,7 +230,7 @@
       <w:tr>
         <w:tc>
           <w:tcPr>
-            <w:tcW w:w="2836" w:type="dxa"/>
+            <w:tcW w:w="2911" w:type="dxa"/>
             <w:tcBorders>
               <w:top w:val="single" w:sz="4" w:space="0" w:color="auto"/>
               <w:left w:val="single" w:sz="4" w:space="0" w:color="auto"/>
@@ -262,7 +262,7 @@
         </w:tc>
         <w:tc>
           <w:tcPr>
-            <w:tcW w:w="2977" w:type="dxa"/>
+            <w:tcW w:w="3055" w:type="dxa"/>
             <w:tcBorders>
               <w:top w:val="single" w:sz="4" w:space="0" w:color="auto"/>
               <w:left w:val="single" w:sz="4" w:space="0" w:color="auto"/>
@@ -284,7 +284,7 @@
         </w:tc>
         <w:tc>
           <w:tcPr>
-            <w:tcW w:w="2551" w:type="dxa"/>
+            <w:tcW w:w="2618" w:type="dxa"/>
             <w:tcBorders>
               <w:top w:val="single" w:sz="4" w:space="0" w:color="auto"/>
               <w:left w:val="single" w:sz="4" w:space="0" w:color="auto"/>
@@ -316,7 +316,7 @@
         </w:tc>
         <w:tc>
           <w:tcPr>
-            <w:tcW w:w="2410" w:type="dxa"/>
+            <w:tcW w:w="2473" w:type="dxa"/>
             <w:tcBorders>
               <w:top w:val="single" w:sz="4" w:space="0" w:color="auto"/>
               <w:left w:val="single" w:sz="4" w:space="0" w:color="auto"/>
@@ -340,7 +340,7 @@
       <w:tr>
         <w:tc>
           <w:tcPr>
-            <w:tcW w:w="2836" w:type="dxa"/>
+            <w:tcW w:w="2911" w:type="dxa"/>
             <w:tcBorders>
               <w:top w:val="single" w:sz="4" w:space="0" w:color="auto"/>
               <w:left w:val="single" w:sz="4" w:space="0" w:color="auto"/>
@@ -372,7 +372,7 @@
         </w:tc>
         <w:tc>
           <w:tcPr>
-            <w:tcW w:w="2977" w:type="dxa"/>
+            <w:tcW w:w="3055" w:type="dxa"/>
             <w:tcBorders>
               <w:top w:val="single" w:sz="4" w:space="0" w:color="auto"/>
               <w:left w:val="single" w:sz="4" w:space="0" w:color="auto"/>
@@ -394,7 +394,7 @@
         </w:tc>
         <w:tc>
           <w:tcPr>
-            <w:tcW w:w="2551" w:type="dxa"/>
+            <w:tcW w:w="2618" w:type="dxa"/>
             <w:tcBorders>
               <w:top w:val="single" w:sz="4" w:space="0" w:color="auto"/>
               <w:left w:val="single" w:sz="4" w:space="0" w:color="auto"/>
@@ -426,7 +426,7 @@
         </w:tc>
         <w:tc>
           <w:tcPr>
-            <w:tcW w:w="2410" w:type="dxa"/>
+            <w:tcW w:w="2473" w:type="dxa"/>
             <w:tcBorders>
               <w:top w:val="single" w:sz="4" w:space="0" w:color="auto"/>
               <w:left w:val="single" w:sz="4" w:space="0" w:color="auto"/>
@@ -450,7 +450,7 @@
       <w:tr>
         <w:tc>
           <w:tcPr>
-            <w:tcW w:w="2836" w:type="dxa"/>
+            <w:tcW w:w="2911" w:type="dxa"/>
             <w:tcBorders>
               <w:top w:val="single" w:sz="4" w:space="0" w:color="auto"/>
               <w:left w:val="single" w:sz="4" w:space="0" w:color="auto"/>
@@ -482,7 +482,7 @@
         </w:tc>
         <w:tc>
           <w:tcPr>
-            <w:tcW w:w="2977" w:type="dxa"/>
+            <w:tcW w:w="3055" w:type="dxa"/>
             <w:tcBorders>
               <w:top w:val="single" w:sz="4" w:space="0" w:color="auto"/>
               <w:left w:val="single" w:sz="4" w:space="0" w:color="auto"/>
@@ -504,7 +504,7 @@
         </w:tc>
         <w:tc>
           <w:tcPr>
-            <w:tcW w:w="2551" w:type="dxa"/>
+            <w:tcW w:w="2618" w:type="dxa"/>
             <w:tcBorders>
               <w:top w:val="single" w:sz="4" w:space="0" w:color="auto"/>
               <w:left w:val="single" w:sz="4" w:space="0" w:color="auto"/>
@@ -536,7 +536,7 @@
         </w:tc>
         <w:tc>
           <w:tcPr>
-            <w:tcW w:w="2410" w:type="dxa"/>
+            <w:tcW w:w="2473" w:type="dxa"/>
             <w:tcBorders>
               <w:top w:val="single" w:sz="4" w:space="0" w:color="auto"/>
               <w:left w:val="single" w:sz="4" w:space="0" w:color="auto"/>
@@ -563,7 +563,7 @@
         </w:trPr>
         <w:tc>
           <w:tcPr>
-            <w:tcW w:w="2836" w:type="dxa"/>
+            <w:tcW w:w="2911" w:type="dxa"/>
             <w:tcBorders>
               <w:top w:val="single" w:sz="4" w:space="0" w:color="auto"/>
               <w:left w:val="single" w:sz="4" w:space="0" w:color="auto"/>
@@ -595,7 +595,7 @@
         </w:tc>
         <w:tc>
           <w:tcPr>
-            <w:tcW w:w="2977" w:type="dxa"/>
+            <w:tcW w:w="3055" w:type="dxa"/>
             <w:tcBorders>
               <w:top w:val="single" w:sz="4" w:space="0" w:color="auto"/>
               <w:left w:val="single" w:sz="4" w:space="0" w:color="auto"/>
@@ -617,7 +617,7 @@
         </w:tc>
         <w:tc>
           <w:tcPr>
-            <w:tcW w:w="2551" w:type="dxa"/>
+            <w:tcW w:w="2618" w:type="dxa"/>
             <w:tcBorders>
               <w:top w:val="single" w:sz="4" w:space="0" w:color="auto"/>
               <w:left w:val="single" w:sz="4" w:space="0" w:color="auto"/>
@@ -649,7 +649,7 @@
         </w:tc>
         <w:tc>
           <w:tcPr>
-            <w:tcW w:w="2410" w:type="dxa"/>
+            <w:tcW w:w="2473" w:type="dxa"/>
             <w:tcBorders>
               <w:top w:val="single" w:sz="4" w:space="0" w:color="auto"/>
               <w:left w:val="single" w:sz="4" w:space="0" w:color="auto"/>
@@ -676,7 +676,7 @@
         </w:trPr>
         <w:tc>
           <w:tcPr>
-            <w:tcW w:w="2836" w:type="dxa"/>
+            <w:tcW w:w="2911" w:type="dxa"/>
             <w:tcBorders>
               <w:top w:val="single" w:sz="4" w:space="0" w:color="auto"/>
               <w:left w:val="single" w:sz="4" w:space="0" w:color="auto"/>
@@ -712,7 +712,7 @@
         </w:tc>
         <w:tc>
           <w:tcPr>
-            <w:tcW w:w="2977" w:type="dxa"/>
+            <w:tcW w:w="3055" w:type="dxa"/>
             <w:tcBorders>
               <w:top w:val="single" w:sz="4" w:space="0" w:color="auto"/>
               <w:left w:val="single" w:sz="4" w:space="0" w:color="auto"/>
@@ -734,7 +734,7 @@
         </w:tc>
         <w:tc>
           <w:tcPr>
-            <w:tcW w:w="2551" w:type="dxa"/>
+            <w:tcW w:w="2618" w:type="dxa"/>
             <w:tcBorders>
               <w:top w:val="single" w:sz="4" w:space="0" w:color="auto"/>
               <w:left w:val="single" w:sz="4" w:space="0" w:color="auto"/>
@@ -766,7 +766,7 @@
         </w:tc>
         <w:tc>
           <w:tcPr>
-            <w:tcW w:w="2410" w:type="dxa"/>
+            <w:tcW w:w="2473" w:type="dxa"/>
             <w:tcBorders>
               <w:top w:val="single" w:sz="4" w:space="0" w:color="auto"/>
               <w:left w:val="single" w:sz="4" w:space="0" w:color="auto"/>
@@ -790,7 +790,7 @@
       <w:tr>
         <w:tc>
           <w:tcPr>
-            <w:tcW w:w="2836" w:type="dxa"/>
+            <w:tcW w:w="2911" w:type="dxa"/>
             <w:tcBorders>
               <w:top w:val="single" w:sz="4" w:space="0" w:color="auto"/>
               <w:left w:val="single" w:sz="4" w:space="0" w:color="auto"/>
@@ -823,7 +823,7 @@
         </w:tc>
         <w:tc>
           <w:tcPr>
-            <w:tcW w:w="7938" w:type="dxa"/>
+            <w:tcW w:w="8146" w:type="dxa"/>
             <w:gridSpan w:val="3"/>
             <w:tcBorders>
               <w:top w:val="single" w:sz="4" w:space="0" w:color="auto"/>
@@ -871,24 +871,24 @@
     <w:tbl>
       <w:tblPr>
         <w:tblStyle w:val="TableGrid"/>
-        <w:tblW w:w="5357" w:type="pct"/>
+        <w:tblW w:w="11180" w:type="dxa"/>
         <w:tblInd w:w="-459" w:type="dxa"/>
         <w:tblLayout w:type="fixed"/>
         <w:tblLook w:val="04A0"/>
       </w:tblPr>
       <w:tblGrid>
-        <w:gridCol w:w="989"/>
+        <w:gridCol w:w="1002"/>
         <w:gridCol w:w="11"/>
-        <w:gridCol w:w="1836"/>
-        <w:gridCol w:w="155"/>
-        <w:gridCol w:w="843"/>
-        <w:gridCol w:w="1698"/>
+        <w:gridCol w:w="1860"/>
+        <w:gridCol w:w="157"/>
+        <w:gridCol w:w="854"/>
+        <w:gridCol w:w="1720"/>
         <w:gridCol w:w="15"/>
-        <w:gridCol w:w="135"/>
-        <w:gridCol w:w="2168"/>
-        <w:gridCol w:w="74"/>
-        <w:gridCol w:w="1430"/>
-        <w:gridCol w:w="1561"/>
+        <w:gridCol w:w="137"/>
+        <w:gridCol w:w="2196"/>
+        <w:gridCol w:w="75"/>
+        <w:gridCol w:w="1449"/>
+        <w:gridCol w:w="1704"/>
       </w:tblGrid>
       <w:tr>
         <w:trPr>
@@ -1235,6 +1235,7 @@
           </w:tcPr>
           <w:p>
             <w:pPr>
+              <w:spacing w:after="0"/>
               <w:rPr>
                 <w:rFonts w:ascii="Times New Roman" w:hAnsi="Times New Roman" w:cs="Times New Roman"/>
                 <w:sz w:val="20"/>
@@ -1261,6 +1262,7 @@
           </w:p>
           <w:p>
             <w:pPr>
+              <w:spacing w:after="0"/>
               <w:rPr>
                 <w:rFonts w:ascii="Times New Roman" w:hAnsi="Times New Roman" w:cs="Times New Roman"/>
                 <w:bCs/>
@@ -1287,14 +1289,7 @@
           </w:tcPr>
           <w:p>
             <w:pPr>
-              <w:rPr>
-                <w:rFonts w:ascii="Times New Roman" w:hAnsi="Times New Roman" w:cs="Times New Roman"/>
-                <w:bCs/>
-                <w:sz w:val="20"/>
-                <w:szCs w:val="20"/>
-              </w:rPr>
-            </w:pPr>
-            <w:r>
+              <w:spacing w:after="0"/>
               <w:rPr>
                 <w:rFonts w:ascii="Times New Roman" w:hAnsi="Times New Roman" w:cs="Times New Roman"/>
                 <w:b/>
@@ -1302,17 +1297,7 @@
                 <w:sz w:val="20"/>
                 <w:szCs w:val="20"/>
               </w:rPr>
-              <w:t xml:space="preserve">Group – </w:t>
-            </w:r>
-            <w:r>
-              <w:rPr>
-                <w:rFonts w:ascii="Times New Roman" w:hAnsi="Times New Roman" w:cs="Times New Roman"/>
-                <w:bCs/>
-                <w:sz w:val="20"/>
-                <w:szCs w:val="20"/>
-              </w:rPr>
-              <w:t xml:space="preserve">Water                                     </w:t>
-            </w:r>
+            </w:pPr>
             <w:r>
               <w:rPr>
                 <w:rFonts w:ascii="Times New Roman" w:hAnsi="Times New Roman" w:cs="Times New Roman"/>
@@ -1321,7 +1306,38 @@
                 <w:sz w:val="20"/>
                 <w:szCs w:val="20"/>
               </w:rPr>
-              <w:t xml:space="preserve">Sub Group – </w:t>
+              <w:t xml:space="preserve">Group - </w:t>
+            </w:r>
+            <w:r>
+              <w:rPr>
+                <w:rFonts w:ascii="Times New Roman" w:hAnsi="Times New Roman" w:cs="Times New Roman"/>
+                <w:bCs/>
+                <w:sz w:val="20"/>
+                <w:szCs w:val="20"/>
+              </w:rPr>
+              <w:t>Water</w:t>
+            </w:r>
+          </w:p>
+          <w:p>
+            <w:pPr>
+              <w:spacing w:after="0"/>
+              <w:rPr>
+                <w:rFonts w:ascii="Times New Roman" w:hAnsi="Times New Roman" w:cs="Times New Roman"/>
+                <w:b/>
+                <w:bCs/>
+                <w:sz w:val="20"/>
+                <w:szCs w:val="20"/>
+              </w:rPr>
+            </w:pPr>
+            <w:r>
+              <w:rPr>
+                <w:rFonts w:ascii="Times New Roman" w:hAnsi="Times New Roman" w:cs="Times New Roman"/>
+                <w:b/>
+                <w:bCs/>
+                <w:sz w:val="20"/>
+                <w:szCs w:val="20"/>
+              </w:rPr>
+              <w:t xml:space="preserve">Sub Group - </w:t>
             </w:r>
             <w:r>
               <w:rPr>
@@ -3653,16 +3669,16 @@
     <w:tbl>
       <w:tblPr>
         <w:tblStyle w:val="TableGrid"/>
-        <w:tblW w:w="5357" w:type="pct"/>
+        <w:tblW w:w="11057" w:type="dxa"/>
         <w:tblInd w:w="-459" w:type="dxa"/>
         <w:tblLayout w:type="fixed"/>
         <w:tblLook w:val="04A0"/>
       </w:tblPr>
       <w:tblGrid>
-        <w:gridCol w:w="2835"/>
-        <w:gridCol w:w="2847"/>
-        <w:gridCol w:w="2242"/>
-        <w:gridCol w:w="2991"/>
+        <w:gridCol w:w="2872"/>
+        <w:gridCol w:w="2884"/>
+        <w:gridCol w:w="2271"/>
+        <w:gridCol w:w="3030"/>
       </w:tblGrid>
       <w:tr>
         <w:trPr>
@@ -3863,19 +3879,19 @@
     <w:tbl>
       <w:tblPr>
         <w:tblStyle w:val="TableGrid"/>
-        <w:tblW w:w="5357" w:type="pct"/>
+        <w:tblW w:w="11180" w:type="dxa"/>
         <w:tblInd w:w="-459" w:type="dxa"/>
         <w:tblLayout w:type="fixed"/>
         <w:tblLook w:val="04A0"/>
       </w:tblPr>
       <w:tblGrid>
-        <w:gridCol w:w="1000"/>
-        <w:gridCol w:w="1836"/>
-        <w:gridCol w:w="998"/>
-        <w:gridCol w:w="1849"/>
-        <w:gridCol w:w="2242"/>
-        <w:gridCol w:w="1399"/>
-        <w:gridCol w:w="1591"/>
+        <w:gridCol w:w="1013"/>
+        <w:gridCol w:w="1860"/>
+        <w:gridCol w:w="1011"/>
+        <w:gridCol w:w="1873"/>
+        <w:gridCol w:w="2271"/>
+        <w:gridCol w:w="1417"/>
+        <w:gridCol w:w="1735"/>
       </w:tblGrid>
       <w:tr>
         <w:trPr>
@@ -7123,16 +7139,16 @@
     <w:tbl>
       <w:tblPr>
         <w:tblStyle w:val="TableGrid"/>
-        <w:tblW w:w="5357" w:type="pct"/>
+        <w:tblW w:w="11057" w:type="dxa"/>
         <w:tblInd w:w="-459" w:type="dxa"/>
         <w:tblLayout w:type="fixed"/>
         <w:tblLook w:val="04A0"/>
       </w:tblPr>
       <w:tblGrid>
-        <w:gridCol w:w="2835"/>
-        <w:gridCol w:w="2847"/>
-        <w:gridCol w:w="2242"/>
-        <w:gridCol w:w="2991"/>
+        <w:gridCol w:w="2872"/>
+        <w:gridCol w:w="2884"/>
+        <w:gridCol w:w="2271"/>
+        <w:gridCol w:w="3030"/>
       </w:tblGrid>
       <w:tr>
         <w:trPr>
@@ -7333,24 +7349,24 @@
     <w:tbl>
       <w:tblPr>
         <w:tblStyle w:val="TableGrid"/>
-        <w:tblW w:w="5357" w:type="pct"/>
+        <w:tblW w:w="11180" w:type="dxa"/>
         <w:tblInd w:w="-459" w:type="dxa"/>
         <w:tblLayout w:type="fixed"/>
         <w:tblLook w:val="04A0"/>
       </w:tblPr>
       <w:tblGrid>
-        <w:gridCol w:w="846"/>
-        <w:gridCol w:w="1991"/>
-        <w:gridCol w:w="998"/>
+        <w:gridCol w:w="857"/>
+        <w:gridCol w:w="2017"/>
+        <w:gridCol w:w="1011"/>
         <w:gridCol w:w="17"/>
-        <w:gridCol w:w="1681"/>
-        <w:gridCol w:w="151"/>
+        <w:gridCol w:w="1703"/>
+        <w:gridCol w:w="153"/>
         <w:gridCol w:w="17"/>
-        <w:gridCol w:w="2224"/>
+        <w:gridCol w:w="2253"/>
         <w:gridCol w:w="13"/>
-        <w:gridCol w:w="1417"/>
-        <w:gridCol w:w="65"/>
-        <w:gridCol w:w="1495"/>
+        <w:gridCol w:w="1435"/>
+        <w:gridCol w:w="66"/>
+        <w:gridCol w:w="1638"/>
       </w:tblGrid>
       <w:tr>
         <w:trPr>
@@ -10657,19 +10673,19 @@
     <w:tbl>
       <w:tblPr>
         <w:tblStyle w:val="TableGrid"/>
-        <w:tblW w:w="5357" w:type="pct"/>
+        <w:tblW w:w="11180" w:type="dxa"/>
         <w:tblInd w:w="-459" w:type="dxa"/>
         <w:tblLayout w:type="fixed"/>
         <w:tblLook w:val="04A0"/>
       </w:tblPr>
       <w:tblGrid>
-        <w:gridCol w:w="842"/>
-        <w:gridCol w:w="1991"/>
-        <w:gridCol w:w="998"/>
-        <w:gridCol w:w="1698"/>
-        <w:gridCol w:w="2408"/>
-        <w:gridCol w:w="1563"/>
-        <w:gridCol w:w="1415"/>
+        <w:gridCol w:w="853"/>
+        <w:gridCol w:w="2017"/>
+        <w:gridCol w:w="1011"/>
+        <w:gridCol w:w="1720"/>
+        <w:gridCol w:w="2439"/>
+        <w:gridCol w:w="1583"/>
+        <w:gridCol w:w="1557"/>
       </w:tblGrid>
       <w:tr>
         <w:tc>
@@ -13928,16 +13944,16 @@
     <w:tbl>
       <w:tblPr>
         <w:tblStyle w:val="TableGrid"/>
-        <w:tblW w:w="5357" w:type="pct"/>
+        <w:tblW w:w="11057" w:type="dxa"/>
         <w:tblInd w:w="-459" w:type="dxa"/>
         <w:tblLayout w:type="fixed"/>
         <w:tblLook w:val="04A0"/>
       </w:tblPr>
       <w:tblGrid>
-        <w:gridCol w:w="2834"/>
-        <w:gridCol w:w="2696"/>
-        <w:gridCol w:w="2410"/>
-        <w:gridCol w:w="2975"/>
+        <w:gridCol w:w="2871"/>
+        <w:gridCol w:w="2731"/>
+        <w:gridCol w:w="2441"/>
+        <w:gridCol w:w="3014"/>
       </w:tblGrid>
       <w:tr>
         <w:trPr>
@@ -14138,20 +14154,20 @@
     <w:tbl>
       <w:tblPr>
         <w:tblStyle w:val="TableGrid"/>
-        <w:tblW w:w="5357" w:type="pct"/>
+        <w:tblW w:w="11180" w:type="dxa"/>
         <w:tblInd w:w="-459" w:type="dxa"/>
         <w:tblLayout w:type="fixed"/>
         <w:tblLook w:val="04A0"/>
       </w:tblPr>
       <w:tblGrid>
-        <w:gridCol w:w="843"/>
-        <w:gridCol w:w="1991"/>
-        <w:gridCol w:w="998"/>
-        <w:gridCol w:w="1698"/>
-        <w:gridCol w:w="2410"/>
-        <w:gridCol w:w="1443"/>
-        <w:gridCol w:w="39"/>
-        <w:gridCol w:w="1493"/>
+        <w:gridCol w:w="854"/>
+        <w:gridCol w:w="2017"/>
+        <w:gridCol w:w="1011"/>
+        <w:gridCol w:w="1720"/>
+        <w:gridCol w:w="2441"/>
+        <w:gridCol w:w="1462"/>
+        <w:gridCol w:w="40"/>
+        <w:gridCol w:w="1635"/>
       </w:tblGrid>
       <w:tr>
         <w:tc>
@@ -17780,25 +17796,25 @@
     <w:tbl>
       <w:tblPr>
         <w:tblStyle w:val="TableGrid"/>
-        <w:tblW w:w="5357" w:type="pct"/>
+        <w:tblW w:w="11180" w:type="dxa"/>
         <w:tblInd w:w="-459" w:type="dxa"/>
         <w:tblLayout w:type="fixed"/>
         <w:tblLook w:val="04A0"/>
       </w:tblPr>
       <w:tblGrid>
-        <w:gridCol w:w="842"/>
-        <w:gridCol w:w="1991"/>
-        <w:gridCol w:w="144"/>
-        <w:gridCol w:w="854"/>
-        <w:gridCol w:w="133"/>
-        <w:gridCol w:w="1565"/>
-        <w:gridCol w:w="153"/>
-        <w:gridCol w:w="2118"/>
-        <w:gridCol w:w="140"/>
-        <w:gridCol w:w="1443"/>
+        <w:gridCol w:w="853"/>
+        <w:gridCol w:w="2017"/>
+        <w:gridCol w:w="146"/>
+        <w:gridCol w:w="865"/>
+        <w:gridCol w:w="135"/>
+        <w:gridCol w:w="1585"/>
+        <w:gridCol w:w="155"/>
+        <w:gridCol w:w="2146"/>
+        <w:gridCol w:w="142"/>
+        <w:gridCol w:w="1462"/>
         <w:gridCol w:w="15"/>
         <w:gridCol w:w="24"/>
-        <w:gridCol w:w="1493"/>
+        <w:gridCol w:w="1635"/>
       </w:tblGrid>
       <w:tr>
         <w:tc>
@@ -21012,20 +21028,20 @@
     <w:tbl>
       <w:tblPr>
         <w:tblStyle w:val="TableGrid"/>
-        <w:tblW w:w="5357" w:type="pct"/>
+        <w:tblW w:w="11180" w:type="dxa"/>
         <w:tblInd w:w="-459" w:type="dxa"/>
         <w:tblLayout w:type="fixed"/>
         <w:tblLook w:val="04A0"/>
       </w:tblPr>
       <w:tblGrid>
-        <w:gridCol w:w="702"/>
-        <w:gridCol w:w="140"/>
-        <w:gridCol w:w="2124"/>
+        <w:gridCol w:w="711"/>
+        <w:gridCol w:w="142"/>
+        <w:gridCol w:w="2152"/>
         <w:gridCol w:w="11"/>
-        <w:gridCol w:w="1288"/>
-        <w:gridCol w:w="1417"/>
-        <w:gridCol w:w="2118"/>
-        <w:gridCol w:w="3115"/>
+        <w:gridCol w:w="1305"/>
+        <w:gridCol w:w="1435"/>
+        <w:gridCol w:w="2146"/>
+        <w:gridCol w:w="3278"/>
       </w:tblGrid>
       <w:tr>
         <w:trPr>
@@ -21319,7 +21335,7 @@
                 <w:sz w:val="20"/>
                 <w:szCs w:val="20"/>
               </w:rPr>
-              <w:t xml:space="preserve">Sub Group – </w:t>
+              <w:t xml:space="preserve">Sub Group - </w:t>
             </w:r>
             <w:r>
               <w:rPr>
@@ -21841,12 +21857,14 @@
       </w:r>
     </w:p>
     <w:sectPr>
-      <w:headerReference w:type="default" ns1:id="rId8"/>
+      <w:headerReference w:type="first" ns1:id="rId8"/>
+      <w:headerReference w:type="default" ns1:id="rId12"/>
       <w:footerReference w:type="default" ns1:id="rId9"/>
       <w:pgSz w:w="12240" w:h="15840"/>
       <w:pgMar w:top="284" w:right="1134" w:bottom="284" w:left="1134" w:header="283" w:footer="0" w:gutter="0"/>
       <w:pgNumType w:chapStyle="1"/>
       <w:cols w:space="708"/>
+      <w:titlePg/>
       <w:docGrid w:linePitch="360"/>
     </w:sectPr>
   </w:body>
@@ -22578,6 +22596,33 @@
 </w:hdr>
 </file>
 
+<file path=word/header2.xml><?xml version="1.0" encoding="utf-8"?>
+<w:hdr xmlns:w="http://schemas.openxmlformats.org/wordprocessingml/2006/main" xmlns:r="http://schemas.openxmlformats.org/officeDocument/2006/relationships">
+  <w:p>
+    <w:pPr>
+      <w:spacing w:after="0" w:line="240" w:lineRule="auto"/>
+      <w:ind w:right="-312"/>
+      <w:jc w:val="right"/>
+      <w:rPr>
+        <w:rFonts w:ascii="Times New Roman" w:hAnsi="Times New Roman" w:cs="Times New Roman"/>
+        <w:b/>
+        <w:sz w:val="18"/>
+        <w:szCs w:val="18"/>
+      </w:rPr>
+    </w:pPr>
+    <w:r>
+      <w:rPr>
+        <w:rFonts w:ascii="Times New Roman" w:hAnsi="Times New Roman" w:cs="Times New Roman"/>
+        <w:b/>
+        <w:sz w:val="20"/>
+        <w:szCs w:val="20"/>
+      </w:rPr>
+      <w:t>FTL/AIPER/F/7.8-01</w:t>
+    </w:r>
+  </w:p>
+</w:hdr>
+</file>
+
 <file path=word/numbering.xml><?xml version="1.0" encoding="utf-8"?>
 <w:numbering xmlns:ve="http://schemas.openxmlformats.org/markup-compatibility/2006" xmlns:o="urn:schemas-microsoft-com:office:office" xmlns:r="http://schemas.openxmlformats.org/officeDocument/2006/relationships" xmlns:m="http://schemas.openxmlformats.org/officeDocument/2006/math" xmlns:v="urn:schemas-microsoft-com:vml" xmlns:wp="http://schemas.openxmlformats.org/drawingml/2006/wordprocessingDrawing" xmlns:w10="urn:schemas-microsoft-com:office:word" xmlns:w="http://schemas.openxmlformats.org/wordprocessingml/2006/main" xmlns:wne="http://schemas.microsoft.com/office/word/2006/wordml">
   <w:abstractNum w:abstractNumId="0">
@@ -22592,6 +22637,11 @@
       <w:pPr>
         <w:ind w:left="720" w:hanging="360"/>
       </w:pPr>
+      <w:rPr>
+        <w:rFonts w:ascii="Times New Roman" w:hAnsi="Times New Roman"/>
+        <w:sz w:val="20"/>
+        <w:szCs w:val="20"/>
+      </w:rPr>
     </w:lvl>
     <w:lvl w:ilvl="1" w:tplc="04090019" w:tentative="1">
       <w:start w:val="1"/>
@@ -22601,6 +22651,11 @@
       <w:pPr>
         <w:ind w:left="1440" w:hanging="360"/>
       </w:pPr>
+      <w:rPr>
+        <w:rFonts w:ascii="Times New Roman" w:hAnsi="Times New Roman"/>
+        <w:sz w:val="20"/>
+        <w:szCs w:val="20"/>
+      </w:rPr>
     </w:lvl>
     <w:lvl w:ilvl="2" w:tplc="0409001B" w:tentative="1">
       <w:start w:val="1"/>
@@ -22610,6 +22665,11 @@
       <w:pPr>
         <w:ind w:left="2160" w:hanging="180"/>
       </w:pPr>
+      <w:rPr>
+        <w:rFonts w:ascii="Times New Roman" w:hAnsi="Times New Roman"/>
+        <w:sz w:val="20"/>
+        <w:szCs w:val="20"/>
+      </w:rPr>
     </w:lvl>
     <w:lvl w:ilvl="3" w:tplc="0409000F" w:tentative="1">
       <w:start w:val="1"/>
@@ -22619,6 +22679,11 @@
       <w:pPr>
         <w:ind w:left="2880" w:hanging="360"/>
       </w:pPr>
+      <w:rPr>
+        <w:rFonts w:ascii="Times New Roman" w:hAnsi="Times New Roman"/>
+        <w:sz w:val="20"/>
+        <w:szCs w:val="20"/>
+      </w:rPr>
     </w:lvl>
     <w:lvl w:ilvl="4" w:tplc="04090019" w:tentative="1">
       <w:start w:val="1"/>
@@ -22628,6 +22693,11 @@
       <w:pPr>
         <w:ind w:left="3600" w:hanging="360"/>
       </w:pPr>
+      <w:rPr>
+        <w:rFonts w:ascii="Times New Roman" w:hAnsi="Times New Roman"/>
+        <w:sz w:val="20"/>
+        <w:szCs w:val="20"/>
+      </w:rPr>
     </w:lvl>
     <w:lvl w:ilvl="5" w:tplc="0409001B" w:tentative="1">
       <w:start w:val="1"/>
@@ -22637,6 +22707,11 @@
       <w:pPr>
         <w:ind w:left="4320" w:hanging="180"/>
       </w:pPr>
+      <w:rPr>
+        <w:rFonts w:ascii="Times New Roman" w:hAnsi="Times New Roman"/>
+        <w:sz w:val="20"/>
+        <w:szCs w:val="20"/>
+      </w:rPr>
     </w:lvl>
     <w:lvl w:ilvl="6" w:tplc="0409000F" w:tentative="1">
       <w:start w:val="1"/>
@@ -22646,6 +22721,11 @@
       <w:pPr>
         <w:ind w:left="5040" w:hanging="360"/>
       </w:pPr>
+      <w:rPr>
+        <w:rFonts w:ascii="Times New Roman" w:hAnsi="Times New Roman"/>
+        <w:sz w:val="20"/>
+        <w:szCs w:val="20"/>
+      </w:rPr>
     </w:lvl>
     <w:lvl w:ilvl="7" w:tplc="04090019" w:tentative="1">
       <w:start w:val="1"/>
@@ -22655,6 +22735,11 @@
       <w:pPr>
         <w:ind w:left="5760" w:hanging="360"/>
       </w:pPr>
+      <w:rPr>
+        <w:rFonts w:ascii="Times New Roman" w:hAnsi="Times New Roman"/>
+        <w:sz w:val="20"/>
+        <w:szCs w:val="20"/>
+      </w:rPr>
     </w:lvl>
     <w:lvl w:ilvl="8" w:tplc="0409001B" w:tentative="1">
       <w:start w:val="1"/>
@@ -22664,6 +22749,11 @@
       <w:pPr>
         <w:ind w:left="6480" w:hanging="180"/>
       </w:pPr>
+      <w:rPr>
+        <w:rFonts w:ascii="Times New Roman" w:hAnsi="Times New Roman"/>
+        <w:sz w:val="20"/>
+        <w:szCs w:val="20"/>
+      </w:rPr>
     </w:lvl>
   </w:abstractNum>
   <w:abstractNum w:abstractNumId="1">
@@ -22679,6 +22769,9 @@
         <w:ind w:left="720" w:hanging="360"/>
       </w:pPr>
       <w:rPr>
+        <w:rFonts w:ascii="Times New Roman" w:hAnsi="Times New Roman"/>
+        <w:sz w:val="20"/>
+        <w:szCs w:val="20"/>
         <w:rFonts w:hint="default"/>
       </w:rPr>
     </w:lvl>
@@ -22690,6 +22783,11 @@
       <w:pPr>
         <w:ind w:left="1440" w:hanging="360"/>
       </w:pPr>
+      <w:rPr>
+        <w:rFonts w:ascii="Times New Roman" w:hAnsi="Times New Roman"/>
+        <w:sz w:val="20"/>
+        <w:szCs w:val="20"/>
+      </w:rPr>
     </w:lvl>
     <w:lvl w:ilvl="2" w:tplc="0409001B" w:tentative="1">
       <w:start w:val="1"/>
@@ -22699,6 +22797,11 @@
       <w:pPr>
         <w:ind w:left="2160" w:hanging="180"/>
       </w:pPr>
+      <w:rPr>
+        <w:rFonts w:ascii="Times New Roman" w:hAnsi="Times New Roman"/>
+        <w:sz w:val="20"/>
+        <w:szCs w:val="20"/>
+      </w:rPr>
     </w:lvl>
     <w:lvl w:ilvl="3" w:tplc="0409000F" w:tentative="1">
       <w:start w:val="1"/>
@@ -22708,6 +22811,11 @@
       <w:pPr>
         <w:ind w:left="2880" w:hanging="360"/>
       </w:pPr>
+      <w:rPr>
+        <w:rFonts w:ascii="Times New Roman" w:hAnsi="Times New Roman"/>
+        <w:sz w:val="20"/>
+        <w:szCs w:val="20"/>
+      </w:rPr>
     </w:lvl>
     <w:lvl w:ilvl="4" w:tplc="04090019" w:tentative="1">
       <w:start w:val="1"/>
@@ -22717,6 +22825,11 @@
       <w:pPr>
         <w:ind w:left="3600" w:hanging="360"/>
       </w:pPr>
+      <w:rPr>
+        <w:rFonts w:ascii="Times New Roman" w:hAnsi="Times New Roman"/>
+        <w:sz w:val="20"/>
+        <w:szCs w:val="20"/>
+      </w:rPr>
     </w:lvl>
     <w:lvl w:ilvl="5" w:tplc="0409001B" w:tentative="1">
       <w:start w:val="1"/>
@@ -22726,6 +22839,11 @@
       <w:pPr>
         <w:ind w:left="4320" w:hanging="180"/>
       </w:pPr>
+      <w:rPr>
+        <w:rFonts w:ascii="Times New Roman" w:hAnsi="Times New Roman"/>
+        <w:sz w:val="20"/>
+        <w:szCs w:val="20"/>
+      </w:rPr>
     </w:lvl>
     <w:lvl w:ilvl="6" w:tplc="0409000F" w:tentative="1">
       <w:start w:val="1"/>
@@ -22735,6 +22853,11 @@
       <w:pPr>
         <w:ind w:left="5040" w:hanging="360"/>
       </w:pPr>
+      <w:rPr>
+        <w:rFonts w:ascii="Times New Roman" w:hAnsi="Times New Roman"/>
+        <w:sz w:val="20"/>
+        <w:szCs w:val="20"/>
+      </w:rPr>
     </w:lvl>
     <w:lvl w:ilvl="7" w:tplc="04090019" w:tentative="1">
       <w:start w:val="1"/>
@@ -22744,6 +22867,11 @@
       <w:pPr>
         <w:ind w:left="5760" w:hanging="360"/>
       </w:pPr>
+      <w:rPr>
+        <w:rFonts w:ascii="Times New Roman" w:hAnsi="Times New Roman"/>
+        <w:sz w:val="20"/>
+        <w:szCs w:val="20"/>
+      </w:rPr>
     </w:lvl>
     <w:lvl w:ilvl="8" w:tplc="0409001B" w:tentative="1">
       <w:start w:val="1"/>
@@ -22753,6 +22881,11 @@
       <w:pPr>
         <w:ind w:left="6480" w:hanging="180"/>
       </w:pPr>
+      <w:rPr>
+        <w:rFonts w:ascii="Times New Roman" w:hAnsi="Times New Roman"/>
+        <w:sz w:val="20"/>
+        <w:szCs w:val="20"/>
+      </w:rPr>
     </w:lvl>
   </w:abstractNum>
   <w:abstractNum w:abstractNumId="2">
@@ -22767,6 +22900,11 @@
       <w:pPr>
         <w:ind w:left="678" w:hanging="360"/>
       </w:pPr>
+      <w:rPr>
+        <w:rFonts w:ascii="Times New Roman" w:hAnsi="Times New Roman"/>
+        <w:sz w:val="20"/>
+        <w:szCs w:val="20"/>
+      </w:rPr>
     </w:lvl>
     <w:lvl w:ilvl="1" w:tplc="04090019" w:tentative="1">
       <w:start w:val="1"/>
@@ -22776,6 +22914,11 @@
       <w:pPr>
         <w:ind w:left="1398" w:hanging="360"/>
       </w:pPr>
+      <w:rPr>
+        <w:rFonts w:ascii="Times New Roman" w:hAnsi="Times New Roman"/>
+        <w:sz w:val="20"/>
+        <w:szCs w:val="20"/>
+      </w:rPr>
     </w:lvl>
     <w:lvl w:ilvl="2" w:tplc="0409001B" w:tentative="1">
       <w:start w:val="1"/>
@@ -22785,6 +22928,11 @@
       <w:pPr>
         <w:ind w:left="2118" w:hanging="180"/>
       </w:pPr>
+      <w:rPr>
+        <w:rFonts w:ascii="Times New Roman" w:hAnsi="Times New Roman"/>
+        <w:sz w:val="20"/>
+        <w:szCs w:val="20"/>
+      </w:rPr>
     </w:lvl>
     <w:lvl w:ilvl="3" w:tplc="0409000F" w:tentative="1">
       <w:start w:val="1"/>
@@ -22794,6 +22942,11 @@
       <w:pPr>
         <w:ind w:left="2838" w:hanging="360"/>
       </w:pPr>
+      <w:rPr>
+        <w:rFonts w:ascii="Times New Roman" w:hAnsi="Times New Roman"/>
+        <w:sz w:val="20"/>
+        <w:szCs w:val="20"/>
+      </w:rPr>
     </w:lvl>
     <w:lvl w:ilvl="4" w:tplc="04090019" w:tentative="1">
       <w:start w:val="1"/>
@@ -22803,6 +22956,11 @@
       <w:pPr>
         <w:ind w:left="3558" w:hanging="360"/>
       </w:pPr>
+      <w:rPr>
+        <w:rFonts w:ascii="Times New Roman" w:hAnsi="Times New Roman"/>
+        <w:sz w:val="20"/>
+        <w:szCs w:val="20"/>
+      </w:rPr>
     </w:lvl>
     <w:lvl w:ilvl="5" w:tplc="0409001B" w:tentative="1">
       <w:start w:val="1"/>
@@ -22812,6 +22970,11 @@
       <w:pPr>
         <w:ind w:left="4278" w:hanging="180"/>
       </w:pPr>
+      <w:rPr>
+        <w:rFonts w:ascii="Times New Roman" w:hAnsi="Times New Roman"/>
+        <w:sz w:val="20"/>
+        <w:szCs w:val="20"/>
+      </w:rPr>
     </w:lvl>
     <w:lvl w:ilvl="6" w:tplc="0409000F" w:tentative="1">
       <w:start w:val="1"/>
@@ -22821,6 +22984,11 @@
       <w:pPr>
         <w:ind w:left="4998" w:hanging="360"/>
       </w:pPr>
+      <w:rPr>
+        <w:rFonts w:ascii="Times New Roman" w:hAnsi="Times New Roman"/>
+        <w:sz w:val="20"/>
+        <w:szCs w:val="20"/>
+      </w:rPr>
     </w:lvl>
     <w:lvl w:ilvl="7" w:tplc="04090019" w:tentative="1">
       <w:start w:val="1"/>
@@ -22830,6 +22998,11 @@
       <w:pPr>
         <w:ind w:left="5718" w:hanging="360"/>
       </w:pPr>
+      <w:rPr>
+        <w:rFonts w:ascii="Times New Roman" w:hAnsi="Times New Roman"/>
+        <w:sz w:val="20"/>
+        <w:szCs w:val="20"/>
+      </w:rPr>
     </w:lvl>
     <w:lvl w:ilvl="8" w:tplc="0409001B" w:tentative="1">
       <w:start w:val="1"/>
@@ -22839,6 +23012,11 @@
       <w:pPr>
         <w:ind w:left="6438" w:hanging="180"/>
       </w:pPr>
+      <w:rPr>
+        <w:rFonts w:ascii="Times New Roman" w:hAnsi="Times New Roman"/>
+        <w:sz w:val="20"/>
+        <w:szCs w:val="20"/>
+      </w:rPr>
     </w:lvl>
   </w:abstractNum>
   <w:abstractNum w:abstractNumId="3">
@@ -22853,6 +23031,11 @@
       <w:pPr>
         <w:ind w:left="720" w:hanging="360"/>
       </w:pPr>
+      <w:rPr>
+        <w:rFonts w:ascii="Times New Roman" w:hAnsi="Times New Roman"/>
+        <w:sz w:val="20"/>
+        <w:szCs w:val="20"/>
+      </w:rPr>
     </w:lvl>
     <w:lvl w:ilvl="1" w:tplc="04090019" w:tentative="1">
       <w:start w:val="1"/>
@@ -22862,6 +23045,11 @@
       <w:pPr>
         <w:ind w:left="1440" w:hanging="360"/>
       </w:pPr>
+      <w:rPr>
+        <w:rFonts w:ascii="Times New Roman" w:hAnsi="Times New Roman"/>
+        <w:sz w:val="20"/>
+        <w:szCs w:val="20"/>
+      </w:rPr>
     </w:lvl>
     <w:lvl w:ilvl="2" w:tplc="0409001B" w:tentative="1">
       <w:start w:val="1"/>
@@ -22871,6 +23059,11 @@
       <w:pPr>
         <w:ind w:left="2160" w:hanging="180"/>
       </w:pPr>
+      <w:rPr>
+        <w:rFonts w:ascii="Times New Roman" w:hAnsi="Times New Roman"/>
+        <w:sz w:val="20"/>
+        <w:szCs w:val="20"/>
+      </w:rPr>
     </w:lvl>
     <w:lvl w:ilvl="3" w:tplc="0409000F" w:tentative="1">
       <w:start w:val="1"/>
@@ -22880,6 +23073,11 @@
       <w:pPr>
         <w:ind w:left="2880" w:hanging="360"/>
       </w:pPr>
+      <w:rPr>
+        <w:rFonts w:ascii="Times New Roman" w:hAnsi="Times New Roman"/>
+        <w:sz w:val="20"/>
+        <w:szCs w:val="20"/>
+      </w:rPr>
     </w:lvl>
     <w:lvl w:ilvl="4" w:tplc="04090019" w:tentative="1">
       <w:start w:val="1"/>
@@ -22889,6 +23087,11 @@
       <w:pPr>
         <w:ind w:left="3600" w:hanging="360"/>
       </w:pPr>
+      <w:rPr>
+        <w:rFonts w:ascii="Times New Roman" w:hAnsi="Times New Roman"/>
+        <w:sz w:val="20"/>
+        <w:szCs w:val="20"/>
+      </w:rPr>
     </w:lvl>
     <w:lvl w:ilvl="5" w:tplc="0409001B" w:tentative="1">
       <w:start w:val="1"/>
@@ -22898,6 +23101,11 @@
       <w:pPr>
         <w:ind w:left="4320" w:hanging="180"/>
       </w:pPr>
+      <w:rPr>
+        <w:rFonts w:ascii="Times New Roman" w:hAnsi="Times New Roman"/>
+        <w:sz w:val="20"/>
+        <w:szCs w:val="20"/>
+      </w:rPr>
     </w:lvl>
     <w:lvl w:ilvl="6" w:tplc="0409000F" w:tentative="1">
       <w:start w:val="1"/>
@@ -22907,6 +23115,11 @@
       <w:pPr>
         <w:ind w:left="5040" w:hanging="360"/>
       </w:pPr>
+      <w:rPr>
+        <w:rFonts w:ascii="Times New Roman" w:hAnsi="Times New Roman"/>
+        <w:sz w:val="20"/>
+        <w:szCs w:val="20"/>
+      </w:rPr>
     </w:lvl>
     <w:lvl w:ilvl="7" w:tplc="04090019" w:tentative="1">
       <w:start w:val="1"/>
@@ -22916,6 +23129,11 @@
       <w:pPr>
         <w:ind w:left="5760" w:hanging="360"/>
       </w:pPr>
+      <w:rPr>
+        <w:rFonts w:ascii="Times New Roman" w:hAnsi="Times New Roman"/>
+        <w:sz w:val="20"/>
+        <w:szCs w:val="20"/>
+      </w:rPr>
     </w:lvl>
     <w:lvl w:ilvl="8" w:tplc="0409001B" w:tentative="1">
       <w:start w:val="1"/>
@@ -22925,6 +23143,11 @@
       <w:pPr>
         <w:ind w:left="6480" w:hanging="180"/>
       </w:pPr>
+      <w:rPr>
+        <w:rFonts w:ascii="Times New Roman" w:hAnsi="Times New Roman"/>
+        <w:sz w:val="20"/>
+        <w:szCs w:val="20"/>
+      </w:rPr>
     </w:lvl>
   </w:abstractNum>
   <w:abstractNum w:abstractNumId="4">
@@ -22939,6 +23162,11 @@
       <w:pPr>
         <w:ind w:left="927" w:hanging="360"/>
       </w:pPr>
+      <w:rPr>
+        <w:rFonts w:ascii="Times New Roman" w:hAnsi="Times New Roman"/>
+        <w:sz w:val="20"/>
+        <w:szCs w:val="20"/>
+      </w:rPr>
     </w:lvl>
     <w:lvl w:ilvl="1" w:tplc="04090019" w:tentative="1">
       <w:start w:val="1"/>
@@ -22948,6 +23176,11 @@
       <w:pPr>
         <w:ind w:left="1440" w:hanging="360"/>
       </w:pPr>
+      <w:rPr>
+        <w:rFonts w:ascii="Times New Roman" w:hAnsi="Times New Roman"/>
+        <w:sz w:val="20"/>
+        <w:szCs w:val="20"/>
+      </w:rPr>
     </w:lvl>
     <w:lvl w:ilvl="2" w:tplc="0409001B" w:tentative="1">
       <w:start w:val="1"/>
@@ -22957,6 +23190,11 @@
       <w:pPr>
         <w:ind w:left="2160" w:hanging="180"/>
       </w:pPr>
+      <w:rPr>
+        <w:rFonts w:ascii="Times New Roman" w:hAnsi="Times New Roman"/>
+        <w:sz w:val="20"/>
+        <w:szCs w:val="20"/>
+      </w:rPr>
     </w:lvl>
     <w:lvl w:ilvl="3" w:tplc="0409000F" w:tentative="1">
       <w:start w:val="1"/>
@@ -22966,6 +23204,11 @@
       <w:pPr>
         <w:ind w:left="2880" w:hanging="360"/>
       </w:pPr>
+      <w:rPr>
+        <w:rFonts w:ascii="Times New Roman" w:hAnsi="Times New Roman"/>
+        <w:sz w:val="20"/>
+        <w:szCs w:val="20"/>
+      </w:rPr>
     </w:lvl>
     <w:lvl w:ilvl="4" w:tplc="04090019" w:tentative="1">
       <w:start w:val="1"/>
@@ -22975,6 +23218,11 @@
       <w:pPr>
         <w:ind w:left="3600" w:hanging="360"/>
       </w:pPr>
+      <w:rPr>
+        <w:rFonts w:ascii="Times New Roman" w:hAnsi="Times New Roman"/>
+        <w:sz w:val="20"/>
+        <w:szCs w:val="20"/>
+      </w:rPr>
     </w:lvl>
     <w:lvl w:ilvl="5" w:tplc="0409001B" w:tentative="1">
       <w:start w:val="1"/>
@@ -22984,6 +23232,11 @@
       <w:pPr>
         <w:ind w:left="4320" w:hanging="180"/>
       </w:pPr>
+      <w:rPr>
+        <w:rFonts w:ascii="Times New Roman" w:hAnsi="Times New Roman"/>
+        <w:sz w:val="20"/>
+        <w:szCs w:val="20"/>
+      </w:rPr>
     </w:lvl>
     <w:lvl w:ilvl="6" w:tplc="0409000F" w:tentative="1">
       <w:start w:val="1"/>
@@ -22993,6 +23246,11 @@
       <w:pPr>
         <w:ind w:left="5040" w:hanging="360"/>
       </w:pPr>
+      <w:rPr>
+        <w:rFonts w:ascii="Times New Roman" w:hAnsi="Times New Roman"/>
+        <w:sz w:val="20"/>
+        <w:szCs w:val="20"/>
+      </w:rPr>
     </w:lvl>
     <w:lvl w:ilvl="7" w:tplc="04090019" w:tentative="1">
       <w:start w:val="1"/>
@@ -23002,6 +23260,11 @@
       <w:pPr>
         <w:ind w:left="5760" w:hanging="360"/>
       </w:pPr>
+      <w:rPr>
+        <w:rFonts w:ascii="Times New Roman" w:hAnsi="Times New Roman"/>
+        <w:sz w:val="20"/>
+        <w:szCs w:val="20"/>
+      </w:rPr>
     </w:lvl>
     <w:lvl w:ilvl="8" w:tplc="0409001B" w:tentative="1">
       <w:start w:val="1"/>
@@ -23011,6 +23274,11 @@
       <w:pPr>
         <w:ind w:left="6480" w:hanging="180"/>
       </w:pPr>
+      <w:rPr>
+        <w:rFonts w:ascii="Times New Roman" w:hAnsi="Times New Roman"/>
+        <w:sz w:val="20"/>
+        <w:szCs w:val="20"/>
+      </w:rPr>
     </w:lvl>
   </w:abstractNum>
   <w:abstractNum w:abstractNumId="5">
@@ -23025,6 +23293,11 @@
       <w:pPr>
         <w:ind w:left="927" w:hanging="360"/>
       </w:pPr>
+      <w:rPr>
+        <w:rFonts w:ascii="Times New Roman" w:hAnsi="Times New Roman"/>
+        <w:sz w:val="20"/>
+        <w:szCs w:val="20"/>
+      </w:rPr>
     </w:lvl>
     <w:lvl w:ilvl="1" w:tplc="04090019" w:tentative="1">
       <w:start w:val="1"/>
@@ -23034,6 +23307,11 @@
       <w:pPr>
         <w:ind w:left="1647" w:hanging="360"/>
       </w:pPr>
+      <w:rPr>
+        <w:rFonts w:ascii="Times New Roman" w:hAnsi="Times New Roman"/>
+        <w:sz w:val="20"/>
+        <w:szCs w:val="20"/>
+      </w:rPr>
     </w:lvl>
     <w:lvl w:ilvl="2" w:tplc="0409001B" w:tentative="1">
       <w:start w:val="1"/>
@@ -23043,6 +23321,11 @@
       <w:pPr>
         <w:ind w:left="2367" w:hanging="180"/>
       </w:pPr>
+      <w:rPr>
+        <w:rFonts w:ascii="Times New Roman" w:hAnsi="Times New Roman"/>
+        <w:sz w:val="20"/>
+        <w:szCs w:val="20"/>
+      </w:rPr>
     </w:lvl>
     <w:lvl w:ilvl="3" w:tplc="0409000F" w:tentative="1">
       <w:start w:val="1"/>
@@ -23052,6 +23335,11 @@
       <w:pPr>
         <w:ind w:left="3087" w:hanging="360"/>
       </w:pPr>
+      <w:rPr>
+        <w:rFonts w:ascii="Times New Roman" w:hAnsi="Times New Roman"/>
+        <w:sz w:val="20"/>
+        <w:szCs w:val="20"/>
+      </w:rPr>
     </w:lvl>
     <w:lvl w:ilvl="4" w:tplc="04090019" w:tentative="1">
       <w:start w:val="1"/>
@@ -23061,6 +23349,11 @@
       <w:pPr>
         <w:ind w:left="3807" w:hanging="360"/>
       </w:pPr>
+      <w:rPr>
+        <w:rFonts w:ascii="Times New Roman" w:hAnsi="Times New Roman"/>
+        <w:sz w:val="20"/>
+        <w:szCs w:val="20"/>
+      </w:rPr>
     </w:lvl>
     <w:lvl w:ilvl="5" w:tplc="0409001B" w:tentative="1">
       <w:start w:val="1"/>
@@ -23070,6 +23363,11 @@
       <w:pPr>
         <w:ind w:left="4527" w:hanging="180"/>
       </w:pPr>
+      <w:rPr>
+        <w:rFonts w:ascii="Times New Roman" w:hAnsi="Times New Roman"/>
+        <w:sz w:val="20"/>
+        <w:szCs w:val="20"/>
+      </w:rPr>
     </w:lvl>
     <w:lvl w:ilvl="6" w:tplc="0409000F" w:tentative="1">
       <w:start w:val="1"/>
@@ -23079,6 +23377,11 @@
       <w:pPr>
         <w:ind w:left="5247" w:hanging="360"/>
       </w:pPr>
+      <w:rPr>
+        <w:rFonts w:ascii="Times New Roman" w:hAnsi="Times New Roman"/>
+        <w:sz w:val="20"/>
+        <w:szCs w:val="20"/>
+      </w:rPr>
     </w:lvl>
     <w:lvl w:ilvl="7" w:tplc="04090019" w:tentative="1">
       <w:start w:val="1"/>
@@ -23088,6 +23391,11 @@
       <w:pPr>
         <w:ind w:left="5967" w:hanging="360"/>
       </w:pPr>
+      <w:rPr>
+        <w:rFonts w:ascii="Times New Roman" w:hAnsi="Times New Roman"/>
+        <w:sz w:val="20"/>
+        <w:szCs w:val="20"/>
+      </w:rPr>
     </w:lvl>
     <w:lvl w:ilvl="8" w:tplc="0409001B" w:tentative="1">
       <w:start w:val="1"/>
@@ -23097,6 +23405,11 @@
       <w:pPr>
         <w:ind w:left="6687" w:hanging="180"/>
       </w:pPr>
+      <w:rPr>
+        <w:rFonts w:ascii="Times New Roman" w:hAnsi="Times New Roman"/>
+        <w:sz w:val="20"/>
+        <w:szCs w:val="20"/>
+      </w:rPr>
     </w:lvl>
   </w:abstractNum>
   <w:abstractNum w:abstractNumId="6">
@@ -23111,6 +23424,9 @@
         <w:ind w:left="720" w:hanging="360"/>
       </w:pPr>
       <w:rPr>
+        <w:rFonts w:ascii="Times New Roman" w:hAnsi="Times New Roman"/>
+        <w:sz w:val="20"/>
+        <w:szCs w:val="20"/>
         <w:rFonts w:ascii="Wingdings" w:eastAsiaTheme="minorHAnsi" w:hAnsi="Wingdings" w:cs="Times New Roman" w:hint="default"/>
       </w:rPr>
     </w:lvl>
@@ -23123,6 +23439,9 @@
         <w:ind w:left="1440" w:hanging="360"/>
       </w:pPr>
       <w:rPr>
+        <w:rFonts w:ascii="Times New Roman" w:hAnsi="Times New Roman"/>
+        <w:sz w:val="20"/>
+        <w:szCs w:val="20"/>
         <w:rFonts w:ascii="Courier New" w:hAnsi="Courier New" w:cs="Courier New" w:hint="default"/>
       </w:rPr>
     </w:lvl>
@@ -23135,6 +23454,9 @@
         <w:ind w:left="2160" w:hanging="360"/>
       </w:pPr>
       <w:rPr>
+        <w:rFonts w:ascii="Times New Roman" w:hAnsi="Times New Roman"/>
+        <w:sz w:val="20"/>
+        <w:szCs w:val="20"/>
         <w:rFonts w:ascii="Wingdings" w:hAnsi="Wingdings" w:hint="default"/>
       </w:rPr>
     </w:lvl>
@@ -23147,6 +23469,9 @@
         <w:ind w:left="2880" w:hanging="360"/>
       </w:pPr>
       <w:rPr>
+        <w:rFonts w:ascii="Times New Roman" w:hAnsi="Times New Roman"/>
+        <w:sz w:val="20"/>
+        <w:szCs w:val="20"/>
         <w:rFonts w:ascii="Symbol" w:hAnsi="Symbol" w:hint="default"/>
       </w:rPr>
     </w:lvl>
@@ -23159,6 +23484,9 @@
         <w:ind w:left="3600" w:hanging="360"/>
       </w:pPr>
       <w:rPr>
+        <w:rFonts w:ascii="Times New Roman" w:hAnsi="Times New Roman"/>
+        <w:sz w:val="20"/>
+        <w:szCs w:val="20"/>
         <w:rFonts w:ascii="Courier New" w:hAnsi="Courier New" w:cs="Courier New" w:hint="default"/>
       </w:rPr>
     </w:lvl>
@@ -23171,6 +23499,9 @@
         <w:ind w:left="4320" w:hanging="360"/>
       </w:pPr>
       <w:rPr>
+        <w:rFonts w:ascii="Times New Roman" w:hAnsi="Times New Roman"/>
+        <w:sz w:val="20"/>
+        <w:szCs w:val="20"/>
         <w:rFonts w:ascii="Wingdings" w:hAnsi="Wingdings" w:hint="default"/>
       </w:rPr>
     </w:lvl>
@@ -23183,6 +23514,9 @@
         <w:ind w:left="5040" w:hanging="360"/>
       </w:pPr>
       <w:rPr>
+        <w:rFonts w:ascii="Times New Roman" w:hAnsi="Times New Roman"/>
+        <w:sz w:val="20"/>
+        <w:szCs w:val="20"/>
         <w:rFonts w:ascii="Symbol" w:hAnsi="Symbol" w:hint="default"/>
       </w:rPr>
     </w:lvl>
@@ -23195,6 +23529,9 @@
         <w:ind w:left="5760" w:hanging="360"/>
       </w:pPr>
       <w:rPr>
+        <w:rFonts w:ascii="Times New Roman" w:hAnsi="Times New Roman"/>
+        <w:sz w:val="20"/>
+        <w:szCs w:val="20"/>
         <w:rFonts w:ascii="Courier New" w:hAnsi="Courier New" w:cs="Courier New" w:hint="default"/>
       </w:rPr>
     </w:lvl>
@@ -23207,6 +23544,9 @@
         <w:ind w:left="6480" w:hanging="360"/>
       </w:pPr>
       <w:rPr>
+        <w:rFonts w:ascii="Times New Roman" w:hAnsi="Times New Roman"/>
+        <w:sz w:val="20"/>
+        <w:szCs w:val="20"/>
         <w:rFonts w:ascii="Wingdings" w:hAnsi="Wingdings" w:hint="default"/>
       </w:rPr>
     </w:lvl>
@@ -23223,6 +23563,11 @@
       <w:pPr>
         <w:ind w:left="720" w:hanging="360"/>
       </w:pPr>
+      <w:rPr>
+        <w:rFonts w:ascii="Times New Roman" w:hAnsi="Times New Roman"/>
+        <w:sz w:val="20"/>
+        <w:szCs w:val="20"/>
+      </w:rPr>
     </w:lvl>
     <w:lvl w:ilvl="1" w:tplc="04090019" w:tentative="1">
       <w:start w:val="1"/>
@@ -23232,6 +23577,11 @@
       <w:pPr>
         <w:ind w:left="1440" w:hanging="360"/>
       </w:pPr>
+      <w:rPr>
+        <w:rFonts w:ascii="Times New Roman" w:hAnsi="Times New Roman"/>
+        <w:sz w:val="20"/>
+        <w:szCs w:val="20"/>
+      </w:rPr>
     </w:lvl>
     <w:lvl w:ilvl="2" w:tplc="0409001B" w:tentative="1">
       <w:start w:val="1"/>
@@ -23241,6 +23591,11 @@
       <w:pPr>
         <w:ind w:left="2160" w:hanging="180"/>
       </w:pPr>
+      <w:rPr>
+        <w:rFonts w:ascii="Times New Roman" w:hAnsi="Times New Roman"/>
+        <w:sz w:val="20"/>
+        <w:szCs w:val="20"/>
+      </w:rPr>
     </w:lvl>
     <w:lvl w:ilvl="3" w:tplc="0409000F" w:tentative="1">
       <w:start w:val="1"/>
@@ -23250,6 +23605,11 @@
       <w:pPr>
         <w:ind w:left="2880" w:hanging="360"/>
       </w:pPr>
+      <w:rPr>
+        <w:rFonts w:ascii="Times New Roman" w:hAnsi="Times New Roman"/>
+        <w:sz w:val="20"/>
+        <w:szCs w:val="20"/>
+      </w:rPr>
     </w:lvl>
     <w:lvl w:ilvl="4" w:tplc="04090019" w:tentative="1">
       <w:start w:val="1"/>
@@ -23259,6 +23619,11 @@
       <w:pPr>
         <w:ind w:left="3600" w:hanging="360"/>
       </w:pPr>
+      <w:rPr>
+        <w:rFonts w:ascii="Times New Roman" w:hAnsi="Times New Roman"/>
+        <w:sz w:val="20"/>
+        <w:szCs w:val="20"/>
+      </w:rPr>
     </w:lvl>
     <w:lvl w:ilvl="5" w:tplc="0409001B" w:tentative="1">
       <w:start w:val="1"/>
@@ -23268,6 +23633,11 @@
       <w:pPr>
         <w:ind w:left="4320" w:hanging="180"/>
       </w:pPr>
+      <w:rPr>
+        <w:rFonts w:ascii="Times New Roman" w:hAnsi="Times New Roman"/>
+        <w:sz w:val="20"/>
+        <w:szCs w:val="20"/>
+      </w:rPr>
     </w:lvl>
     <w:lvl w:ilvl="6" w:tplc="0409000F" w:tentative="1">
       <w:start w:val="1"/>
@@ -23277,6 +23647,11 @@
       <w:pPr>
         <w:ind w:left="5040" w:hanging="360"/>
       </w:pPr>
+      <w:rPr>
+        <w:rFonts w:ascii="Times New Roman" w:hAnsi="Times New Roman"/>
+        <w:sz w:val="20"/>
+        <w:szCs w:val="20"/>
+      </w:rPr>
     </w:lvl>
     <w:lvl w:ilvl="7" w:tplc="04090019" w:tentative="1">
       <w:start w:val="1"/>
@@ -23286,6 +23661,11 @@
       <w:pPr>
         <w:ind w:left="5760" w:hanging="360"/>
       </w:pPr>
+      <w:rPr>
+        <w:rFonts w:ascii="Times New Roman" w:hAnsi="Times New Roman"/>
+        <w:sz w:val="20"/>
+        <w:szCs w:val="20"/>
+      </w:rPr>
     </w:lvl>
     <w:lvl w:ilvl="8" w:tplc="0409001B" w:tentative="1">
       <w:start w:val="1"/>
@@ -23295,6 +23675,11 @@
       <w:pPr>
         <w:ind w:left="6480" w:hanging="180"/>
       </w:pPr>
+      <w:rPr>
+        <w:rFonts w:ascii="Times New Roman" w:hAnsi="Times New Roman"/>
+        <w:sz w:val="20"/>
+        <w:szCs w:val="20"/>
+      </w:rPr>
     </w:lvl>
   </w:abstractNum>
   <w:abstractNum w:abstractNumId="8">
@@ -23309,6 +23694,11 @@
       <w:pPr>
         <w:ind w:left="720" w:hanging="360"/>
       </w:pPr>
+      <w:rPr>
+        <w:rFonts w:ascii="Times New Roman" w:hAnsi="Times New Roman"/>
+        <w:sz w:val="20"/>
+        <w:szCs w:val="20"/>
+      </w:rPr>
     </w:lvl>
     <w:lvl w:ilvl="1" w:tplc="04090019" w:tentative="1">
       <w:start w:val="1"/>
@@ -23318,6 +23708,11 @@
       <w:pPr>
         <w:ind w:left="1440" w:hanging="360"/>
       </w:pPr>
+      <w:rPr>
+        <w:rFonts w:ascii="Times New Roman" w:hAnsi="Times New Roman"/>
+        <w:sz w:val="20"/>
+        <w:szCs w:val="20"/>
+      </w:rPr>
     </w:lvl>
     <w:lvl w:ilvl="2" w:tplc="0409001B" w:tentative="1">
       <w:start w:val="1"/>
@@ -23327,6 +23722,11 @@
       <w:pPr>
         <w:ind w:left="2160" w:hanging="180"/>
       </w:pPr>
+      <w:rPr>
+        <w:rFonts w:ascii="Times New Roman" w:hAnsi="Times New Roman"/>
+        <w:sz w:val="20"/>
+        <w:szCs w:val="20"/>
+      </w:rPr>
     </w:lvl>
     <w:lvl w:ilvl="3" w:tplc="0409000F" w:tentative="1">
       <w:start w:val="1"/>
@@ -23336,6 +23736,11 @@
       <w:pPr>
         <w:ind w:left="2880" w:hanging="360"/>
       </w:pPr>
+      <w:rPr>
+        <w:rFonts w:ascii="Times New Roman" w:hAnsi="Times New Roman"/>
+        <w:sz w:val="20"/>
+        <w:szCs w:val="20"/>
+      </w:rPr>
     </w:lvl>
     <w:lvl w:ilvl="4" w:tplc="04090019" w:tentative="1">
       <w:start w:val="1"/>
@@ -23345,6 +23750,11 @@
       <w:pPr>
         <w:ind w:left="3600" w:hanging="360"/>
       </w:pPr>
+      <w:rPr>
+        <w:rFonts w:ascii="Times New Roman" w:hAnsi="Times New Roman"/>
+        <w:sz w:val="20"/>
+        <w:szCs w:val="20"/>
+      </w:rPr>
     </w:lvl>
     <w:lvl w:ilvl="5" w:tplc="0409001B" w:tentative="1">
       <w:start w:val="1"/>
@@ -23354,6 +23764,11 @@
       <w:pPr>
         <w:ind w:left="4320" w:hanging="180"/>
       </w:pPr>
+      <w:rPr>
+        <w:rFonts w:ascii="Times New Roman" w:hAnsi="Times New Roman"/>
+        <w:sz w:val="20"/>
+        <w:szCs w:val="20"/>
+      </w:rPr>
     </w:lvl>
     <w:lvl w:ilvl="6" w:tplc="0409000F" w:tentative="1">
       <w:start w:val="1"/>
@@ -23363,6 +23778,11 @@
       <w:pPr>
         <w:ind w:left="5040" w:hanging="360"/>
       </w:pPr>
+      <w:rPr>
+        <w:rFonts w:ascii="Times New Roman" w:hAnsi="Times New Roman"/>
+        <w:sz w:val="20"/>
+        <w:szCs w:val="20"/>
+      </w:rPr>
     </w:lvl>
     <w:lvl w:ilvl="7" w:tplc="04090019" w:tentative="1">
       <w:start w:val="1"/>
@@ -23372,6 +23792,11 @@
       <w:pPr>
         <w:ind w:left="5760" w:hanging="360"/>
       </w:pPr>
+      <w:rPr>
+        <w:rFonts w:ascii="Times New Roman" w:hAnsi="Times New Roman"/>
+        <w:sz w:val="20"/>
+        <w:szCs w:val="20"/>
+      </w:rPr>
     </w:lvl>
     <w:lvl w:ilvl="8" w:tplc="0409001B" w:tentative="1">
       <w:start w:val="1"/>
@@ -23381,6 +23806,11 @@
       <w:pPr>
         <w:ind w:left="6480" w:hanging="180"/>
       </w:pPr>
+      <w:rPr>
+        <w:rFonts w:ascii="Times New Roman" w:hAnsi="Times New Roman"/>
+        <w:sz w:val="20"/>
+        <w:szCs w:val="20"/>
+      </w:rPr>
     </w:lvl>
   </w:abstractNum>
   <w:abstractNum w:abstractNumId="9">
@@ -23395,6 +23825,11 @@
       <w:pPr>
         <w:ind w:left="785" w:hanging="360"/>
       </w:pPr>
+      <w:rPr>
+        <w:rFonts w:ascii="Times New Roman" w:hAnsi="Times New Roman"/>
+        <w:sz w:val="20"/>
+        <w:szCs w:val="20"/>
+      </w:rPr>
     </w:lvl>
     <w:lvl w:ilvl="1" w:tplc="04090019" w:tentative="1">
       <w:start w:val="1"/>
@@ -23404,6 +23839,11 @@
       <w:pPr>
         <w:ind w:left="1505" w:hanging="360"/>
       </w:pPr>
+      <w:rPr>
+        <w:rFonts w:ascii="Times New Roman" w:hAnsi="Times New Roman"/>
+        <w:sz w:val="20"/>
+        <w:szCs w:val="20"/>
+      </w:rPr>
     </w:lvl>
     <w:lvl w:ilvl="2" w:tplc="0409001B" w:tentative="1">
       <w:start w:val="1"/>
@@ -23413,6 +23853,11 @@
       <w:pPr>
         <w:ind w:left="2225" w:hanging="180"/>
       </w:pPr>
+      <w:rPr>
+        <w:rFonts w:ascii="Times New Roman" w:hAnsi="Times New Roman"/>
+        <w:sz w:val="20"/>
+        <w:szCs w:val="20"/>
+      </w:rPr>
     </w:lvl>
     <w:lvl w:ilvl="3" w:tplc="0409000F" w:tentative="1">
       <w:start w:val="1"/>
@@ -23422,6 +23867,11 @@
       <w:pPr>
         <w:ind w:left="2945" w:hanging="360"/>
       </w:pPr>
+      <w:rPr>
+        <w:rFonts w:ascii="Times New Roman" w:hAnsi="Times New Roman"/>
+        <w:sz w:val="20"/>
+        <w:szCs w:val="20"/>
+      </w:rPr>
     </w:lvl>
     <w:lvl w:ilvl="4" w:tplc="04090019" w:tentative="1">
       <w:start w:val="1"/>
@@ -23431,6 +23881,11 @@
       <w:pPr>
         <w:ind w:left="3665" w:hanging="360"/>
       </w:pPr>
+      <w:rPr>
+        <w:rFonts w:ascii="Times New Roman" w:hAnsi="Times New Roman"/>
+        <w:sz w:val="20"/>
+        <w:szCs w:val="20"/>
+      </w:rPr>
     </w:lvl>
     <w:lvl w:ilvl="5" w:tplc="0409001B" w:tentative="1">
       <w:start w:val="1"/>
@@ -23440,6 +23895,11 @@
       <w:pPr>
         <w:ind w:left="4385" w:hanging="180"/>
       </w:pPr>
+      <w:rPr>
+        <w:rFonts w:ascii="Times New Roman" w:hAnsi="Times New Roman"/>
+        <w:sz w:val="20"/>
+        <w:szCs w:val="20"/>
+      </w:rPr>
     </w:lvl>
     <w:lvl w:ilvl="6" w:tplc="0409000F" w:tentative="1">
       <w:start w:val="1"/>
@@ -23449,6 +23909,11 @@
       <w:pPr>
         <w:ind w:left="5105" w:hanging="360"/>
       </w:pPr>
+      <w:rPr>
+        <w:rFonts w:ascii="Times New Roman" w:hAnsi="Times New Roman"/>
+        <w:sz w:val="20"/>
+        <w:szCs w:val="20"/>
+      </w:rPr>
     </w:lvl>
     <w:lvl w:ilvl="7" w:tplc="04090019" w:tentative="1">
       <w:start w:val="1"/>
@@ -23458,6 +23923,11 @@
       <w:pPr>
         <w:ind w:left="5825" w:hanging="360"/>
       </w:pPr>
+      <w:rPr>
+        <w:rFonts w:ascii="Times New Roman" w:hAnsi="Times New Roman"/>
+        <w:sz w:val="20"/>
+        <w:szCs w:val="20"/>
+      </w:rPr>
     </w:lvl>
     <w:lvl w:ilvl="8" w:tplc="0409001B" w:tentative="1">
       <w:start w:val="1"/>
@@ -23467,6 +23937,11 @@
       <w:pPr>
         <w:ind w:left="6545" w:hanging="180"/>
       </w:pPr>
+      <w:rPr>
+        <w:rFonts w:ascii="Times New Roman" w:hAnsi="Times New Roman"/>
+        <w:sz w:val="20"/>
+        <w:szCs w:val="20"/>
+      </w:rPr>
     </w:lvl>
   </w:abstractNum>
   <w:abstractNum w:abstractNumId="10">
@@ -23481,6 +23956,11 @@
       <w:pPr>
         <w:ind w:left="720" w:hanging="360"/>
       </w:pPr>
+      <w:rPr>
+        <w:rFonts w:ascii="Times New Roman" w:hAnsi="Times New Roman"/>
+        <w:sz w:val="20"/>
+        <w:szCs w:val="20"/>
+      </w:rPr>
     </w:lvl>
     <w:lvl w:ilvl="1" w:tplc="04090019">
       <w:start w:val="1"/>
@@ -23490,6 +23970,11 @@
       <w:pPr>
         <w:ind w:left="1440" w:hanging="360"/>
       </w:pPr>
+      <w:rPr>
+        <w:rFonts w:ascii="Times New Roman" w:hAnsi="Times New Roman"/>
+        <w:sz w:val="20"/>
+        <w:szCs w:val="20"/>
+      </w:rPr>
     </w:lvl>
     <w:lvl w:ilvl="2" w:tplc="0409001B" w:tentative="1">
       <w:start w:val="1"/>
@@ -23499,6 +23984,11 @@
       <w:pPr>
         <w:ind w:left="2160" w:hanging="180"/>
       </w:pPr>
+      <w:rPr>
+        <w:rFonts w:ascii="Times New Roman" w:hAnsi="Times New Roman"/>
+        <w:sz w:val="20"/>
+        <w:szCs w:val="20"/>
+      </w:rPr>
     </w:lvl>
     <w:lvl w:ilvl="3" w:tplc="0409000F" w:tentative="1">
       <w:start w:val="1"/>
@@ -23508,6 +23998,11 @@
       <w:pPr>
         <w:ind w:left="2880" w:hanging="360"/>
       </w:pPr>
+      <w:rPr>
+        <w:rFonts w:ascii="Times New Roman" w:hAnsi="Times New Roman"/>
+        <w:sz w:val="20"/>
+        <w:szCs w:val="20"/>
+      </w:rPr>
     </w:lvl>
     <w:lvl w:ilvl="4" w:tplc="04090019" w:tentative="1">
       <w:start w:val="1"/>
@@ -23517,6 +24012,11 @@
       <w:pPr>
         <w:ind w:left="3600" w:hanging="360"/>
       </w:pPr>
+      <w:rPr>
+        <w:rFonts w:ascii="Times New Roman" w:hAnsi="Times New Roman"/>
+        <w:sz w:val="20"/>
+        <w:szCs w:val="20"/>
+      </w:rPr>
     </w:lvl>
     <w:lvl w:ilvl="5" w:tplc="0409001B" w:tentative="1">
       <w:start w:val="1"/>
@@ -23526,6 +24026,11 @@
       <w:pPr>
         <w:ind w:left="4320" w:hanging="180"/>
       </w:pPr>
+      <w:rPr>
+        <w:rFonts w:ascii="Times New Roman" w:hAnsi="Times New Roman"/>
+        <w:sz w:val="20"/>
+        <w:szCs w:val="20"/>
+      </w:rPr>
     </w:lvl>
     <w:lvl w:ilvl="6" w:tplc="0409000F" w:tentative="1">
       <w:start w:val="1"/>
@@ -23535,6 +24040,11 @@
       <w:pPr>
         <w:ind w:left="5040" w:hanging="360"/>
       </w:pPr>
+      <w:rPr>
+        <w:rFonts w:ascii="Times New Roman" w:hAnsi="Times New Roman"/>
+        <w:sz w:val="20"/>
+        <w:szCs w:val="20"/>
+      </w:rPr>
     </w:lvl>
     <w:lvl w:ilvl="7" w:tplc="04090019" w:tentative="1">
       <w:start w:val="1"/>
@@ -23544,6 +24054,11 @@
       <w:pPr>
         <w:ind w:left="5760" w:hanging="360"/>
       </w:pPr>
+      <w:rPr>
+        <w:rFonts w:ascii="Times New Roman" w:hAnsi="Times New Roman"/>
+        <w:sz w:val="20"/>
+        <w:szCs w:val="20"/>
+      </w:rPr>
     </w:lvl>
     <w:lvl w:ilvl="8" w:tplc="0409001B" w:tentative="1">
       <w:start w:val="1"/>
@@ -23553,6 +24068,11 @@
       <w:pPr>
         <w:ind w:left="6480" w:hanging="180"/>
       </w:pPr>
+      <w:rPr>
+        <w:rFonts w:ascii="Times New Roman" w:hAnsi="Times New Roman"/>
+        <w:sz w:val="20"/>
+        <w:szCs w:val="20"/>
+      </w:rPr>
     </w:lvl>
   </w:abstractNum>
   <w:abstractNum w:abstractNumId="11">
@@ -23567,6 +24087,11 @@
       <w:pPr>
         <w:ind w:left="720" w:hanging="360"/>
       </w:pPr>
+      <w:rPr>
+        <w:rFonts w:ascii="Times New Roman" w:hAnsi="Times New Roman"/>
+        <w:sz w:val="20"/>
+        <w:szCs w:val="20"/>
+      </w:rPr>
     </w:lvl>
     <w:lvl w:ilvl="1" w:tplc="04090019">
       <w:start w:val="1"/>
@@ -23576,6 +24101,11 @@
       <w:pPr>
         <w:ind w:left="1440" w:hanging="360"/>
       </w:pPr>
+      <w:rPr>
+        <w:rFonts w:ascii="Times New Roman" w:hAnsi="Times New Roman"/>
+        <w:sz w:val="20"/>
+        <w:szCs w:val="20"/>
+      </w:rPr>
     </w:lvl>
     <w:lvl w:ilvl="2" w:tplc="0409001B" w:tentative="1">
       <w:start w:val="1"/>
@@ -23585,6 +24115,11 @@
       <w:pPr>
         <w:ind w:left="2160" w:hanging="180"/>
       </w:pPr>
+      <w:rPr>
+        <w:rFonts w:ascii="Times New Roman" w:hAnsi="Times New Roman"/>
+        <w:sz w:val="20"/>
+        <w:szCs w:val="20"/>
+      </w:rPr>
     </w:lvl>
     <w:lvl w:ilvl="3" w:tplc="0409000F" w:tentative="1">
       <w:start w:val="1"/>
@@ -23594,6 +24129,11 @@
       <w:pPr>
         <w:ind w:left="2880" w:hanging="360"/>
       </w:pPr>
+      <w:rPr>
+        <w:rFonts w:ascii="Times New Roman" w:hAnsi="Times New Roman"/>
+        <w:sz w:val="20"/>
+        <w:szCs w:val="20"/>
+      </w:rPr>
     </w:lvl>
     <w:lvl w:ilvl="4" w:tplc="04090019" w:tentative="1">
       <w:start w:val="1"/>
@@ -23603,6 +24143,11 @@
       <w:pPr>
         <w:ind w:left="3600" w:hanging="360"/>
       </w:pPr>
+      <w:rPr>
+        <w:rFonts w:ascii="Times New Roman" w:hAnsi="Times New Roman"/>
+        <w:sz w:val="20"/>
+        <w:szCs w:val="20"/>
+      </w:rPr>
     </w:lvl>
     <w:lvl w:ilvl="5" w:tplc="0409001B" w:tentative="1">
       <w:start w:val="1"/>
@@ -23612,6 +24157,11 @@
       <w:pPr>
         <w:ind w:left="4320" w:hanging="180"/>
       </w:pPr>
+      <w:rPr>
+        <w:rFonts w:ascii="Times New Roman" w:hAnsi="Times New Roman"/>
+        <w:sz w:val="20"/>
+        <w:szCs w:val="20"/>
+      </w:rPr>
     </w:lvl>
     <w:lvl w:ilvl="6" w:tplc="0409000F" w:tentative="1">
       <w:start w:val="1"/>
@@ -23621,6 +24171,11 @@
       <w:pPr>
         <w:ind w:left="5040" w:hanging="360"/>
       </w:pPr>
+      <w:rPr>
+        <w:rFonts w:ascii="Times New Roman" w:hAnsi="Times New Roman"/>
+        <w:sz w:val="20"/>
+        <w:szCs w:val="20"/>
+      </w:rPr>
     </w:lvl>
     <w:lvl w:ilvl="7" w:tplc="04090019" w:tentative="1">
       <w:start w:val="1"/>
@@ -23630,6 +24185,11 @@
       <w:pPr>
         <w:ind w:left="5760" w:hanging="360"/>
       </w:pPr>
+      <w:rPr>
+        <w:rFonts w:ascii="Times New Roman" w:hAnsi="Times New Roman"/>
+        <w:sz w:val="20"/>
+        <w:szCs w:val="20"/>
+      </w:rPr>
     </w:lvl>
     <w:lvl w:ilvl="8" w:tplc="0409001B" w:tentative="1">
       <w:start w:val="1"/>
@@ -23639,6 +24199,11 @@
       <w:pPr>
         <w:ind w:left="6480" w:hanging="180"/>
       </w:pPr>
+      <w:rPr>
+        <w:rFonts w:ascii="Times New Roman" w:hAnsi="Times New Roman"/>
+        <w:sz w:val="20"/>
+        <w:szCs w:val="20"/>
+      </w:rPr>
     </w:lvl>
   </w:abstractNum>
   <w:abstractNum w:abstractNumId="12">
@@ -23653,6 +24218,9 @@
         <w:ind w:left="4068" w:hanging="360"/>
       </w:pPr>
       <w:rPr>
+        <w:rFonts w:ascii="Times New Roman" w:hAnsi="Times New Roman"/>
+        <w:sz w:val="20"/>
+        <w:szCs w:val="20"/>
         <w:rFonts w:ascii="Verdana" w:eastAsia="Times New Roman" w:hAnsi="Verdana" w:cs="Times New Roman" w:hint="default"/>
       </w:rPr>
     </w:lvl>
@@ -23665,6 +24233,9 @@
         <w:ind w:left="4788" w:hanging="360"/>
       </w:pPr>
       <w:rPr>
+        <w:rFonts w:ascii="Times New Roman" w:hAnsi="Times New Roman"/>
+        <w:sz w:val="20"/>
+        <w:szCs w:val="20"/>
         <w:rFonts w:ascii="Courier New" w:hAnsi="Courier New" w:cs="Courier New" w:hint="default"/>
       </w:rPr>
     </w:lvl>
@@ -23677,6 +24248,9 @@
         <w:ind w:left="5508" w:hanging="360"/>
       </w:pPr>
       <w:rPr>
+        <w:rFonts w:ascii="Times New Roman" w:hAnsi="Times New Roman"/>
+        <w:sz w:val="20"/>
+        <w:szCs w:val="20"/>
         <w:rFonts w:ascii="Wingdings" w:hAnsi="Wingdings" w:hint="default"/>
       </w:rPr>
     </w:lvl>
@@ -23689,6 +24263,9 @@
         <w:ind w:left="6228" w:hanging="360"/>
       </w:pPr>
       <w:rPr>
+        <w:rFonts w:ascii="Times New Roman" w:hAnsi="Times New Roman"/>
+        <w:sz w:val="20"/>
+        <w:szCs w:val="20"/>
         <w:rFonts w:ascii="Symbol" w:hAnsi="Symbol" w:hint="default"/>
       </w:rPr>
     </w:lvl>
@@ -23701,6 +24278,9 @@
         <w:ind w:left="6948" w:hanging="360"/>
       </w:pPr>
       <w:rPr>
+        <w:rFonts w:ascii="Times New Roman" w:hAnsi="Times New Roman"/>
+        <w:sz w:val="20"/>
+        <w:szCs w:val="20"/>
         <w:rFonts w:ascii="Courier New" w:hAnsi="Courier New" w:cs="Courier New" w:hint="default"/>
       </w:rPr>
     </w:lvl>
@@ -23713,6 +24293,9 @@
         <w:ind w:left="7668" w:hanging="360"/>
       </w:pPr>
       <w:rPr>
+        <w:rFonts w:ascii="Times New Roman" w:hAnsi="Times New Roman"/>
+        <w:sz w:val="20"/>
+        <w:szCs w:val="20"/>
         <w:rFonts w:ascii="Wingdings" w:hAnsi="Wingdings" w:hint="default"/>
       </w:rPr>
     </w:lvl>
@@ -23725,6 +24308,9 @@
         <w:ind w:left="8388" w:hanging="360"/>
       </w:pPr>
       <w:rPr>
+        <w:rFonts w:ascii="Times New Roman" w:hAnsi="Times New Roman"/>
+        <w:sz w:val="20"/>
+        <w:szCs w:val="20"/>
         <w:rFonts w:ascii="Symbol" w:hAnsi="Symbol" w:hint="default"/>
       </w:rPr>
     </w:lvl>
@@ -23737,6 +24323,9 @@
         <w:ind w:left="9108" w:hanging="360"/>
       </w:pPr>
       <w:rPr>
+        <w:rFonts w:ascii="Times New Roman" w:hAnsi="Times New Roman"/>
+        <w:sz w:val="20"/>
+        <w:szCs w:val="20"/>
         <w:rFonts w:ascii="Courier New" w:hAnsi="Courier New" w:cs="Courier New" w:hint="default"/>
       </w:rPr>
     </w:lvl>
@@ -23749,6 +24338,9 @@
         <w:ind w:left="9828" w:hanging="360"/>
       </w:pPr>
       <w:rPr>
+        <w:rFonts w:ascii="Times New Roman" w:hAnsi="Times New Roman"/>
+        <w:sz w:val="20"/>
+        <w:szCs w:val="20"/>
         <w:rFonts w:ascii="Wingdings" w:hAnsi="Wingdings" w:hint="default"/>
       </w:rPr>
     </w:lvl>
@@ -23765,6 +24357,11 @@
       <w:pPr>
         <w:ind w:left="720" w:hanging="360"/>
       </w:pPr>
+      <w:rPr>
+        <w:rFonts w:ascii="Times New Roman" w:hAnsi="Times New Roman"/>
+        <w:sz w:val="20"/>
+        <w:szCs w:val="20"/>
+      </w:rPr>
     </w:lvl>
     <w:lvl w:ilvl="1" w:tplc="04090019" w:tentative="1">
       <w:start w:val="1"/>
@@ -23774,6 +24371,11 @@
       <w:pPr>
         <w:ind w:left="1440" w:hanging="360"/>
       </w:pPr>
+      <w:rPr>
+        <w:rFonts w:ascii="Times New Roman" w:hAnsi="Times New Roman"/>
+        <w:sz w:val="20"/>
+        <w:szCs w:val="20"/>
+      </w:rPr>
     </w:lvl>
     <w:lvl w:ilvl="2" w:tplc="0409001B" w:tentative="1">
       <w:start w:val="1"/>
@@ -23783,6 +24385,11 @@
       <w:pPr>
         <w:ind w:left="2160" w:hanging="180"/>
       </w:pPr>
+      <w:rPr>
+        <w:rFonts w:ascii="Times New Roman" w:hAnsi="Times New Roman"/>
+        <w:sz w:val="20"/>
+        <w:szCs w:val="20"/>
+      </w:rPr>
     </w:lvl>
     <w:lvl w:ilvl="3" w:tplc="0409000F" w:tentative="1">
       <w:start w:val="1"/>
@@ -23792,6 +24399,11 @@
       <w:pPr>
         <w:ind w:left="2880" w:hanging="360"/>
       </w:pPr>
+      <w:rPr>
+        <w:rFonts w:ascii="Times New Roman" w:hAnsi="Times New Roman"/>
+        <w:sz w:val="20"/>
+        <w:szCs w:val="20"/>
+      </w:rPr>
     </w:lvl>
     <w:lvl w:ilvl="4" w:tplc="04090019" w:tentative="1">
       <w:start w:val="1"/>
@@ -23801,6 +24413,11 @@
       <w:pPr>
         <w:ind w:left="3600" w:hanging="360"/>
       </w:pPr>
+      <w:rPr>
+        <w:rFonts w:ascii="Times New Roman" w:hAnsi="Times New Roman"/>
+        <w:sz w:val="20"/>
+        <w:szCs w:val="20"/>
+      </w:rPr>
     </w:lvl>
     <w:lvl w:ilvl="5" w:tplc="0409001B" w:tentative="1">
       <w:start w:val="1"/>
@@ -23810,6 +24427,11 @@
       <w:pPr>
         <w:ind w:left="4320" w:hanging="180"/>
       </w:pPr>
+      <w:rPr>
+        <w:rFonts w:ascii="Times New Roman" w:hAnsi="Times New Roman"/>
+        <w:sz w:val="20"/>
+        <w:szCs w:val="20"/>
+      </w:rPr>
     </w:lvl>
     <w:lvl w:ilvl="6" w:tplc="0409000F" w:tentative="1">
       <w:start w:val="1"/>
@@ -23819,6 +24441,11 @@
       <w:pPr>
         <w:ind w:left="5040" w:hanging="360"/>
       </w:pPr>
+      <w:rPr>
+        <w:rFonts w:ascii="Times New Roman" w:hAnsi="Times New Roman"/>
+        <w:sz w:val="20"/>
+        <w:szCs w:val="20"/>
+      </w:rPr>
     </w:lvl>
     <w:lvl w:ilvl="7" w:tplc="04090019" w:tentative="1">
       <w:start w:val="1"/>
@@ -23828,6 +24455,11 @@
       <w:pPr>
         <w:ind w:left="5760" w:hanging="360"/>
       </w:pPr>
+      <w:rPr>
+        <w:rFonts w:ascii="Times New Roman" w:hAnsi="Times New Roman"/>
+        <w:sz w:val="20"/>
+        <w:szCs w:val="20"/>
+      </w:rPr>
     </w:lvl>
     <w:lvl w:ilvl="8" w:tplc="0409001B" w:tentative="1">
       <w:start w:val="1"/>
@@ -23837,6 +24469,11 @@
       <w:pPr>
         <w:ind w:left="6480" w:hanging="180"/>
       </w:pPr>
+      <w:rPr>
+        <w:rFonts w:ascii="Times New Roman" w:hAnsi="Times New Roman"/>
+        <w:sz w:val="20"/>
+        <w:szCs w:val="20"/>
+      </w:rPr>
     </w:lvl>
   </w:abstractNum>
   <w:abstractNum w:abstractNumId="14">
@@ -23851,6 +24488,11 @@
       <w:pPr>
         <w:ind w:left="1068" w:hanging="360"/>
       </w:pPr>
+      <w:rPr>
+        <w:rFonts w:ascii="Times New Roman" w:hAnsi="Times New Roman"/>
+        <w:sz w:val="20"/>
+        <w:szCs w:val="20"/>
+      </w:rPr>
     </w:lvl>
     <w:lvl w:ilvl="1" w:tplc="04090019" w:tentative="1">
       <w:start w:val="1"/>
@@ -23860,6 +24502,11 @@
       <w:pPr>
         <w:ind w:left="1788" w:hanging="360"/>
       </w:pPr>
+      <w:rPr>
+        <w:rFonts w:ascii="Times New Roman" w:hAnsi="Times New Roman"/>
+        <w:sz w:val="20"/>
+        <w:szCs w:val="20"/>
+      </w:rPr>
     </w:lvl>
     <w:lvl w:ilvl="2" w:tplc="0409001B" w:tentative="1">
       <w:start w:val="1"/>
@@ -23869,6 +24516,11 @@
       <w:pPr>
         <w:ind w:left="2508" w:hanging="180"/>
       </w:pPr>
+      <w:rPr>
+        <w:rFonts w:ascii="Times New Roman" w:hAnsi="Times New Roman"/>
+        <w:sz w:val="20"/>
+        <w:szCs w:val="20"/>
+      </w:rPr>
     </w:lvl>
     <w:lvl w:ilvl="3" w:tplc="0409000F" w:tentative="1">
       <w:start w:val="1"/>
@@ -23878,6 +24530,11 @@
       <w:pPr>
         <w:ind w:left="3228" w:hanging="360"/>
       </w:pPr>
+      <w:rPr>
+        <w:rFonts w:ascii="Times New Roman" w:hAnsi="Times New Roman"/>
+        <w:sz w:val="20"/>
+        <w:szCs w:val="20"/>
+      </w:rPr>
     </w:lvl>
     <w:lvl w:ilvl="4" w:tplc="04090019" w:tentative="1">
       <w:start w:val="1"/>
@@ -23887,6 +24544,11 @@
       <w:pPr>
         <w:ind w:left="3948" w:hanging="360"/>
       </w:pPr>
+      <w:rPr>
+        <w:rFonts w:ascii="Times New Roman" w:hAnsi="Times New Roman"/>
+        <w:sz w:val="20"/>
+        <w:szCs w:val="20"/>
+      </w:rPr>
     </w:lvl>
     <w:lvl w:ilvl="5" w:tplc="0409001B" w:tentative="1">
       <w:start w:val="1"/>
@@ -23896,6 +24558,11 @@
       <w:pPr>
         <w:ind w:left="4668" w:hanging="180"/>
       </w:pPr>
+      <w:rPr>
+        <w:rFonts w:ascii="Times New Roman" w:hAnsi="Times New Roman"/>
+        <w:sz w:val="20"/>
+        <w:szCs w:val="20"/>
+      </w:rPr>
     </w:lvl>
     <w:lvl w:ilvl="6" w:tplc="0409000F" w:tentative="1">
       <w:start w:val="1"/>
@@ -23905,6 +24572,11 @@
       <w:pPr>
         <w:ind w:left="5388" w:hanging="360"/>
       </w:pPr>
+      <w:rPr>
+        <w:rFonts w:ascii="Times New Roman" w:hAnsi="Times New Roman"/>
+        <w:sz w:val="20"/>
+        <w:szCs w:val="20"/>
+      </w:rPr>
     </w:lvl>
     <w:lvl w:ilvl="7" w:tplc="04090019" w:tentative="1">
       <w:start w:val="1"/>
@@ -23914,6 +24586,11 @@
       <w:pPr>
         <w:ind w:left="6108" w:hanging="360"/>
       </w:pPr>
+      <w:rPr>
+        <w:rFonts w:ascii="Times New Roman" w:hAnsi="Times New Roman"/>
+        <w:sz w:val="20"/>
+        <w:szCs w:val="20"/>
+      </w:rPr>
     </w:lvl>
     <w:lvl w:ilvl="8" w:tplc="0409001B" w:tentative="1">
       <w:start w:val="1"/>
@@ -23923,6 +24600,11 @@
       <w:pPr>
         <w:ind w:left="6828" w:hanging="180"/>
       </w:pPr>
+      <w:rPr>
+        <w:rFonts w:ascii="Times New Roman" w:hAnsi="Times New Roman"/>
+        <w:sz w:val="20"/>
+        <w:szCs w:val="20"/>
+      </w:rPr>
     </w:lvl>
   </w:abstractNum>
   <w:abstractNum w:abstractNumId="15">
@@ -23938,6 +24620,9 @@
         <w:ind w:left="720" w:hanging="360"/>
       </w:pPr>
       <w:rPr>
+        <w:rFonts w:ascii="Times New Roman" w:hAnsi="Times New Roman"/>
+        <w:sz w:val="20"/>
+        <w:szCs w:val="20"/>
         <w:rFonts w:hint="default"/>
       </w:rPr>
     </w:lvl>
@@ -23949,6 +24634,11 @@
       <w:pPr>
         <w:ind w:left="1440" w:hanging="360"/>
       </w:pPr>
+      <w:rPr>
+        <w:rFonts w:ascii="Times New Roman" w:hAnsi="Times New Roman"/>
+        <w:sz w:val="20"/>
+        <w:szCs w:val="20"/>
+      </w:rPr>
     </w:lvl>
     <w:lvl w:ilvl="2" w:tplc="0409001B" w:tentative="1">
       <w:start w:val="1"/>
@@ -23958,6 +24648,11 @@
       <w:pPr>
         <w:ind w:left="2160" w:hanging="180"/>
       </w:pPr>
+      <w:rPr>
+        <w:rFonts w:ascii="Times New Roman" w:hAnsi="Times New Roman"/>
+        <w:sz w:val="20"/>
+        <w:szCs w:val="20"/>
+      </w:rPr>
     </w:lvl>
     <w:lvl w:ilvl="3" w:tplc="0409000F" w:tentative="1">
       <w:start w:val="1"/>
@@ -23967,6 +24662,11 @@
       <w:pPr>
         <w:ind w:left="2880" w:hanging="360"/>
       </w:pPr>
+      <w:rPr>
+        <w:rFonts w:ascii="Times New Roman" w:hAnsi="Times New Roman"/>
+        <w:sz w:val="20"/>
+        <w:szCs w:val="20"/>
+      </w:rPr>
     </w:lvl>
     <w:lvl w:ilvl="4" w:tplc="04090019" w:tentative="1">
       <w:start w:val="1"/>
@@ -23976,6 +24676,11 @@
       <w:pPr>
         <w:ind w:left="3600" w:hanging="360"/>
       </w:pPr>
+      <w:rPr>
+        <w:rFonts w:ascii="Times New Roman" w:hAnsi="Times New Roman"/>
+        <w:sz w:val="20"/>
+        <w:szCs w:val="20"/>
+      </w:rPr>
     </w:lvl>
     <w:lvl w:ilvl="5" w:tplc="0409001B" w:tentative="1">
       <w:start w:val="1"/>
@@ -23985,6 +24690,11 @@
       <w:pPr>
         <w:ind w:left="4320" w:hanging="180"/>
       </w:pPr>
+      <w:rPr>
+        <w:rFonts w:ascii="Times New Roman" w:hAnsi="Times New Roman"/>
+        <w:sz w:val="20"/>
+        <w:szCs w:val="20"/>
+      </w:rPr>
     </w:lvl>
     <w:lvl w:ilvl="6" w:tplc="0409000F" w:tentative="1">
       <w:start w:val="1"/>
@@ -23994,6 +24704,11 @@
       <w:pPr>
         <w:ind w:left="5040" w:hanging="360"/>
       </w:pPr>
+      <w:rPr>
+        <w:rFonts w:ascii="Times New Roman" w:hAnsi="Times New Roman"/>
+        <w:sz w:val="20"/>
+        <w:szCs w:val="20"/>
+      </w:rPr>
     </w:lvl>
     <w:lvl w:ilvl="7" w:tplc="04090019" w:tentative="1">
       <w:start w:val="1"/>
@@ -24003,6 +24718,11 @@
       <w:pPr>
         <w:ind w:left="5760" w:hanging="360"/>
       </w:pPr>
+      <w:rPr>
+        <w:rFonts w:ascii="Times New Roman" w:hAnsi="Times New Roman"/>
+        <w:sz w:val="20"/>
+        <w:szCs w:val="20"/>
+      </w:rPr>
     </w:lvl>
     <w:lvl w:ilvl="8" w:tplc="0409001B" w:tentative="1">
       <w:start w:val="1"/>
@@ -24012,6 +24732,11 @@
       <w:pPr>
         <w:ind w:left="6480" w:hanging="180"/>
       </w:pPr>
+      <w:rPr>
+        <w:rFonts w:ascii="Times New Roman" w:hAnsi="Times New Roman"/>
+        <w:sz w:val="20"/>
+        <w:szCs w:val="20"/>
+      </w:rPr>
     </w:lvl>
   </w:abstractNum>
   <w:abstractNum w:abstractNumId="16">
@@ -24026,6 +24751,11 @@
       <w:pPr>
         <w:ind w:left="720" w:hanging="360"/>
       </w:pPr>
+      <w:rPr>
+        <w:rFonts w:ascii="Times New Roman" w:hAnsi="Times New Roman"/>
+        <w:sz w:val="20"/>
+        <w:szCs w:val="20"/>
+      </w:rPr>
     </w:lvl>
     <w:lvl w:ilvl="1" w:tplc="04090019" w:tentative="1">
       <w:start w:val="1"/>
@@ -24035,6 +24765,11 @@
       <w:pPr>
         <w:ind w:left="1440" w:hanging="360"/>
       </w:pPr>
+      <w:rPr>
+        <w:rFonts w:ascii="Times New Roman" w:hAnsi="Times New Roman"/>
+        <w:sz w:val="20"/>
+        <w:szCs w:val="20"/>
+      </w:rPr>
     </w:lvl>
     <w:lvl w:ilvl="2" w:tplc="0409001B" w:tentative="1">
       <w:start w:val="1"/>
@@ -24044,6 +24779,11 @@
       <w:pPr>
         <w:ind w:left="2160" w:hanging="180"/>
       </w:pPr>
+      <w:rPr>
+        <w:rFonts w:ascii="Times New Roman" w:hAnsi="Times New Roman"/>
+        <w:sz w:val="20"/>
+        <w:szCs w:val="20"/>
+      </w:rPr>
     </w:lvl>
     <w:lvl w:ilvl="3" w:tplc="0409000F" w:tentative="1">
       <w:start w:val="1"/>
@@ -24053,6 +24793,11 @@
       <w:pPr>
         <w:ind w:left="2880" w:hanging="360"/>
       </w:pPr>
+      <w:rPr>
+        <w:rFonts w:ascii="Times New Roman" w:hAnsi="Times New Roman"/>
+        <w:sz w:val="20"/>
+        <w:szCs w:val="20"/>
+      </w:rPr>
     </w:lvl>
     <w:lvl w:ilvl="4" w:tplc="04090019" w:tentative="1">
       <w:start w:val="1"/>
@@ -24062,6 +24807,11 @@
       <w:pPr>
         <w:ind w:left="3600" w:hanging="360"/>
       </w:pPr>
+      <w:rPr>
+        <w:rFonts w:ascii="Times New Roman" w:hAnsi="Times New Roman"/>
+        <w:sz w:val="20"/>
+        <w:szCs w:val="20"/>
+      </w:rPr>
     </w:lvl>
     <w:lvl w:ilvl="5" w:tplc="0409001B" w:tentative="1">
       <w:start w:val="1"/>
@@ -24071,6 +24821,11 @@
       <w:pPr>
         <w:ind w:left="4320" w:hanging="180"/>
       </w:pPr>
+      <w:rPr>
+        <w:rFonts w:ascii="Times New Roman" w:hAnsi="Times New Roman"/>
+        <w:sz w:val="20"/>
+        <w:szCs w:val="20"/>
+      </w:rPr>
     </w:lvl>
     <w:lvl w:ilvl="6" w:tplc="0409000F" w:tentative="1">
       <w:start w:val="1"/>
@@ -24080,6 +24835,11 @@
       <w:pPr>
         <w:ind w:left="5040" w:hanging="360"/>
       </w:pPr>
+      <w:rPr>
+        <w:rFonts w:ascii="Times New Roman" w:hAnsi="Times New Roman"/>
+        <w:sz w:val="20"/>
+        <w:szCs w:val="20"/>
+      </w:rPr>
     </w:lvl>
     <w:lvl w:ilvl="7" w:tplc="04090019" w:tentative="1">
       <w:start w:val="1"/>
@@ -24089,6 +24849,11 @@
       <w:pPr>
         <w:ind w:left="5760" w:hanging="360"/>
       </w:pPr>
+      <w:rPr>
+        <w:rFonts w:ascii="Times New Roman" w:hAnsi="Times New Roman"/>
+        <w:sz w:val="20"/>
+        <w:szCs w:val="20"/>
+      </w:rPr>
     </w:lvl>
     <w:lvl w:ilvl="8" w:tplc="0409001B" w:tentative="1">
       <w:start w:val="1"/>
@@ -24098,6 +24863,11 @@
       <w:pPr>
         <w:ind w:left="6480" w:hanging="180"/>
       </w:pPr>
+      <w:rPr>
+        <w:rFonts w:ascii="Times New Roman" w:hAnsi="Times New Roman"/>
+        <w:sz w:val="20"/>
+        <w:szCs w:val="20"/>
+      </w:rPr>
     </w:lvl>
   </w:abstractNum>
   <w:num w:numId="1">

</xml_diff>